<commit_message>
Update header and footer according to DAkkS finding
</commit_message>
<xml_diff>
--- a/HaemophilusWeb/ReportTemplates/BLNAR v10.docx
+++ b/HaemophilusWeb/ReportTemplates/BLNAR v10.docx
@@ -21,7 +21,21 @@
         <w:rPr>
           <w:rFonts w:ascii="Arial" w:hAnsi="Arial" w:cs="Arial"/>
         </w:rPr>
-        <w:t>{SenderName}</w:t>
+        <w:t>{</w:t>
+      </w:r>
+      <w:proofErr w:type="spellStart"/>
+      <w:r>
+        <w:rPr>
+          <w:rFonts w:ascii="Arial" w:hAnsi="Arial" w:cs="Arial"/>
+        </w:rPr>
+        <w:t>SenderName</w:t>
+      </w:r>
+      <w:proofErr w:type="spellEnd"/>
+      <w:r>
+        <w:rPr>
+          <w:rFonts w:ascii="Arial" w:hAnsi="Arial" w:cs="Arial"/>
+        </w:rPr>
+        <w:t>}</w:t>
       </w:r>
     </w:p>
     <w:p>
@@ -34,7 +48,21 @@
         <w:rPr>
           <w:rFonts w:ascii="Arial" w:hAnsi="Arial" w:cs="Arial"/>
         </w:rPr>
-        <w:t>{SenderDepartment}</w:t>
+        <w:t>{</w:t>
+      </w:r>
+      <w:proofErr w:type="spellStart"/>
+      <w:r>
+        <w:rPr>
+          <w:rFonts w:ascii="Arial" w:hAnsi="Arial" w:cs="Arial"/>
+        </w:rPr>
+        <w:t>SenderDepartment</w:t>
+      </w:r>
+      <w:proofErr w:type="spellEnd"/>
+      <w:r>
+        <w:rPr>
+          <w:rFonts w:ascii="Arial" w:hAnsi="Arial" w:cs="Arial"/>
+        </w:rPr>
+        <w:t>}</w:t>
       </w:r>
     </w:p>
     <w:p>
@@ -47,7 +75,21 @@
         <w:rPr>
           <w:rFonts w:ascii="Arial" w:hAnsi="Arial" w:cs="Arial"/>
         </w:rPr>
-        <w:t>{SenderStreet}</w:t>
+        <w:t>{</w:t>
+      </w:r>
+      <w:proofErr w:type="spellStart"/>
+      <w:r>
+        <w:rPr>
+          <w:rFonts w:ascii="Arial" w:hAnsi="Arial" w:cs="Arial"/>
+        </w:rPr>
+        <w:t>SenderStreet</w:t>
+      </w:r>
+      <w:proofErr w:type="spellEnd"/>
+      <w:r>
+        <w:rPr>
+          <w:rFonts w:ascii="Arial" w:hAnsi="Arial" w:cs="Arial"/>
+        </w:rPr>
+        <w:t>}</w:t>
       </w:r>
     </w:p>
     <w:p>
@@ -62,7 +104,23 @@
           <w:rFonts w:ascii="Arial" w:hAnsi="Arial" w:cs="Arial"/>
           <w:bCs/>
         </w:rPr>
-        <w:t>{SenderCity}</w:t>
+        <w:t>{</w:t>
+      </w:r>
+      <w:proofErr w:type="spellStart"/>
+      <w:r>
+        <w:rPr>
+          <w:rFonts w:ascii="Arial" w:hAnsi="Arial" w:cs="Arial"/>
+          <w:bCs/>
+        </w:rPr>
+        <w:t>SenderCity</w:t>
+      </w:r>
+      <w:proofErr w:type="spellEnd"/>
+      <w:r>
+        <w:rPr>
+          <w:rFonts w:ascii="Arial" w:hAnsi="Arial" w:cs="Arial"/>
+          <w:bCs/>
+        </w:rPr>
+        <w:t>}</w:t>
       </w:r>
     </w:p>
     <w:p>
@@ -166,6 +224,7 @@
                     </w:rPr>
                     <w:t>{#</w:t>
                   </w:r>
+                  <w:proofErr w:type="gramStart"/>
                   <w:r>
                     <w:rPr>
                       <w:rFonts w:ascii="Arial" w:hAnsi="Arial" w:cs="Arial"/>
@@ -189,7 +248,31 @@
                       <w:sz w:val="16"/>
                       <w:szCs w:val="16"/>
                     </w:rPr>
-                    <w:t>{%DemisIdQrImage}</w:t>
+                    <w:t>{</w:t>
+                  </w:r>
+                  <w:proofErr w:type="gramEnd"/>
+                  <w:r>
+                    <w:rPr>
+                      <w:sz w:val="16"/>
+                      <w:szCs w:val="16"/>
+                    </w:rPr>
+                    <w:t>%</w:t>
+                  </w:r>
+                  <w:proofErr w:type="spellStart"/>
+                  <w:r>
+                    <w:rPr>
+                      <w:sz w:val="16"/>
+                      <w:szCs w:val="16"/>
+                    </w:rPr>
+                    <w:t>DemisIdQrImage</w:t>
+                  </w:r>
+                  <w:proofErr w:type="spellEnd"/>
+                  <w:r>
+                    <w:rPr>
+                      <w:sz w:val="16"/>
+                      <w:szCs w:val="16"/>
+                    </w:rPr>
+                    <w:t>}</w:t>
                   </w:r>
                 </w:p>
                 <w:p>
@@ -225,6 +308,7 @@
                     </w:rPr>
                     <w:t>/</w:t>
                   </w:r>
+                  <w:proofErr w:type="spellStart"/>
                   <w:r>
                     <w:rPr>
                       <w:rFonts w:ascii="Arial" w:hAnsi="Arial" w:cs="Arial"/>
@@ -234,6 +318,7 @@
                     </w:rPr>
                     <w:t>DemisIdQrImage</w:t>
                   </w:r>
+                  <w:proofErr w:type="spellEnd"/>
                   <w:r>
                     <w:rPr>
                       <w:rFonts w:ascii="Arial" w:hAnsi="Arial" w:cs="Arial"/>
@@ -280,7 +365,31 @@
           <w:sz w:val="28"/>
           <w:szCs w:val="28"/>
         </w:rPr>
-        <w:t>{LaboratoryNumber}</w:t>
+        <w:t>{</w:t>
+      </w:r>
+      <w:proofErr w:type="spellStart"/>
+      <w:r>
+        <w:rPr>
+          <w:rFonts w:ascii="Arial" w:hAnsi="Arial" w:cs="Arial"/>
+          <w:b/>
+          <w:bCs/>
+          <w:color w:val="000000"/>
+          <w:sz w:val="28"/>
+          <w:szCs w:val="28"/>
+        </w:rPr>
+        <w:t>LaboratoryNumber</w:t>
+      </w:r>
+      <w:proofErr w:type="spellEnd"/>
+      <w:r>
+        <w:rPr>
+          <w:rFonts w:ascii="Arial" w:hAnsi="Arial" w:cs="Arial"/>
+          <w:b/>
+          <w:bCs/>
+          <w:color w:val="000000"/>
+          <w:sz w:val="28"/>
+          <w:szCs w:val="28"/>
+        </w:rPr>
+        <w:t>}</w:t>
       </w:r>
       <w:r>
         <w:rPr>
@@ -379,6 +488,7 @@
               </w:rPr>
               <w:t xml:space="preserve">Labor-Nr. des </w:t>
             </w:r>
+            <w:proofErr w:type="spellStart"/>
             <w:r>
               <w:rPr>
                 <w:rFonts w:ascii="Arial" w:hAnsi="Arial" w:cs="Arial"/>
@@ -388,6 +498,7 @@
               </w:rPr>
               <w:t>NRZMHi</w:t>
             </w:r>
+            <w:proofErr w:type="spellEnd"/>
             <w:r>
               <w:rPr>
                 <w:rFonts w:ascii="Arial" w:hAnsi="Arial" w:cs="Arial"/>
@@ -437,7 +548,27 @@
                 <w:sz w:val="16"/>
                 <w:szCs w:val="16"/>
               </w:rPr>
-              <w:t>{LaboratoryNumber}</w:t>
+              <w:t>{</w:t>
+            </w:r>
+            <w:proofErr w:type="spellStart"/>
+            <w:r>
+              <w:rPr>
+                <w:rFonts w:ascii="Arial" w:hAnsi="Arial" w:cs="Arial"/>
+                <w:color w:val="000000"/>
+                <w:sz w:val="16"/>
+                <w:szCs w:val="16"/>
+              </w:rPr>
+              <w:t>LaboratoryNumber</w:t>
+            </w:r>
+            <w:proofErr w:type="spellEnd"/>
+            <w:r>
+              <w:rPr>
+                <w:rFonts w:ascii="Arial" w:hAnsi="Arial" w:cs="Arial"/>
+                <w:color w:val="000000"/>
+                <w:sz w:val="16"/>
+                <w:szCs w:val="16"/>
+              </w:rPr>
+              <w:t>}</w:t>
             </w:r>
           </w:p>
         </w:tc>
@@ -508,7 +639,27 @@
                 <w:sz w:val="16"/>
                 <w:szCs w:val="16"/>
               </w:rPr>
-              <w:t>{SamplingLocation}</w:t>
+              <w:t>{</w:t>
+            </w:r>
+            <w:proofErr w:type="spellStart"/>
+            <w:r>
+              <w:rPr>
+                <w:rFonts w:ascii="Arial" w:hAnsi="Arial" w:cs="Arial"/>
+                <w:color w:val="000000"/>
+                <w:sz w:val="16"/>
+                <w:szCs w:val="16"/>
+              </w:rPr>
+              <w:t>SamplingLocation</w:t>
+            </w:r>
+            <w:proofErr w:type="spellEnd"/>
+            <w:r>
+              <w:rPr>
+                <w:rFonts w:ascii="Arial" w:hAnsi="Arial" w:cs="Arial"/>
+                <w:color w:val="000000"/>
+                <w:sz w:val="16"/>
+                <w:szCs w:val="16"/>
+              </w:rPr>
+              <w:t>}</w:t>
             </w:r>
           </w:p>
         </w:tc>
@@ -579,7 +730,27 @@
                 <w:sz w:val="16"/>
                 <w:szCs w:val="16"/>
               </w:rPr>
-              <w:t>{SamplingDate}</w:t>
+              <w:t>{</w:t>
+            </w:r>
+            <w:proofErr w:type="spellStart"/>
+            <w:r>
+              <w:rPr>
+                <w:rFonts w:ascii="Arial" w:hAnsi="Arial" w:cs="Arial"/>
+                <w:color w:val="000000"/>
+                <w:sz w:val="16"/>
+                <w:szCs w:val="16"/>
+              </w:rPr>
+              <w:t>SamplingDate</w:t>
+            </w:r>
+            <w:proofErr w:type="spellEnd"/>
+            <w:r>
+              <w:rPr>
+                <w:rFonts w:ascii="Arial" w:hAnsi="Arial" w:cs="Arial"/>
+                <w:color w:val="000000"/>
+                <w:sz w:val="16"/>
+                <w:szCs w:val="16"/>
+              </w:rPr>
+              <w:t>}</w:t>
             </w:r>
           </w:p>
         </w:tc>
@@ -650,7 +821,27 @@
                 <w:sz w:val="16"/>
                 <w:szCs w:val="16"/>
               </w:rPr>
-              <w:t>{ReceivingDate}</w:t>
+              <w:t>{</w:t>
+            </w:r>
+            <w:proofErr w:type="spellStart"/>
+            <w:r>
+              <w:rPr>
+                <w:rFonts w:ascii="Arial" w:hAnsi="Arial" w:cs="Arial"/>
+                <w:color w:val="000000"/>
+                <w:sz w:val="16"/>
+                <w:szCs w:val="16"/>
+              </w:rPr>
+              <w:t>ReceivingDate</w:t>
+            </w:r>
+            <w:proofErr w:type="spellEnd"/>
+            <w:r>
+              <w:rPr>
+                <w:rFonts w:ascii="Arial" w:hAnsi="Arial" w:cs="Arial"/>
+                <w:color w:val="000000"/>
+                <w:sz w:val="16"/>
+                <w:szCs w:val="16"/>
+              </w:rPr>
+              <w:t>}</w:t>
             </w:r>
           </w:p>
         </w:tc>
@@ -810,7 +1001,27 @@
                 <w:sz w:val="16"/>
                 <w:szCs w:val="16"/>
               </w:rPr>
-              <w:t>{PatientBirthDate}</w:t>
+              <w:t>{</w:t>
+            </w:r>
+            <w:proofErr w:type="spellStart"/>
+            <w:r>
+              <w:rPr>
+                <w:rFonts w:ascii="Arial" w:hAnsi="Arial" w:cs="Arial"/>
+                <w:color w:val="000000"/>
+                <w:sz w:val="16"/>
+                <w:szCs w:val="16"/>
+              </w:rPr>
+              <w:t>PatientBirthDate</w:t>
+            </w:r>
+            <w:proofErr w:type="spellEnd"/>
+            <w:r>
+              <w:rPr>
+                <w:rFonts w:ascii="Arial" w:hAnsi="Arial" w:cs="Arial"/>
+                <w:color w:val="000000"/>
+                <w:sz w:val="16"/>
+                <w:szCs w:val="16"/>
+              </w:rPr>
+              <w:t>}</w:t>
             </w:r>
           </w:p>
         </w:tc>
@@ -881,7 +1092,27 @@
                 <w:sz w:val="16"/>
                 <w:szCs w:val="16"/>
               </w:rPr>
-              <w:t>{SenderLaboratoryNumber}</w:t>
+              <w:t>{</w:t>
+            </w:r>
+            <w:proofErr w:type="spellStart"/>
+            <w:r>
+              <w:rPr>
+                <w:rFonts w:ascii="Arial" w:hAnsi="Arial" w:cs="Arial"/>
+                <w:color w:val="000000"/>
+                <w:sz w:val="16"/>
+                <w:szCs w:val="16"/>
+              </w:rPr>
+              <w:t>SenderLaboratoryNumber</w:t>
+            </w:r>
+            <w:proofErr w:type="spellEnd"/>
+            <w:r>
+              <w:rPr>
+                <w:rFonts w:ascii="Arial" w:hAnsi="Arial" w:cs="Arial"/>
+                <w:color w:val="000000"/>
+                <w:sz w:val="16"/>
+                <w:szCs w:val="16"/>
+              </w:rPr>
+              <w:t>}</w:t>
             </w:r>
           </w:p>
         </w:tc>
@@ -1069,7 +1300,33 @@
                 <w:sz w:val="22"/>
                 <w:szCs w:val="22"/>
               </w:rPr>
-              <w:t>{EvaluationString}</w:t>
+              <w:t>{</w:t>
+            </w:r>
+            <w:proofErr w:type="spellStart"/>
+            <w:r>
+              <w:rPr>
+                <w:rFonts w:ascii="Arial" w:hAnsi="Arial" w:cs="Arial"/>
+                <w:b/>
+                <w:bCs/>
+                <w:i/>
+                <w:iCs/>
+                <w:sz w:val="22"/>
+                <w:szCs w:val="22"/>
+              </w:rPr>
+              <w:t>EvaluationString</w:t>
+            </w:r>
+            <w:proofErr w:type="spellEnd"/>
+            <w:r>
+              <w:rPr>
+                <w:rFonts w:ascii="Arial" w:hAnsi="Arial" w:cs="Arial"/>
+                <w:b/>
+                <w:bCs/>
+                <w:i/>
+                <w:iCs/>
+                <w:sz w:val="22"/>
+                <w:szCs w:val="22"/>
+              </w:rPr>
+              <w:t>}</w:t>
             </w:r>
           </w:p>
         </w:tc>
@@ -1186,7 +1443,31 @@
                 <w:sz w:val="22"/>
                 <w:szCs w:val="22"/>
               </w:rPr>
-              <w:t>{AgglutinationString}</w:t>
+              <w:t>{</w:t>
+            </w:r>
+            <w:proofErr w:type="spellStart"/>
+            <w:r>
+              <w:rPr>
+                <w:rFonts w:ascii="Arial" w:hAnsi="Arial" w:cs="Arial"/>
+                <w:b/>
+                <w:bCs/>
+                <w:color w:val="000000"/>
+                <w:sz w:val="22"/>
+                <w:szCs w:val="22"/>
+              </w:rPr>
+              <w:t>AgglutinationString</w:t>
+            </w:r>
+            <w:proofErr w:type="spellEnd"/>
+            <w:r>
+              <w:rPr>
+                <w:rFonts w:ascii="Arial" w:hAnsi="Arial" w:cs="Arial"/>
+                <w:b/>
+                <w:bCs/>
+                <w:color w:val="000000"/>
+                <w:sz w:val="22"/>
+                <w:szCs w:val="22"/>
+              </w:rPr>
+              <w:t>}</w:t>
             </w:r>
           </w:p>
         </w:tc>
@@ -1290,7 +1571,20 @@
                       <w:sz w:val="12"/>
                       <w:szCs w:val="22"/>
                     </w:rPr>
-                    <w:t>{#Typings}</w:t>
+                    <w:t>{#</w:t>
+                  </w:r>
+                  <w:proofErr w:type="gramStart"/>
+                  <w:r>
+                    <w:rPr>
+                      <w:rFonts w:ascii="Arial" w:hAnsi="Arial" w:cs="Arial"/>
+                      <w:b/>
+                      <w:bCs/>
+                      <w:i/>
+                      <w:iCs/>
+                      <w:sz w:val="12"/>
+                      <w:szCs w:val="22"/>
+                    </w:rPr>
+                    <w:t>Typings}</w:t>
                   </w:r>
                   <w:r>
                     <w:rPr>
@@ -1302,7 +1596,20 @@
                       <w:sz w:val="22"/>
                       <w:szCs w:val="22"/>
                     </w:rPr>
-                    <w:t>{Attribute}</w:t>
+                    <w:t>{</w:t>
+                  </w:r>
+                  <w:proofErr w:type="gramEnd"/>
+                  <w:r>
+                    <w:rPr>
+                      <w:rFonts w:ascii="Arial" w:hAnsi="Arial" w:cs="Arial"/>
+                      <w:b/>
+                      <w:bCs/>
+                      <w:i/>
+                      <w:iCs/>
+                      <w:sz w:val="22"/>
+                      <w:szCs w:val="22"/>
+                    </w:rPr>
+                    <w:t>Attribute}</w:t>
                   </w:r>
                   <w:r>
                     <w:rPr>
@@ -1358,6 +1665,7 @@
                     </w:rPr>
                     <w:t>{/</w:t>
                   </w:r>
+                  <w:proofErr w:type="spellStart"/>
                   <w:r>
                     <w:rPr>
                       <w:rFonts w:ascii="Arial" w:hAnsi="Arial" w:cs="Arial"/>
@@ -1370,6 +1678,7 @@
                     </w:rPr>
                     <w:t>Typings</w:t>
                   </w:r>
+                  <w:proofErr w:type="spellEnd"/>
                   <w:r>
                     <w:rPr>
                       <w:rFonts w:ascii="Arial" w:hAnsi="Arial" w:cs="Arial"/>
@@ -1462,7 +1771,25 @@
           <w:bCs/>
           <w:color w:val="000000"/>
         </w:rPr>
-        <w:t>{InterpretationDisclaimer}</w:t>
+        <w:t>{</w:t>
+      </w:r>
+      <w:proofErr w:type="spellStart"/>
+      <w:r>
+        <w:rPr>
+          <w:rFonts w:ascii="Arial" w:hAnsi="Arial" w:cs="Arial"/>
+          <w:bCs/>
+          <w:color w:val="000000"/>
+        </w:rPr>
+        <w:t>InterpretationDisclaimer</w:t>
+      </w:r>
+      <w:proofErr w:type="spellEnd"/>
+      <w:r>
+        <w:rPr>
+          <w:rFonts w:ascii="Arial" w:hAnsi="Arial" w:cs="Arial"/>
+          <w:bCs/>
+          <w:color w:val="000000"/>
+        </w:rPr>
+        <w:t>}</w:t>
       </w:r>
     </w:p>
     <w:p>
@@ -1637,8 +1964,21 @@
                 <w:sz w:val="22"/>
                 <w:szCs w:val="22"/>
               </w:rPr>
-              <w:t>-Laktamase</w:t>
-            </w:r>
+              <w:t>-</w:t>
+            </w:r>
+            <w:proofErr w:type="spellStart"/>
+            <w:r>
+              <w:rPr>
+                <w:rFonts w:ascii="Arial" w:hAnsi="Arial" w:cs="Arial"/>
+                <w:b/>
+                <w:bCs/>
+                <w:iCs/>
+                <w:sz w:val="22"/>
+                <w:szCs w:val="22"/>
+              </w:rPr>
+              <w:t>Laktamase</w:t>
+            </w:r>
+            <w:proofErr w:type="spellEnd"/>
           </w:p>
         </w:tc>
         <w:tc>
@@ -1669,6 +2009,7 @@
               </w:rPr>
               <w:t>{</w:t>
             </w:r>
+            <w:proofErr w:type="spellStart"/>
             <w:r>
               <w:rPr>
                 <w:rFonts w:ascii="Arial" w:hAnsi="Arial" w:cs="Arial"/>
@@ -1680,6 +2021,7 @@
               </w:rPr>
               <w:t>BetalactamaseString</w:t>
             </w:r>
+            <w:proofErr w:type="spellEnd"/>
             <w:r>
               <w:rPr>
                 <w:rFonts w:ascii="Arial" w:hAnsi="Arial" w:cs="Arial"/>
@@ -1905,8 +2247,9 @@
                 <w:sz w:val="22"/>
                 <w:szCs w:val="22"/>
               </w:rPr>
-              <w:t>{#ETests}{Antibiotic}</w:t>
-            </w:r>
+              <w:t>{#</w:t>
+            </w:r>
+            <w:proofErr w:type="gramStart"/>
             <w:r>
               <w:rPr>
                 <w:rFonts w:ascii="Arial" w:hAnsi="Arial" w:cs="Arial"/>
@@ -1916,8 +2259,44 @@
                 <w:sz w:val="22"/>
                 <w:szCs w:val="22"/>
               </w:rPr>
-              <w:t xml:space="preserve"> Etest</w:t>
-            </w:r>
+              <w:t>ETests}{</w:t>
+            </w:r>
+            <w:proofErr w:type="gramEnd"/>
+            <w:r>
+              <w:rPr>
+                <w:rFonts w:ascii="Arial" w:hAnsi="Arial" w:cs="Arial"/>
+                <w:b/>
+                <w:bCs/>
+                <w:iCs/>
+                <w:sz w:val="22"/>
+                <w:szCs w:val="22"/>
+              </w:rPr>
+              <w:t>Antibiotic}</w:t>
+            </w:r>
+            <w:r>
+              <w:rPr>
+                <w:rFonts w:ascii="Arial" w:hAnsi="Arial" w:cs="Arial"/>
+                <w:b/>
+                <w:bCs/>
+                <w:iCs/>
+                <w:sz w:val="22"/>
+                <w:szCs w:val="22"/>
+              </w:rPr>
+              <w:t xml:space="preserve"> </w:t>
+            </w:r>
+            <w:proofErr w:type="spellStart"/>
+            <w:r>
+              <w:rPr>
+                <w:rFonts w:ascii="Arial" w:hAnsi="Arial" w:cs="Arial"/>
+                <w:b/>
+                <w:bCs/>
+                <w:iCs/>
+                <w:sz w:val="22"/>
+                <w:szCs w:val="22"/>
+              </w:rPr>
+              <w:t>Etest</w:t>
+            </w:r>
+            <w:proofErr w:type="spellEnd"/>
           </w:p>
         </w:tc>
         <w:tc>
@@ -1966,7 +2345,31 @@
                 <w:sz w:val="22"/>
                 <w:szCs w:val="22"/>
               </w:rPr>
-              <w:t>{Result}</w:t>
+              <w:t>{</w:t>
+            </w:r>
+            <w:proofErr w:type="spellStart"/>
+            <w:r>
+              <w:rPr>
+                <w:rFonts w:ascii="Arial" w:hAnsi="Arial" w:cs="Arial"/>
+                <w:b/>
+                <w:bCs/>
+                <w:color w:val="000000"/>
+                <w:sz w:val="22"/>
+                <w:szCs w:val="22"/>
+              </w:rPr>
+              <w:t>Result</w:t>
+            </w:r>
+            <w:proofErr w:type="spellEnd"/>
+            <w:r>
+              <w:rPr>
+                <w:rFonts w:ascii="Arial" w:hAnsi="Arial" w:cs="Arial"/>
+                <w:b/>
+                <w:bCs/>
+                <w:color w:val="000000"/>
+                <w:sz w:val="22"/>
+                <w:szCs w:val="22"/>
+              </w:rPr>
+              <w:t>}</w:t>
             </w:r>
           </w:p>
         </w:tc>
@@ -1995,7 +2398,31 @@
                 <w:sz w:val="22"/>
                 <w:szCs w:val="22"/>
               </w:rPr>
-              <w:t>≤{MicBreakpointSusceptible}</w:t>
+              <w:t>≤{</w:t>
+            </w:r>
+            <w:proofErr w:type="spellStart"/>
+            <w:r>
+              <w:rPr>
+                <w:rFonts w:ascii="Arial" w:hAnsi="Arial" w:cs="Arial"/>
+                <w:b/>
+                <w:bCs/>
+                <w:color w:val="000000"/>
+                <w:sz w:val="22"/>
+                <w:szCs w:val="22"/>
+              </w:rPr>
+              <w:t>MicBreakpointSusceptible</w:t>
+            </w:r>
+            <w:proofErr w:type="spellEnd"/>
+            <w:r>
+              <w:rPr>
+                <w:rFonts w:ascii="Arial" w:hAnsi="Arial" w:cs="Arial"/>
+                <w:b/>
+                <w:bCs/>
+                <w:color w:val="000000"/>
+                <w:sz w:val="22"/>
+                <w:szCs w:val="22"/>
+              </w:rPr>
+              <w:t>}</w:t>
             </w:r>
             <w:r>
               <w:rPr>
@@ -2038,7 +2465,33 @@
                 <w:szCs w:val="22"/>
                 <w:lang w:val="en-US"/>
               </w:rPr>
-              <w:t>&gt;{MicBreakpointResistent} µg/ml</w:t>
+              <w:t>&gt;{</w:t>
+            </w:r>
+            <w:proofErr w:type="spellStart"/>
+            <w:r>
+              <w:rPr>
+                <w:rFonts w:ascii="Arial" w:hAnsi="Arial" w:cs="Arial"/>
+                <w:b/>
+                <w:bCs/>
+                <w:color w:val="000000"/>
+                <w:sz w:val="22"/>
+                <w:szCs w:val="22"/>
+                <w:lang w:val="en-US"/>
+              </w:rPr>
+              <w:t>MicBreakpointResistent</w:t>
+            </w:r>
+            <w:proofErr w:type="spellEnd"/>
+            <w:r>
+              <w:rPr>
+                <w:rFonts w:ascii="Arial" w:hAnsi="Arial" w:cs="Arial"/>
+                <w:b/>
+                <w:bCs/>
+                <w:color w:val="000000"/>
+                <w:sz w:val="22"/>
+                <w:szCs w:val="22"/>
+                <w:lang w:val="en-US"/>
+              </w:rPr>
+              <w:t>} µg/ml</w:t>
             </w:r>
           </w:p>
         </w:tc>
@@ -2058,6 +2511,7 @@
                 <w:lang w:val="en-US"/>
               </w:rPr>
             </w:pPr>
+            <w:proofErr w:type="gramStart"/>
             <w:r>
               <w:rPr>
                 <w:rFonts w:ascii="Arial" w:hAnsi="Arial" w:cs="Arial"/>
@@ -2070,6 +2524,7 @@
               </w:rPr>
               <w:t>{</w:t>
             </w:r>
+            <w:proofErr w:type="spellStart"/>
             <w:r>
               <w:rPr>
                 <w:rFonts w:ascii="Arial" w:hAnsi="Arial" w:cs="Arial"/>
@@ -2082,6 +2537,7 @@
               </w:rPr>
               <w:t>ValidFromYear</w:t>
             </w:r>
+            <w:proofErr w:type="spellEnd"/>
             <w:r>
               <w:rPr>
                 <w:rFonts w:ascii="Arial" w:hAnsi="Arial" w:cs="Arial"/>
@@ -2104,7 +2560,34 @@
                 <w:szCs w:val="22"/>
                 <w:lang w:val="en-US"/>
               </w:rPr>
-              <w:t>{/ETests}</w:t>
+              <w:t>{/</w:t>
+            </w:r>
+            <w:proofErr w:type="spellStart"/>
+            <w:proofErr w:type="gramEnd"/>
+            <w:r>
+              <w:rPr>
+                <w:rFonts w:ascii="Arial" w:hAnsi="Arial" w:cs="Arial"/>
+                <w:b/>
+                <w:bCs/>
+                <w:color w:val="000000"/>
+                <w:sz w:val="22"/>
+                <w:szCs w:val="22"/>
+                <w:lang w:val="en-US"/>
+              </w:rPr>
+              <w:t>ETests</w:t>
+            </w:r>
+            <w:proofErr w:type="spellEnd"/>
+            <w:r>
+              <w:rPr>
+                <w:rFonts w:ascii="Arial" w:hAnsi="Arial" w:cs="Arial"/>
+                <w:b/>
+                <w:bCs/>
+                <w:color w:val="000000"/>
+                <w:sz w:val="22"/>
+                <w:szCs w:val="22"/>
+                <w:lang w:val="en-US"/>
+              </w:rPr>
+              <w:t>}</w:t>
             </w:r>
           </w:p>
         </w:tc>
@@ -2177,7 +2660,24 @@
           <w:color w:val="000000"/>
         </w:rPr>
         <w:noBreakHyphen/>
-        <w:t xml:space="preserve">Laktamase negatives Ampicillin-resistentes (BLNAR) Isolat. BLNAR </w:t>
+      </w:r>
+      <w:proofErr w:type="spellStart"/>
+      <w:r>
+        <w:rPr>
+          <w:rFonts w:ascii="Arial" w:hAnsi="Arial" w:cs="Arial"/>
+          <w:bCs/>
+          <w:color w:val="000000"/>
+        </w:rPr>
+        <w:t>Laktamase</w:t>
+      </w:r>
+      <w:proofErr w:type="spellEnd"/>
+      <w:r>
+        <w:rPr>
+          <w:rFonts w:ascii="Arial" w:hAnsi="Arial" w:cs="Arial"/>
+          <w:bCs/>
+          <w:color w:val="000000"/>
+        </w:rPr>
+        <w:t xml:space="preserve"> negatives Ampicillin-resistentes (BLNAR) Isolat. BLNAR </w:t>
       </w:r>
       <w:r>
         <w:rPr>
@@ -2204,7 +2704,42 @@
           <w:color w:val="000000"/>
         </w:rPr>
         <w:noBreakHyphen/>
-        <w:t>Lactamase-unabhängigen Resistenzmechanismus auf, welcher durch Mutation des Zellwandproteins PBP3 hervorgerufen wird. Sie sind resistent gegen Ampicillin/Sulbactam sowie Amoxicillin/Clavulansäure und könnten eine verminderte Sensibilität gegen Cephalosporine aufweisen</w:t>
+      </w:r>
+      <w:proofErr w:type="spellStart"/>
+      <w:r>
+        <w:rPr>
+          <w:rFonts w:ascii="Arial" w:hAnsi="Arial" w:cs="Arial"/>
+          <w:bCs/>
+          <w:color w:val="000000"/>
+        </w:rPr>
+        <w:t>Lactamase</w:t>
+      </w:r>
+      <w:proofErr w:type="spellEnd"/>
+      <w:r>
+        <w:rPr>
+          <w:rFonts w:ascii="Arial" w:hAnsi="Arial" w:cs="Arial"/>
+          <w:bCs/>
+          <w:color w:val="000000"/>
+        </w:rPr>
+        <w:t>-unabhängigen Resistenzmechanismus auf, welcher durch Mutation des Zellwandproteins PBP3 hervorgerufen wird. Sie sind resistent gegen Ampicillin/</w:t>
+      </w:r>
+      <w:proofErr w:type="spellStart"/>
+      <w:r>
+        <w:rPr>
+          <w:rFonts w:ascii="Arial" w:hAnsi="Arial" w:cs="Arial"/>
+          <w:bCs/>
+          <w:color w:val="000000"/>
+        </w:rPr>
+        <w:t>Sulbactam</w:t>
+      </w:r>
+      <w:proofErr w:type="spellEnd"/>
+      <w:r>
+        <w:rPr>
+          <w:rFonts w:ascii="Arial" w:hAnsi="Arial" w:cs="Arial"/>
+          <w:bCs/>
+          <w:color w:val="000000"/>
+        </w:rPr>
+        <w:t xml:space="preserve"> sowie Amoxicillin/Clavulansäure und könnten eine verminderte Sensibilität gegen Cephalosporine aufweisen</w:t>
       </w:r>
       <w:r>
         <w:rPr>
@@ -2288,12 +2823,21 @@
           <w:lang w:val="en-US"/>
         </w:rPr>
       </w:pPr>
-      <w:r>
-        <w:rPr>
-          <w:rFonts w:ascii="Arial" w:hAnsi="Arial" w:cs="Arial"/>
-          <w:lang w:val="en-US"/>
-        </w:rPr>
-        <w:t>Literatur:</w:t>
+      <w:proofErr w:type="spellStart"/>
+      <w:r>
+        <w:rPr>
+          <w:rFonts w:ascii="Arial" w:hAnsi="Arial" w:cs="Arial"/>
+          <w:lang w:val="en-US"/>
+        </w:rPr>
+        <w:t>Literatur</w:t>
+      </w:r>
+      <w:proofErr w:type="spellEnd"/>
+      <w:r>
+        <w:rPr>
+          <w:rFonts w:ascii="Arial" w:hAnsi="Arial" w:cs="Arial"/>
+          <w:lang w:val="en-US"/>
+        </w:rPr>
+        <w:t>:</w:t>
       </w:r>
     </w:p>
     <w:p>
@@ -2308,19 +2852,39 @@
         <w:spacing w:before="93"/>
         <w:rPr>
           <w:rFonts w:ascii="Arial" w:hAnsi="Arial" w:cs="Arial"/>
-          <w:sz w:val="20"/>
-          <w:szCs w:val="20"/>
+          <w:sz w:val="18"/>
+          <w:szCs w:val="18"/>
           <w:lang w:val="en-US"/>
         </w:rPr>
       </w:pPr>
       <w:r>
         <w:rPr>
           <w:rFonts w:ascii="Arial" w:hAnsi="Arial" w:cs="Arial"/>
-          <w:sz w:val="20"/>
-          <w:szCs w:val="20"/>
+          <w:sz w:val="18"/>
+          <w:szCs w:val="18"/>
           <w:lang w:val="en-GB"/>
         </w:rPr>
-        <w:t>1. Tristram S, Jacobs MR, Appelbaum PC. Antimicrobial resistance in Haemophilus influenzae. Clin Microbiol Rev. 2007 Apr;20(2):368-89.</w:t>
+        <w:t xml:space="preserve">1. Tristram S, Jacobs MR, Appelbaum PC. Antimicrobial resistance in Haemophilus influenzae. Clin </w:t>
+      </w:r>
+      <w:proofErr w:type="spellStart"/>
+      <w:r>
+        <w:rPr>
+          <w:rFonts w:ascii="Arial" w:hAnsi="Arial" w:cs="Arial"/>
+          <w:sz w:val="18"/>
+          <w:szCs w:val="18"/>
+          <w:lang w:val="en-GB"/>
+        </w:rPr>
+        <w:t>Microbiol</w:t>
+      </w:r>
+      <w:proofErr w:type="spellEnd"/>
+      <w:r>
+        <w:rPr>
+          <w:rFonts w:ascii="Arial" w:hAnsi="Arial" w:cs="Arial"/>
+          <w:sz w:val="18"/>
+          <w:szCs w:val="18"/>
+          <w:lang w:val="en-GB"/>
+        </w:rPr>
+        <w:t xml:space="preserve"> Rev. 2007 Apr;20(2):368-89.</w:t>
       </w:r>
     </w:p>
     <w:p>
@@ -2335,36 +2899,127 @@
         <w:spacing w:before="93"/>
         <w:rPr>
           <w:rFonts w:ascii="Arial" w:hAnsi="Arial" w:cs="Arial"/>
-          <w:sz w:val="20"/>
-          <w:szCs w:val="20"/>
+          <w:sz w:val="18"/>
+          <w:szCs w:val="18"/>
           <w:lang w:val="en-US"/>
         </w:rPr>
       </w:pPr>
       <w:r>
         <w:rPr>
           <w:rFonts w:ascii="Arial" w:hAnsi="Arial" w:cs="Arial"/>
-          <w:sz w:val="20"/>
-          <w:szCs w:val="20"/>
+          <w:sz w:val="18"/>
+          <w:szCs w:val="18"/>
           <w:lang w:val="en-US"/>
         </w:rPr>
         <w:t>2.</w:t>
       </w:r>
       <w:r>
         <w:rPr>
-          <w:sz w:val="20"/>
-          <w:szCs w:val="20"/>
+          <w:sz w:val="18"/>
+          <w:szCs w:val="18"/>
           <w:lang w:val="en-US"/>
         </w:rPr>
         <w:t xml:space="preserve"> </w:t>
       </w:r>
-      <w:r>
-        <w:rPr>
-          <w:rFonts w:ascii="Arial" w:hAnsi="Arial" w:cs="Arial"/>
-          <w:sz w:val="20"/>
-          <w:szCs w:val="20"/>
-          <w:lang w:val="en-US"/>
-        </w:rPr>
-        <w:t>Ubukata K, Shibasaki Y, Yamamoto K, Chiba N, Hasegawa K, Takeuchi Y, Sunakawa K, Inoue M, Konno M. Association of amino acid substitutions in penicillin-binding protein 3 with beta-lactam resistance in beta-lactamase-negative ampicillin-resistant Haemophilus influenzae. Antimicrob Agents Chemother. 2001 45(6):1693-9.</w:t>
+      <w:proofErr w:type="spellStart"/>
+      <w:r>
+        <w:rPr>
+          <w:rFonts w:ascii="Arial" w:hAnsi="Arial" w:cs="Arial"/>
+          <w:sz w:val="18"/>
+          <w:szCs w:val="18"/>
+          <w:lang w:val="en-US"/>
+        </w:rPr>
+        <w:t>Ubukata</w:t>
+      </w:r>
+      <w:proofErr w:type="spellEnd"/>
+      <w:r>
+        <w:rPr>
+          <w:rFonts w:ascii="Arial" w:hAnsi="Arial" w:cs="Arial"/>
+          <w:sz w:val="18"/>
+          <w:szCs w:val="18"/>
+          <w:lang w:val="en-US"/>
+        </w:rPr>
+        <w:t xml:space="preserve"> K, Shibasaki Y, Yamamoto K, Chiba N, Hasegawa K, Takeuchi Y, </w:t>
+      </w:r>
+      <w:proofErr w:type="spellStart"/>
+      <w:r>
+        <w:rPr>
+          <w:rFonts w:ascii="Arial" w:hAnsi="Arial" w:cs="Arial"/>
+          <w:sz w:val="18"/>
+          <w:szCs w:val="18"/>
+          <w:lang w:val="en-US"/>
+        </w:rPr>
+        <w:t>Sunakawa</w:t>
+      </w:r>
+      <w:proofErr w:type="spellEnd"/>
+      <w:r>
+        <w:rPr>
+          <w:rFonts w:ascii="Arial" w:hAnsi="Arial" w:cs="Arial"/>
+          <w:sz w:val="18"/>
+          <w:szCs w:val="18"/>
+          <w:lang w:val="en-US"/>
+        </w:rPr>
+        <w:t xml:space="preserve"> K, Inoue M, Konno M. Association of amino acid substitutions in penicillin-binding protein 3 with beta-lactam resistance in beta-lactamase-negative ampicillin-resistant </w:t>
+      </w:r>
+      <w:proofErr w:type="spellStart"/>
+      <w:r>
+        <w:rPr>
+          <w:rFonts w:ascii="Arial" w:hAnsi="Arial" w:cs="Arial"/>
+          <w:sz w:val="18"/>
+          <w:szCs w:val="18"/>
+          <w:lang w:val="en-US"/>
+        </w:rPr>
+        <w:t>Haemophilus</w:t>
+      </w:r>
+      <w:proofErr w:type="spellEnd"/>
+      <w:r>
+        <w:rPr>
+          <w:rFonts w:ascii="Arial" w:hAnsi="Arial" w:cs="Arial"/>
+          <w:sz w:val="18"/>
+          <w:szCs w:val="18"/>
+          <w:lang w:val="en-US"/>
+        </w:rPr>
+        <w:t xml:space="preserve"> influenzae. </w:t>
+      </w:r>
+      <w:proofErr w:type="spellStart"/>
+      <w:r>
+        <w:rPr>
+          <w:rFonts w:ascii="Arial" w:hAnsi="Arial" w:cs="Arial"/>
+          <w:sz w:val="18"/>
+          <w:szCs w:val="18"/>
+          <w:lang w:val="en-US"/>
+        </w:rPr>
+        <w:t>Antimicrob</w:t>
+      </w:r>
+      <w:proofErr w:type="spellEnd"/>
+      <w:r>
+        <w:rPr>
+          <w:rFonts w:ascii="Arial" w:hAnsi="Arial" w:cs="Arial"/>
+          <w:sz w:val="18"/>
+          <w:szCs w:val="18"/>
+          <w:lang w:val="en-US"/>
+        </w:rPr>
+        <w:t xml:space="preserve"> Agents </w:t>
+      </w:r>
+      <w:proofErr w:type="spellStart"/>
+      <w:r>
+        <w:rPr>
+          <w:rFonts w:ascii="Arial" w:hAnsi="Arial" w:cs="Arial"/>
+          <w:sz w:val="18"/>
+          <w:szCs w:val="18"/>
+          <w:lang w:val="en-US"/>
+        </w:rPr>
+        <w:t>Chemother</w:t>
+      </w:r>
+      <w:proofErr w:type="spellEnd"/>
+      <w:r>
+        <w:rPr>
+          <w:rFonts w:ascii="Arial" w:hAnsi="Arial" w:cs="Arial"/>
+          <w:sz w:val="18"/>
+          <w:szCs w:val="18"/>
+          <w:lang w:val="en-US"/>
+        </w:rPr>
+        <w:t>. 2001 45(6):1693-9.</w:t>
       </w:r>
     </w:p>
     <w:p>
@@ -2379,15 +3034,15 @@
         <w:spacing w:before="93"/>
         <w:rPr>
           <w:rFonts w:ascii="Arial" w:hAnsi="Arial" w:cs="Arial"/>
-          <w:sz w:val="20"/>
-          <w:szCs w:val="20"/>
+          <w:sz w:val="18"/>
+          <w:szCs w:val="18"/>
         </w:rPr>
       </w:pPr>
       <w:r>
         <w:rPr>
           <w:rFonts w:ascii="Arial" w:hAnsi="Arial" w:cs="Arial"/>
-          <w:sz w:val="20"/>
-          <w:szCs w:val="20"/>
+          <w:sz w:val="18"/>
+          <w:szCs w:val="18"/>
           <w:lang w:val="en-US"/>
         </w:rPr>
         <w:t xml:space="preserve">3. </w:t>
@@ -2395,38 +3050,148 @@
       <w:r>
         <w:rPr>
           <w:rFonts w:ascii="Arial" w:hAnsi="Arial" w:cs="Arial"/>
-          <w:sz w:val="20"/>
-          <w:szCs w:val="20"/>
+          <w:sz w:val="18"/>
+          <w:szCs w:val="18"/>
           <w:lang w:val="en-GB"/>
         </w:rPr>
-        <w:t xml:space="preserve">Cherkaoui, A., Diene, S.M., Renzoni, A., Emonet, S., Renzi, G., et al. (2017). </w:t>
+        <w:t xml:space="preserve">Cherkaoui, A., Diene, S.M., Renzoni, A., </w:t>
+      </w:r>
+      <w:proofErr w:type="spellStart"/>
+      <w:r>
+        <w:rPr>
+          <w:rFonts w:ascii="Arial" w:hAnsi="Arial" w:cs="Arial"/>
+          <w:sz w:val="18"/>
+          <w:szCs w:val="18"/>
+          <w:lang w:val="en-GB"/>
+        </w:rPr>
+        <w:t>Emonet</w:t>
+      </w:r>
+      <w:proofErr w:type="spellEnd"/>
+      <w:r>
+        <w:rPr>
+          <w:rFonts w:ascii="Arial" w:hAnsi="Arial" w:cs="Arial"/>
+          <w:sz w:val="18"/>
+          <w:szCs w:val="18"/>
+          <w:lang w:val="en-GB"/>
+        </w:rPr>
+        <w:t xml:space="preserve">, S., Renzi, G., et al. (2017). </w:t>
       </w:r>
       <w:r>
         <w:rPr>
           <w:rFonts w:ascii="Arial" w:hAnsi="Arial" w:cs="Arial"/>
           <w:iCs/>
-          <w:sz w:val="20"/>
-          <w:szCs w:val="20"/>
+          <w:sz w:val="18"/>
+          <w:szCs w:val="18"/>
           <w:lang w:val="en-GB"/>
         </w:rPr>
-        <w:t>Imipenem heteroresistance in nontypeable Haemophilus influenzae is linked to a combination of altered PBP3, slow drug influx and direct efflux regulation.</w:t>
-      </w:r>
-      <w:r>
-        <w:rPr>
-          <w:rFonts w:ascii="Arial" w:hAnsi="Arial" w:cs="Arial"/>
-          <w:sz w:val="20"/>
-          <w:szCs w:val="20"/>
+        <w:t xml:space="preserve">Imipenem </w:t>
+      </w:r>
+      <w:proofErr w:type="spellStart"/>
+      <w:r>
+        <w:rPr>
+          <w:rFonts w:ascii="Arial" w:hAnsi="Arial" w:cs="Arial"/>
+          <w:iCs/>
+          <w:sz w:val="18"/>
+          <w:szCs w:val="18"/>
           <w:lang w:val="en-GB"/>
         </w:rPr>
+        <w:t>heteroresistance</w:t>
+      </w:r>
+      <w:proofErr w:type="spellEnd"/>
+      <w:r>
+        <w:rPr>
+          <w:rFonts w:ascii="Arial" w:hAnsi="Arial" w:cs="Arial"/>
+          <w:iCs/>
+          <w:sz w:val="18"/>
+          <w:szCs w:val="18"/>
+          <w:lang w:val="en-GB"/>
+        </w:rPr>
+        <w:t xml:space="preserve"> in </w:t>
+      </w:r>
+      <w:proofErr w:type="spellStart"/>
+      <w:r>
+        <w:rPr>
+          <w:rFonts w:ascii="Arial" w:hAnsi="Arial" w:cs="Arial"/>
+          <w:iCs/>
+          <w:sz w:val="18"/>
+          <w:szCs w:val="18"/>
+          <w:lang w:val="en-GB"/>
+        </w:rPr>
+        <w:t>nontypeable</w:t>
+      </w:r>
+      <w:proofErr w:type="spellEnd"/>
+      <w:r>
+        <w:rPr>
+          <w:rFonts w:ascii="Arial" w:hAnsi="Arial" w:cs="Arial"/>
+          <w:iCs/>
+          <w:sz w:val="18"/>
+          <w:szCs w:val="18"/>
+          <w:lang w:val="en-GB"/>
+        </w:rPr>
+        <w:t xml:space="preserve"> Haemophilus influenzae is linked to a combination of altered PBP3, slow drug influx and direct efflux regulation.</w:t>
+      </w:r>
+      <w:r>
+        <w:rPr>
+          <w:rFonts w:ascii="Arial" w:hAnsi="Arial" w:cs="Arial"/>
+          <w:sz w:val="18"/>
+          <w:szCs w:val="18"/>
+          <w:lang w:val="en-GB"/>
+        </w:rPr>
         <w:t xml:space="preserve"> </w:t>
       </w:r>
-      <w:r>
-        <w:rPr>
-          <w:rFonts w:ascii="Arial" w:hAnsi="Arial" w:cs="Arial"/>
-          <w:sz w:val="20"/>
-          <w:szCs w:val="20"/>
-        </w:rPr>
-        <w:t>Clin Microbiol Infect. 23(2): p. 118 e9-118 e19.</w:t>
+      <w:proofErr w:type="spellStart"/>
+      <w:r>
+        <w:rPr>
+          <w:rFonts w:ascii="Arial" w:hAnsi="Arial" w:cs="Arial"/>
+          <w:sz w:val="18"/>
+          <w:szCs w:val="18"/>
+        </w:rPr>
+        <w:t>Clin</w:t>
+      </w:r>
+      <w:proofErr w:type="spellEnd"/>
+      <w:r>
+        <w:rPr>
+          <w:rFonts w:ascii="Arial" w:hAnsi="Arial" w:cs="Arial"/>
+          <w:sz w:val="18"/>
+          <w:szCs w:val="18"/>
+        </w:rPr>
+        <w:t xml:space="preserve"> </w:t>
+      </w:r>
+      <w:proofErr w:type="spellStart"/>
+      <w:r>
+        <w:rPr>
+          <w:rFonts w:ascii="Arial" w:hAnsi="Arial" w:cs="Arial"/>
+          <w:sz w:val="18"/>
+          <w:szCs w:val="18"/>
+        </w:rPr>
+        <w:t>Microbiol</w:t>
+      </w:r>
+      <w:proofErr w:type="spellEnd"/>
+      <w:r>
+        <w:rPr>
+          <w:rFonts w:ascii="Arial" w:hAnsi="Arial" w:cs="Arial"/>
+          <w:sz w:val="18"/>
+          <w:szCs w:val="18"/>
+        </w:rPr>
+        <w:t xml:space="preserve"> </w:t>
+      </w:r>
+      <w:proofErr w:type="spellStart"/>
+      <w:r>
+        <w:rPr>
+          <w:rFonts w:ascii="Arial" w:hAnsi="Arial" w:cs="Arial"/>
+          <w:sz w:val="18"/>
+          <w:szCs w:val="18"/>
+        </w:rPr>
+        <w:t>Infect</w:t>
+      </w:r>
+      <w:proofErr w:type="spellEnd"/>
+      <w:r>
+        <w:rPr>
+          <w:rFonts w:ascii="Arial" w:hAnsi="Arial" w:cs="Arial"/>
+          <w:sz w:val="18"/>
+          <w:szCs w:val="18"/>
+        </w:rPr>
+        <w:t>. 23(2): p. 118 e9-118 e19.</w:t>
       </w:r>
     </w:p>
     <w:p>
@@ -2441,27 +3206,105 @@
         <w:spacing w:before="93"/>
         <w:rPr>
           <w:rFonts w:ascii="Arial" w:hAnsi="Arial" w:cs="Arial"/>
-          <w:sz w:val="20"/>
-          <w:szCs w:val="20"/>
+          <w:sz w:val="18"/>
+          <w:szCs w:val="18"/>
           <w:lang w:val="en-US"/>
         </w:rPr>
       </w:pPr>
       <w:r>
         <w:rPr>
           <w:rFonts w:ascii="Arial" w:hAnsi="Arial" w:cs="Arial"/>
-          <w:sz w:val="20"/>
-          <w:szCs w:val="20"/>
-        </w:rPr>
-        <w:t xml:space="preserve">4. Lâm, T.T., Nürnberg, S., Claus, H., and Vogel, U. (2020). </w:t>
-      </w:r>
-      <w:r>
-        <w:rPr>
-          <w:rFonts w:ascii="Arial" w:hAnsi="Arial" w:cs="Arial"/>
-          <w:sz w:val="20"/>
-          <w:szCs w:val="20"/>
-          <w:lang w:val="en-US"/>
-        </w:rPr>
-        <w:t>Molecular epidemiology of imipenem resistance in invasive Haemophilus influenzae infections in Germany in 2016. J Antimicrob Chemother. 75(8): p. 2076-2086</w:t>
+          <w:sz w:val="18"/>
+          <w:szCs w:val="18"/>
+        </w:rPr>
+        <w:t xml:space="preserve">4. </w:t>
+      </w:r>
+      <w:proofErr w:type="spellStart"/>
+      <w:r>
+        <w:rPr>
+          <w:rFonts w:ascii="Arial" w:hAnsi="Arial" w:cs="Arial"/>
+          <w:sz w:val="18"/>
+          <w:szCs w:val="18"/>
+        </w:rPr>
+        <w:t>Lâm</w:t>
+      </w:r>
+      <w:proofErr w:type="spellEnd"/>
+      <w:r>
+        <w:rPr>
+          <w:rFonts w:ascii="Arial" w:hAnsi="Arial" w:cs="Arial"/>
+          <w:sz w:val="18"/>
+          <w:szCs w:val="18"/>
+        </w:rPr>
+        <w:t xml:space="preserve">, T.T., Nürnberg, S., Claus, H., and Vogel, U. (2020). </w:t>
+      </w:r>
+      <w:r>
+        <w:rPr>
+          <w:rFonts w:ascii="Arial" w:hAnsi="Arial" w:cs="Arial"/>
+          <w:sz w:val="18"/>
+          <w:szCs w:val="18"/>
+          <w:lang w:val="en-US"/>
+        </w:rPr>
+        <w:t xml:space="preserve">Molecular epidemiology of imipenem resistance in invasive </w:t>
+      </w:r>
+      <w:proofErr w:type="spellStart"/>
+      <w:r>
+        <w:rPr>
+          <w:rFonts w:ascii="Arial" w:hAnsi="Arial" w:cs="Arial"/>
+          <w:sz w:val="18"/>
+          <w:szCs w:val="18"/>
+          <w:lang w:val="en-US"/>
+        </w:rPr>
+        <w:t>Haemophilus</w:t>
+      </w:r>
+      <w:proofErr w:type="spellEnd"/>
+      <w:r>
+        <w:rPr>
+          <w:rFonts w:ascii="Arial" w:hAnsi="Arial" w:cs="Arial"/>
+          <w:sz w:val="18"/>
+          <w:szCs w:val="18"/>
+          <w:lang w:val="en-US"/>
+        </w:rPr>
+        <w:t xml:space="preserve"> influenzae infections in Germany in 2016. J </w:t>
+      </w:r>
+      <w:proofErr w:type="spellStart"/>
+      <w:r>
+        <w:rPr>
+          <w:rFonts w:ascii="Arial" w:hAnsi="Arial" w:cs="Arial"/>
+          <w:sz w:val="18"/>
+          <w:szCs w:val="18"/>
+          <w:lang w:val="en-US"/>
+        </w:rPr>
+        <w:t>Antimicrob</w:t>
+      </w:r>
+      <w:proofErr w:type="spellEnd"/>
+      <w:r>
+        <w:rPr>
+          <w:rFonts w:ascii="Arial" w:hAnsi="Arial" w:cs="Arial"/>
+          <w:sz w:val="18"/>
+          <w:szCs w:val="18"/>
+          <w:lang w:val="en-US"/>
+        </w:rPr>
+        <w:t xml:space="preserve"> </w:t>
+      </w:r>
+      <w:proofErr w:type="spellStart"/>
+      <w:r>
+        <w:rPr>
+          <w:rFonts w:ascii="Arial" w:hAnsi="Arial" w:cs="Arial"/>
+          <w:sz w:val="18"/>
+          <w:szCs w:val="18"/>
+          <w:lang w:val="en-US"/>
+        </w:rPr>
+        <w:t>Chemother</w:t>
+      </w:r>
+      <w:proofErr w:type="spellEnd"/>
+      <w:r>
+        <w:rPr>
+          <w:rFonts w:ascii="Arial" w:hAnsi="Arial" w:cs="Arial"/>
+          <w:sz w:val="18"/>
+          <w:szCs w:val="18"/>
+          <w:lang w:val="en-US"/>
+        </w:rPr>
+        <w:t>. 75(8): p. 2076-2086</w:t>
       </w:r>
     </w:p>
     <w:p>
@@ -2476,26 +3319,172 @@
         <w:spacing w:before="93"/>
         <w:rPr>
           <w:rFonts w:ascii="Arial" w:hAnsi="Arial" w:cs="Arial"/>
-          <w:sz w:val="20"/>
-          <w:szCs w:val="20"/>
+          <w:sz w:val="18"/>
+          <w:szCs w:val="18"/>
         </w:rPr>
       </w:pPr>
       <w:r>
         <w:rPr>
           <w:rFonts w:ascii="Arial" w:hAnsi="Arial" w:cs="Arial"/>
-          <w:sz w:val="20"/>
-          <w:szCs w:val="20"/>
-          <w:lang w:val="en-US"/>
-        </w:rPr>
-        <w:t xml:space="preserve">5. Leclercq R, Cantón R, Brown DF, Giske CG, Heisig P, MacGowan AP, Mouton JW, Nordmann P, Rodloff AC, Rossolini GM, Soussy CJ, Steinbakk M, Winstanley TG, Kahlmeter G. EUCAST expert rules in antimicrobial susceptibility testing. </w:t>
-      </w:r>
-      <w:r>
-        <w:rPr>
-          <w:rFonts w:ascii="Arial" w:hAnsi="Arial" w:cs="Arial"/>
-          <w:sz w:val="20"/>
-          <w:szCs w:val="20"/>
-        </w:rPr>
-        <w:t>Clin Microbiol Infect. 2013 19(2): 141–160.</w:t>
+          <w:sz w:val="18"/>
+          <w:szCs w:val="18"/>
+          <w:lang w:val="en-US"/>
+        </w:rPr>
+        <w:t xml:space="preserve">5. Leclercq R, </w:t>
+      </w:r>
+      <w:proofErr w:type="spellStart"/>
+      <w:r>
+        <w:rPr>
+          <w:rFonts w:ascii="Arial" w:hAnsi="Arial" w:cs="Arial"/>
+          <w:sz w:val="18"/>
+          <w:szCs w:val="18"/>
+          <w:lang w:val="en-US"/>
+        </w:rPr>
+        <w:t>Cantón</w:t>
+      </w:r>
+      <w:proofErr w:type="spellEnd"/>
+      <w:r>
+        <w:rPr>
+          <w:rFonts w:ascii="Arial" w:hAnsi="Arial" w:cs="Arial"/>
+          <w:sz w:val="18"/>
+          <w:szCs w:val="18"/>
+          <w:lang w:val="en-US"/>
+        </w:rPr>
+        <w:t xml:space="preserve"> R, Brown DF, Giske CG, Heisig P, MacGowan AP, Mouton JW, Nordmann P, </w:t>
+      </w:r>
+      <w:proofErr w:type="spellStart"/>
+      <w:r>
+        <w:rPr>
+          <w:rFonts w:ascii="Arial" w:hAnsi="Arial" w:cs="Arial"/>
+          <w:sz w:val="18"/>
+          <w:szCs w:val="18"/>
+          <w:lang w:val="en-US"/>
+        </w:rPr>
+        <w:t>Rodloff</w:t>
+      </w:r>
+      <w:proofErr w:type="spellEnd"/>
+      <w:r>
+        <w:rPr>
+          <w:rFonts w:ascii="Arial" w:hAnsi="Arial" w:cs="Arial"/>
+          <w:sz w:val="18"/>
+          <w:szCs w:val="18"/>
+          <w:lang w:val="en-US"/>
+        </w:rPr>
+        <w:t xml:space="preserve"> AC, </w:t>
+      </w:r>
+      <w:proofErr w:type="spellStart"/>
+      <w:r>
+        <w:rPr>
+          <w:rFonts w:ascii="Arial" w:hAnsi="Arial" w:cs="Arial"/>
+          <w:sz w:val="18"/>
+          <w:szCs w:val="18"/>
+          <w:lang w:val="en-US"/>
+        </w:rPr>
+        <w:t>Rossolini</w:t>
+      </w:r>
+      <w:proofErr w:type="spellEnd"/>
+      <w:r>
+        <w:rPr>
+          <w:rFonts w:ascii="Arial" w:hAnsi="Arial" w:cs="Arial"/>
+          <w:sz w:val="18"/>
+          <w:szCs w:val="18"/>
+          <w:lang w:val="en-US"/>
+        </w:rPr>
+        <w:t xml:space="preserve"> GM, </w:t>
+      </w:r>
+      <w:proofErr w:type="spellStart"/>
+      <w:r>
+        <w:rPr>
+          <w:rFonts w:ascii="Arial" w:hAnsi="Arial" w:cs="Arial"/>
+          <w:sz w:val="18"/>
+          <w:szCs w:val="18"/>
+          <w:lang w:val="en-US"/>
+        </w:rPr>
+        <w:t>Soussy</w:t>
+      </w:r>
+      <w:proofErr w:type="spellEnd"/>
+      <w:r>
+        <w:rPr>
+          <w:rFonts w:ascii="Arial" w:hAnsi="Arial" w:cs="Arial"/>
+          <w:sz w:val="18"/>
+          <w:szCs w:val="18"/>
+          <w:lang w:val="en-US"/>
+        </w:rPr>
+        <w:t xml:space="preserve"> CJ, Steinbakk M, Winstanley TG, </w:t>
+      </w:r>
+      <w:proofErr w:type="spellStart"/>
+      <w:r>
+        <w:rPr>
+          <w:rFonts w:ascii="Arial" w:hAnsi="Arial" w:cs="Arial"/>
+          <w:sz w:val="18"/>
+          <w:szCs w:val="18"/>
+          <w:lang w:val="en-US"/>
+        </w:rPr>
+        <w:t>Kahlmeter</w:t>
+      </w:r>
+      <w:proofErr w:type="spellEnd"/>
+      <w:r>
+        <w:rPr>
+          <w:rFonts w:ascii="Arial" w:hAnsi="Arial" w:cs="Arial"/>
+          <w:sz w:val="18"/>
+          <w:szCs w:val="18"/>
+          <w:lang w:val="en-US"/>
+        </w:rPr>
+        <w:t xml:space="preserve"> G. EUCAST expert rules in antimicrobial susceptibility testing. </w:t>
+      </w:r>
+      <w:proofErr w:type="spellStart"/>
+      <w:r>
+        <w:rPr>
+          <w:rFonts w:ascii="Arial" w:hAnsi="Arial" w:cs="Arial"/>
+          <w:sz w:val="18"/>
+          <w:szCs w:val="18"/>
+        </w:rPr>
+        <w:t>Clin</w:t>
+      </w:r>
+      <w:proofErr w:type="spellEnd"/>
+      <w:r>
+        <w:rPr>
+          <w:rFonts w:ascii="Arial" w:hAnsi="Arial" w:cs="Arial"/>
+          <w:sz w:val="18"/>
+          <w:szCs w:val="18"/>
+        </w:rPr>
+        <w:t xml:space="preserve"> </w:t>
+      </w:r>
+      <w:proofErr w:type="spellStart"/>
+      <w:r>
+        <w:rPr>
+          <w:rFonts w:ascii="Arial" w:hAnsi="Arial" w:cs="Arial"/>
+          <w:sz w:val="18"/>
+          <w:szCs w:val="18"/>
+        </w:rPr>
+        <w:t>Microbiol</w:t>
+      </w:r>
+      <w:proofErr w:type="spellEnd"/>
+      <w:r>
+        <w:rPr>
+          <w:rFonts w:ascii="Arial" w:hAnsi="Arial" w:cs="Arial"/>
+          <w:sz w:val="18"/>
+          <w:szCs w:val="18"/>
+        </w:rPr>
+        <w:t xml:space="preserve"> </w:t>
+      </w:r>
+      <w:proofErr w:type="spellStart"/>
+      <w:r>
+        <w:rPr>
+          <w:rFonts w:ascii="Arial" w:hAnsi="Arial" w:cs="Arial"/>
+          <w:sz w:val="18"/>
+          <w:szCs w:val="18"/>
+        </w:rPr>
+        <w:t>Infect</w:t>
+      </w:r>
+      <w:proofErr w:type="spellEnd"/>
+      <w:r>
+        <w:rPr>
+          <w:rFonts w:ascii="Arial" w:hAnsi="Arial" w:cs="Arial"/>
+          <w:sz w:val="18"/>
+          <w:szCs w:val="18"/>
+        </w:rPr>
+        <w:t>. 2013 19(2): 141–160.</w:t>
       </w:r>
     </w:p>
     <w:p>
@@ -2510,36 +3499,87 @@
         <w:spacing w:before="93"/>
         <w:rPr>
           <w:rFonts w:ascii="Arial" w:hAnsi="Arial" w:cs="Arial"/>
-          <w:sz w:val="20"/>
-          <w:szCs w:val="20"/>
+          <w:sz w:val="18"/>
+          <w:szCs w:val="18"/>
           <w:lang w:val="en-US"/>
         </w:rPr>
       </w:pPr>
       <w:r>
         <w:rPr>
           <w:rFonts w:ascii="Arial" w:hAnsi="Arial" w:cs="Arial"/>
-          <w:sz w:val="20"/>
-          <w:szCs w:val="20"/>
+          <w:sz w:val="18"/>
+          <w:szCs w:val="18"/>
         </w:rPr>
         <w:t xml:space="preserve">6. Nürnberg, S., Claus, H., Krone, M., Vogel, U., and Lam, T.T. (2021). </w:t>
       </w:r>
       <w:r>
         <w:rPr>
           <w:rFonts w:ascii="Arial" w:hAnsi="Arial" w:cs="Arial"/>
-          <w:sz w:val="20"/>
-          <w:szCs w:val="20"/>
-          <w:lang w:val="en-US"/>
-        </w:rPr>
-        <w:t xml:space="preserve">Cefotaxime resistance in invasive Haemophilus influenzae isolates in Germany 2016-19: prevalence, epidemiology and relevance of PBP3 substitutions. </w:t>
-      </w:r>
-      <w:r>
-        <w:rPr>
-          <w:rFonts w:ascii="Arial" w:hAnsi="Arial" w:cs="Arial"/>
-          <w:sz w:val="20"/>
-          <w:szCs w:val="20"/>
-          <w:lang w:val="en-US"/>
-        </w:rPr>
-        <w:t>J Antimicrob Chemother. 76(4): p. 920-929.</w:t>
+          <w:sz w:val="18"/>
+          <w:szCs w:val="18"/>
+          <w:lang w:val="en-US"/>
+        </w:rPr>
+        <w:t xml:space="preserve">Cefotaxime resistance in invasive </w:t>
+      </w:r>
+      <w:proofErr w:type="spellStart"/>
+      <w:r>
+        <w:rPr>
+          <w:rFonts w:ascii="Arial" w:hAnsi="Arial" w:cs="Arial"/>
+          <w:sz w:val="18"/>
+          <w:szCs w:val="18"/>
+          <w:lang w:val="en-US"/>
+        </w:rPr>
+        <w:t>Haemophilus</w:t>
+      </w:r>
+      <w:proofErr w:type="spellEnd"/>
+      <w:r>
+        <w:rPr>
+          <w:rFonts w:ascii="Arial" w:hAnsi="Arial" w:cs="Arial"/>
+          <w:sz w:val="18"/>
+          <w:szCs w:val="18"/>
+          <w:lang w:val="en-US"/>
+        </w:rPr>
+        <w:t xml:space="preserve"> influenzae isolates in Germany 2016-19: prevalence, epidemiology and relevance of PBP3 substitutions. J </w:t>
+      </w:r>
+      <w:proofErr w:type="spellStart"/>
+      <w:r>
+        <w:rPr>
+          <w:rFonts w:ascii="Arial" w:hAnsi="Arial" w:cs="Arial"/>
+          <w:sz w:val="18"/>
+          <w:szCs w:val="18"/>
+          <w:lang w:val="en-US"/>
+        </w:rPr>
+        <w:t>Antimicrob</w:t>
+      </w:r>
+      <w:proofErr w:type="spellEnd"/>
+      <w:r>
+        <w:rPr>
+          <w:rFonts w:ascii="Arial" w:hAnsi="Arial" w:cs="Arial"/>
+          <w:sz w:val="18"/>
+          <w:szCs w:val="18"/>
+          <w:lang w:val="en-US"/>
+        </w:rPr>
+        <w:t xml:space="preserve"> </w:t>
+      </w:r>
+      <w:proofErr w:type="spellStart"/>
+      <w:r>
+        <w:rPr>
+          <w:rFonts w:ascii="Arial" w:hAnsi="Arial" w:cs="Arial"/>
+          <w:sz w:val="18"/>
+          <w:szCs w:val="18"/>
+          <w:lang w:val="en-US"/>
+        </w:rPr>
+        <w:t>Chemother</w:t>
+      </w:r>
+      <w:proofErr w:type="spellEnd"/>
+      <w:r>
+        <w:rPr>
+          <w:rFonts w:ascii="Arial" w:hAnsi="Arial" w:cs="Arial"/>
+          <w:sz w:val="18"/>
+          <w:szCs w:val="18"/>
+          <w:lang w:val="en-US"/>
+        </w:rPr>
+        <w:t>. 76(4): p. 920-929.</w:t>
       </w:r>
     </w:p>
     <w:p>
@@ -2592,8 +3632,33 @@
           <w:rFonts w:ascii="Arial" w:hAnsi="Arial" w:cs="Arial"/>
           <w:lang w:val="en-US"/>
         </w:rPr>
-        <w:t>Mit freundlichen Grüßen</w:t>
-      </w:r>
+        <w:t xml:space="preserve">Mit </w:t>
+      </w:r>
+      <w:proofErr w:type="spellStart"/>
+      <w:r>
+        <w:rPr>
+          <w:rFonts w:ascii="Arial" w:hAnsi="Arial" w:cs="Arial"/>
+          <w:lang w:val="en-US"/>
+        </w:rPr>
+        <w:t>freundlichen</w:t>
+      </w:r>
+      <w:proofErr w:type="spellEnd"/>
+      <w:r>
+        <w:rPr>
+          <w:rFonts w:ascii="Arial" w:hAnsi="Arial" w:cs="Arial"/>
+          <w:lang w:val="en-US"/>
+        </w:rPr>
+        <w:t xml:space="preserve"> </w:t>
+      </w:r>
+      <w:proofErr w:type="spellStart"/>
+      <w:r>
+        <w:rPr>
+          <w:rFonts w:ascii="Arial" w:hAnsi="Arial" w:cs="Arial"/>
+          <w:lang w:val="en-US"/>
+        </w:rPr>
+        <w:t>Grüßen</w:t>
+      </w:r>
+      <w:proofErr w:type="spellEnd"/>
     </w:p>
     <w:p>
       <w:pPr>
@@ -2674,6 +3739,8 @@
           <w:lang w:val="en-US"/>
         </w:rPr>
       </w:pPr>
+      <w:proofErr w:type="spellStart"/>
+      <w:proofErr w:type="gramStart"/>
       <w:r>
         <w:rPr>
           <w:rFonts w:ascii="Arial" w:hAnsi="Arial" w:cs="Arial"/>
@@ -2685,6 +3752,7 @@
         </w:rPr>
         <w:t>Kommentar</w:t>
       </w:r>
+      <w:proofErr w:type="spellEnd"/>
       <w:r>
         <w:rPr>
           <w:rFonts w:ascii="Arial" w:hAnsi="Arial" w:cs="Arial"/>
@@ -2692,7 +3760,17 @@
           <w:szCs w:val="16"/>
           <w:lang w:val="en-US"/>
         </w:rPr>
-        <w:t>: {Comment}</w:t>
+        <w:t>: {</w:t>
+      </w:r>
+      <w:proofErr w:type="gramEnd"/>
+      <w:r>
+        <w:rPr>
+          <w:rFonts w:ascii="Arial" w:hAnsi="Arial" w:cs="Arial"/>
+          <w:sz w:val="16"/>
+          <w:szCs w:val="16"/>
+          <w:lang w:val="en-US"/>
+        </w:rPr>
+        <w:t>Comment}</w:t>
       </w:r>
       <w:r>
         <w:rPr>
@@ -2701,7 +3779,58 @@
           <w:szCs w:val="12"/>
           <w:lang w:val="en-US"/>
         </w:rPr>
-        <w:t>{/HasComment}{/HasCommentOrAnnouncement}</w:t>
+        <w:t>{/</w:t>
+      </w:r>
+      <w:proofErr w:type="spellStart"/>
+      <w:proofErr w:type="gramStart"/>
+      <w:r>
+        <w:rPr>
+          <w:rFonts w:ascii="Arial" w:hAnsi="Arial" w:cs="Arial"/>
+          <w:sz w:val="12"/>
+          <w:szCs w:val="12"/>
+          <w:lang w:val="en-US"/>
+        </w:rPr>
+        <w:t>HasComment</w:t>
+      </w:r>
+      <w:proofErr w:type="spellEnd"/>
+      <w:r>
+        <w:rPr>
+          <w:rFonts w:ascii="Arial" w:hAnsi="Arial" w:cs="Arial"/>
+          <w:sz w:val="12"/>
+          <w:szCs w:val="12"/>
+          <w:lang w:val="en-US"/>
+        </w:rPr>
+        <w:t>}{</w:t>
+      </w:r>
+      <w:proofErr w:type="gramEnd"/>
+      <w:r>
+        <w:rPr>
+          <w:rFonts w:ascii="Arial" w:hAnsi="Arial" w:cs="Arial"/>
+          <w:sz w:val="12"/>
+          <w:szCs w:val="12"/>
+          <w:lang w:val="en-US"/>
+        </w:rPr>
+        <w:t>/</w:t>
+      </w:r>
+      <w:proofErr w:type="spellStart"/>
+      <w:r>
+        <w:rPr>
+          <w:rFonts w:ascii="Arial" w:hAnsi="Arial" w:cs="Arial"/>
+          <w:sz w:val="12"/>
+          <w:szCs w:val="12"/>
+          <w:lang w:val="en-US"/>
+        </w:rPr>
+        <w:t>HasCommentOrAnnouncement</w:t>
+      </w:r>
+      <w:proofErr w:type="spellEnd"/>
+      <w:r>
+        <w:rPr>
+          <w:rFonts w:ascii="Arial" w:hAnsi="Arial" w:cs="Arial"/>
+          <w:sz w:val="12"/>
+          <w:szCs w:val="12"/>
+          <w:lang w:val="en-US"/>
+        </w:rPr>
+        <w:t>}</w:t>
       </w:r>
       <w:r>
         <w:rPr>
@@ -2789,7 +3918,7 @@
       <w:rPr>
         <w:noProof/>
       </w:rPr>
-      <w:pict w14:anchorId="6A65D7A5">
+      <w:pict w14:anchorId="2F6643F8">
         <v:shapetype id="_x0000_t75" coordsize="21600,21600" o:spt="75" o:preferrelative="t" path="m@4@5l@4@11@9@11@9@5xe" filled="f" stroked="f">
           <v:stroke joinstyle="miter"/>
           <v:formulas>
@@ -2809,7 +3938,7 @@
           <v:path o:extrusionok="f" gradientshapeok="t" o:connecttype="rect"/>
           <o:lock v:ext="edit" aspectratio="t"/>
         </v:shapetype>
-        <v:shape id="Grafik 3" o:spid="_x0000_s1101" type="#_x0000_t75" alt="ML-13135-01_DAkkS-Symbol_grau1-1" style="position:absolute;margin-left:401.25pt;margin-top:-13.1pt;width:111pt;height:63pt;z-index:2;visibility:visible;mso-wrap-style:square;mso-width-percent:0;mso-height-percent:0;mso-wrap-distance-left:9pt;mso-wrap-distance-top:0;mso-wrap-distance-right:9pt;mso-wrap-distance-bottom:0;mso-position-horizontal:absolute;mso-position-horizontal-relative:text;mso-position-vertical:absolute;mso-position-vertical-relative:text;mso-width-percent:0;mso-height-percent:0;mso-width-relative:page;mso-height-relative:page">
+        <v:shape id="Grafik 881842716" o:spid="_x0000_s1113" type="#_x0000_t75" alt="ML-13135-01_DAkkS-Symbol_grau1-1" style="position:absolute;margin-left:401.25pt;margin-top:-13.1pt;width:111pt;height:63pt;z-index:5;visibility:visible;mso-wrap-style:square;mso-width-percent:0;mso-height-percent:0;mso-wrap-distance-left:9pt;mso-wrap-distance-top:0;mso-wrap-distance-right:9pt;mso-wrap-distance-bottom:0;mso-position-horizontal:absolute;mso-position-horizontal-relative:text;mso-position-vertical:absolute;mso-position-vertical-relative:text;mso-width-percent:0;mso-height-percent:0;mso-width-relative:page;mso-height-relative:page">
           <v:imagedata r:id="rId1" o:title="ML-13135-01_DAkkS-Symbol_grau1-1"/>
         </v:shape>
       </w:pict>
@@ -2827,21 +3956,51 @@
         <w:szCs w:val="17"/>
       </w:rPr>
       <w:tab/>
-      <w:t>Befund zu</w:t>
+      <w:t xml:space="preserve">Befund </w:t>
     </w:r>
     <w:r>
       <w:rPr>
         <w:sz w:val="17"/>
         <w:szCs w:val="17"/>
       </w:rPr>
-      <w:t xml:space="preserve"> </w:t>
+      <w:t xml:space="preserve">vom {Date} </w:t>
     </w:r>
     <w:r>
       <w:rPr>
         <w:sz w:val="17"/>
         <w:szCs w:val="17"/>
       </w:rPr>
-      <w:t>{LaboratoryNumberWithPrefix}</w:t>
+      <w:t>zu</w:t>
+    </w:r>
+    <w:r>
+      <w:rPr>
+        <w:sz w:val="17"/>
+        <w:szCs w:val="17"/>
+      </w:rPr>
+      <w:t xml:space="preserve"> </w:t>
+    </w:r>
+    <w:r>
+      <w:rPr>
+        <w:sz w:val="17"/>
+        <w:szCs w:val="17"/>
+      </w:rPr>
+      <w:t>{</w:t>
+    </w:r>
+    <w:proofErr w:type="spellStart"/>
+    <w:r>
+      <w:rPr>
+        <w:sz w:val="17"/>
+        <w:szCs w:val="17"/>
+      </w:rPr>
+      <w:t>LaboratoryNumberWithPrefix</w:t>
+    </w:r>
+    <w:proofErr w:type="spellEnd"/>
+    <w:r>
+      <w:rPr>
+        <w:sz w:val="17"/>
+        <w:szCs w:val="17"/>
+      </w:rPr>
+      <w:t>}</w:t>
     </w:r>
     <w:r>
       <w:rPr>
@@ -3025,7 +4184,7 @@
       <w:rPr>
         <w:noProof/>
       </w:rPr>
-      <w:pict w14:anchorId="5B1CF9DD">
+      <w:pict w14:anchorId="77FE5FFC">
         <v:shapetype id="_x0000_t75" coordsize="21600,21600" o:spt="75" o:preferrelative="t" path="m@4@5l@4@11@9@11@9@5xe" filled="f" stroked="f">
           <v:stroke joinstyle="miter"/>
           <v:formulas>
@@ -3045,7 +4204,7 @@
           <v:path o:extrusionok="f" gradientshapeok="t" o:connecttype="rect"/>
           <o:lock v:ext="edit" aspectratio="t"/>
         </v:shapetype>
-        <v:shape id="Grafik 149463303" o:spid="_x0000_s1100" type="#_x0000_t75" alt="ML-13135-01_DAkkS-Symbol_grau1-1" style="position:absolute;margin-left:401.25pt;margin-top:-13.1pt;width:111pt;height:63pt;z-index:3;visibility:visible;mso-wrap-style:square;mso-width-percent:0;mso-height-percent:0;mso-wrap-distance-left:9pt;mso-wrap-distance-top:0;mso-wrap-distance-right:9pt;mso-wrap-distance-bottom:0;mso-position-horizontal:absolute;mso-position-horizontal-relative:text;mso-position-vertical:absolute;mso-position-vertical-relative:text;mso-width-percent:0;mso-height-percent:0;mso-width-relative:page;mso-height-relative:page">
+        <v:shape id="Grafik 1623725509" o:spid="_x0000_s1112" type="#_x0000_t75" alt="ML-13135-01_DAkkS-Symbol_grau1-1" style="position:absolute;margin-left:401.25pt;margin-top:-13.1pt;width:111pt;height:63pt;z-index:3;visibility:visible;mso-wrap-style:square;mso-width-percent:0;mso-height-percent:0;mso-wrap-distance-left:9pt;mso-wrap-distance-top:0;mso-wrap-distance-right:9pt;mso-wrap-distance-bottom:0;mso-position-horizontal:absolute;mso-position-horizontal-relative:text;mso-position-vertical:absolute;mso-position-vertical-relative:text;mso-width-percent:0;mso-height-percent:0;mso-width-relative:page;mso-height-relative:page">
           <v:imagedata r:id="rId1" o:title="ML-13135-01_DAkkS-Symbol_grau1-1"/>
         </v:shape>
       </w:pict>
@@ -3063,21 +4222,51 @@
         <w:szCs w:val="17"/>
       </w:rPr>
       <w:tab/>
-      <w:t>Befund zu</w:t>
+      <w:t xml:space="preserve">Befund </w:t>
     </w:r>
     <w:r>
       <w:rPr>
         <w:sz w:val="17"/>
         <w:szCs w:val="17"/>
       </w:rPr>
-      <w:t xml:space="preserve"> </w:t>
+      <w:t xml:space="preserve">vom {Date} </w:t>
     </w:r>
     <w:r>
       <w:rPr>
         <w:sz w:val="17"/>
         <w:szCs w:val="17"/>
       </w:rPr>
-      <w:t>{LaboratoryNumberWithPrefix}</w:t>
+      <w:t>zu</w:t>
+    </w:r>
+    <w:r>
+      <w:rPr>
+        <w:sz w:val="17"/>
+        <w:szCs w:val="17"/>
+      </w:rPr>
+      <w:t xml:space="preserve"> </w:t>
+    </w:r>
+    <w:r>
+      <w:rPr>
+        <w:sz w:val="17"/>
+        <w:szCs w:val="17"/>
+      </w:rPr>
+      <w:t>{</w:t>
+    </w:r>
+    <w:proofErr w:type="spellStart"/>
+    <w:r>
+      <w:rPr>
+        <w:sz w:val="17"/>
+        <w:szCs w:val="17"/>
+      </w:rPr>
+      <w:t>LaboratoryNumberWithPrefix</w:t>
+    </w:r>
+    <w:proofErr w:type="spellEnd"/>
+    <w:r>
+      <w:rPr>
+        <w:sz w:val="17"/>
+        <w:szCs w:val="17"/>
+      </w:rPr>
+      <w:t>}</w:t>
     </w:r>
     <w:r>
       <w:rPr>
@@ -3282,8 +4471,6 @@
         <w:b/>
         <w:smallCaps/>
         <w:spacing w:val="20"/>
-        <w:sz w:val="28"/>
-        <w:szCs w:val="28"/>
       </w:rPr>
     </w:pPr>
     <w:r>
@@ -3311,7 +4498,7 @@
       <w:rPr>
         <w:noProof/>
       </w:rPr>
-      <w:pict w14:anchorId="07FF942D">
+      <w:pict w14:anchorId="79324231">
         <v:shapetype id="_x0000_t75" coordsize="21600,21600" o:spt="75" o:preferrelative="t" path="m@4@5l@4@11@9@11@9@5xe" filled="f" stroked="f">
           <v:stroke joinstyle="miter"/>
           <v:formulas>
@@ -3331,7 +4518,7 @@
           <v:path o:extrusionok="f" gradientshapeok="t" o:connecttype="rect"/>
           <o:lock v:ext="edit" aspectratio="t"/>
         </v:shapetype>
-        <v:shape id="Grafik 7" o:spid="_x0000_s1099" type="#_x0000_t75" alt="nrzmhi_logo_500" style="position:absolute;margin-left:385.15pt;margin-top:2.25pt;width:63.4pt;height:63.4pt;z-index:-4;visibility:visible;mso-wrap-style:square;mso-width-percent:0;mso-height-percent:0;mso-wrap-distance-left:9pt;mso-wrap-distance-top:0;mso-wrap-distance-right:9pt;mso-wrap-distance-bottom:0;mso-position-horizontal:absolute;mso-position-horizontal-relative:text;mso-position-vertical:absolute;mso-position-vertical-relative:text;mso-width-percent:0;mso-height-percent:0;mso-width-relative:page;mso-height-relative:page">
+        <v:shape id="Grafik 281987118" o:spid="_x0000_s1115" type="#_x0000_t75" alt="nrzmhi_logo_500" style="position:absolute;margin-left:385.15pt;margin-top:2.25pt;width:63.4pt;height:63.4pt;z-index:-1;visibility:visible;mso-wrap-style:square;mso-width-percent:0;mso-height-percent:0;mso-wrap-distance-left:9pt;mso-wrap-distance-top:0;mso-wrap-distance-right:9pt;mso-wrap-distance-bottom:0;mso-position-horizontal:absolute;mso-position-horizontal-relative:text;mso-position-vertical:absolute;mso-position-vertical-relative:text;mso-width-percent:0;mso-height-percent:0;mso-width-relative:page;mso-height-relative:page">
           <v:imagedata r:id="rId1" o:title="nrzmhi_logo_500"/>
         </v:shape>
       </w:pict>
@@ -3340,8 +4527,8 @@
       <w:rPr>
         <w:noProof/>
       </w:rPr>
-      <w:pict w14:anchorId="745363CE">
-        <v:shape id="Grafik 8" o:spid="_x0000_s1098" type="#_x0000_t75" alt="RKI_Logo-NRZKL-Deu_RGB-1.JPG" style="position:absolute;margin-left:449.25pt;margin-top:6.75pt;width:55pt;height:55pt;z-index:1;visibility:visible;mso-wrap-style:square;mso-width-percent:0;mso-height-percent:0;mso-wrap-distance-left:9pt;mso-wrap-distance-top:0;mso-wrap-distance-right:9pt;mso-wrap-distance-bottom:0;mso-position-horizontal:absolute;mso-position-horizontal-relative:text;mso-position-vertical:absolute;mso-position-vertical-relative:text;mso-width-percent:0;mso-height-percent:0;mso-width-relative:page;mso-height-relative:page" stroked="t" strokecolor="white">
+      <w:pict w14:anchorId="775D9896">
+        <v:shape id="Grafik 385460452" o:spid="_x0000_s1114" type="#_x0000_t75" alt="RKI_Logo-NRZKL-Deu_RGB-1.JPG" style="position:absolute;margin-left:449.25pt;margin-top:6.75pt;width:55pt;height:55pt;z-index:4;visibility:visible;mso-wrap-style:square;mso-width-percent:0;mso-height-percent:0;mso-wrap-distance-left:9pt;mso-wrap-distance-top:0;mso-wrap-distance-right:9pt;mso-wrap-distance-bottom:0;mso-position-horizontal:absolute;mso-position-horizontal-relative:text;mso-position-vertical:absolute;mso-position-vertical-relative:text;mso-width-percent:0;mso-height-percent:0;mso-width-relative:page;mso-height-relative:page" stroked="t" strokecolor="white">
           <v:imagedata r:id="rId2" o:title="RKI_Logo-NRZKL-Deu_RGB-1"/>
         </v:shape>
       </w:pict>
@@ -3352,8 +4539,6 @@
         <w:b/>
         <w:smallCaps/>
         <w:spacing w:val="20"/>
-        <w:sz w:val="28"/>
-        <w:szCs w:val="28"/>
       </w:rPr>
       <w:t xml:space="preserve">Nationales Referenzzentrum für Meningokokken </w:t>
     </w:r>
@@ -3365,8 +4550,6 @@
         <w:rFonts w:ascii="Arial" w:hAnsi="Arial" w:cs="Arial"/>
         <w:smallCaps/>
         <w:spacing w:val="20"/>
-        <w:sz w:val="28"/>
-        <w:szCs w:val="28"/>
       </w:rPr>
     </w:pPr>
     <w:r>
@@ -3376,8 +4559,6 @@
         <w:smallCaps/>
         <w:noProof/>
         <w:spacing w:val="20"/>
-        <w:sz w:val="28"/>
-        <w:szCs w:val="28"/>
       </w:rPr>
       <w:t>und Haemophilus influenzae</w:t>
     </w:r>
@@ -3385,14 +4566,14 @@
   <w:p>
     <w:pPr>
       <w:rPr>
-        <w:sz w:val="22"/>
-        <w:szCs w:val="22"/>
+        <w:sz w:val="20"/>
+        <w:szCs w:val="20"/>
       </w:rPr>
     </w:pPr>
     <w:r>
       <w:rPr>
-        <w:sz w:val="22"/>
-        <w:szCs w:val="22"/>
+        <w:sz w:val="20"/>
+        <w:szCs w:val="20"/>
       </w:rPr>
       <w:t>Gesamtleitung: PD Dr. rer. nat. Heike Claus</w:t>
     </w:r>
@@ -3400,17 +4581,42 @@
   <w:p>
     <w:pPr>
       <w:rPr>
-        <w:sz w:val="12"/>
-        <w:szCs w:val="12"/>
+        <w:sz w:val="20"/>
+        <w:szCs w:val="20"/>
       </w:rPr>
     </w:pPr>
     <w:r>
       <w:rPr>
-        <w:sz w:val="22"/>
-        <w:szCs w:val="22"/>
-      </w:rPr>
-      <w:t>ärztliche Leitung: PD Dr. med. Thiên-Trí Lâm</w:t>
-    </w:r>
+        <w:sz w:val="20"/>
+        <w:szCs w:val="20"/>
+      </w:rPr>
+      <w:t xml:space="preserve">ärztliche Leitung: PD Dr. med. </w:t>
+    </w:r>
+    <w:proofErr w:type="spellStart"/>
+    <w:r>
+      <w:rPr>
+        <w:sz w:val="20"/>
+        <w:szCs w:val="20"/>
+      </w:rPr>
+      <w:t>Thiên-Trí</w:t>
+    </w:r>
+    <w:proofErr w:type="spellEnd"/>
+    <w:r>
+      <w:rPr>
+        <w:sz w:val="20"/>
+        <w:szCs w:val="20"/>
+      </w:rPr>
+      <w:t xml:space="preserve"> </w:t>
+    </w:r>
+    <w:proofErr w:type="spellStart"/>
+    <w:r>
+      <w:rPr>
+        <w:sz w:val="20"/>
+        <w:szCs w:val="20"/>
+      </w:rPr>
+      <w:t>Lâm</w:t>
+    </w:r>
+    <w:proofErr w:type="spellEnd"/>
   </w:p>
   <w:p>
     <w:pPr>
@@ -3419,6 +4625,143 @@
         <w:szCs w:val="12"/>
       </w:rPr>
     </w:pPr>
+  </w:p>
+  <w:p>
+    <w:pPr>
+      <w:rPr>
+        <w:sz w:val="12"/>
+        <w:szCs w:val="12"/>
+      </w:rPr>
+    </w:pPr>
+    <w:r>
+      <w:rPr>
+        <w:sz w:val="12"/>
+        <w:szCs w:val="12"/>
+      </w:rPr>
+      <w:t xml:space="preserve">Labor-Nr. des </w:t>
+    </w:r>
+    <w:proofErr w:type="spellStart"/>
+    <w:r>
+      <w:rPr>
+        <w:sz w:val="12"/>
+        <w:szCs w:val="12"/>
+      </w:rPr>
+      <w:t>NRZMHi</w:t>
+    </w:r>
+    <w:proofErr w:type="spellEnd"/>
+    <w:r>
+      <w:rPr>
+        <w:sz w:val="12"/>
+        <w:szCs w:val="12"/>
+      </w:rPr>
+      <w:t xml:space="preserve">: </w:t>
+    </w:r>
+    <w:r>
+      <w:rPr>
+        <w:sz w:val="12"/>
+        <w:szCs w:val="12"/>
+      </w:rPr>
+      <w:t>{</w:t>
+    </w:r>
+    <w:proofErr w:type="spellStart"/>
+    <w:r>
+      <w:rPr>
+        <w:sz w:val="12"/>
+        <w:szCs w:val="12"/>
+      </w:rPr>
+      <w:t>LaboratoryNumberWithPrefix</w:t>
+    </w:r>
+    <w:proofErr w:type="spellEnd"/>
+    <w:r>
+      <w:rPr>
+        <w:sz w:val="12"/>
+        <w:szCs w:val="12"/>
+      </w:rPr>
+      <w:t>}</w:t>
+    </w:r>
+    <w:r>
+      <w:rPr>
+        <w:sz w:val="12"/>
+        <w:szCs w:val="12"/>
+      </w:rPr>
+      <w:t xml:space="preserve"> · isoliert aus: {</w:t>
+    </w:r>
+    <w:proofErr w:type="spellStart"/>
+    <w:r>
+      <w:rPr>
+        <w:sz w:val="12"/>
+        <w:szCs w:val="12"/>
+      </w:rPr>
+      <w:t>SamplingLocation</w:t>
+    </w:r>
+    <w:proofErr w:type="spellEnd"/>
+    <w:r>
+      <w:rPr>
+        <w:sz w:val="12"/>
+        <w:szCs w:val="12"/>
+      </w:rPr>
+      <w:t>} · Datum der Materialentnahme:</w:t>
+    </w:r>
+    <w:r>
+      <w:rPr>
+        <w:sz w:val="12"/>
+        <w:szCs w:val="12"/>
+      </w:rPr>
+      <w:t xml:space="preserve"> </w:t>
+    </w:r>
+    <w:r>
+      <w:rPr>
+        <w:sz w:val="12"/>
+        <w:szCs w:val="12"/>
+      </w:rPr>
+      <w:t>{</w:t>
+    </w:r>
+    <w:proofErr w:type="spellStart"/>
+    <w:r>
+      <w:rPr>
+        <w:sz w:val="12"/>
+        <w:szCs w:val="12"/>
+      </w:rPr>
+      <w:t>SamplingDate</w:t>
+    </w:r>
+    <w:proofErr w:type="spellEnd"/>
+    <w:r>
+      <w:rPr>
+        <w:sz w:val="12"/>
+        <w:szCs w:val="12"/>
+      </w:rPr>
+      <w:t>} · Labor-Nr. des Einsenders:</w:t>
+    </w:r>
+    <w:r>
+      <w:rPr>
+        <w:sz w:val="12"/>
+        <w:szCs w:val="12"/>
+      </w:rPr>
+      <w:t xml:space="preserve"> </w:t>
+    </w:r>
+    <w:r>
+      <w:rPr>
+        <w:sz w:val="12"/>
+        <w:szCs w:val="12"/>
+      </w:rPr>
+      <w:t>{</w:t>
+    </w:r>
+    <w:proofErr w:type="spellStart"/>
+    <w:r>
+      <w:rPr>
+        <w:sz w:val="12"/>
+        <w:szCs w:val="12"/>
+      </w:rPr>
+      <w:t>SenderLaboratoryNumber</w:t>
+    </w:r>
+    <w:proofErr w:type="spellEnd"/>
+    <w:r>
+      <w:rPr>
+        <w:sz w:val="12"/>
+        <w:szCs w:val="12"/>
+      </w:rPr>
+      <w:t>}</w:t>
+    </w:r>
   </w:p>
   <w:p>
     <w:pPr>
@@ -3496,7 +4839,7 @@
           <v:path o:extrusionok="f" gradientshapeok="t" o:connecttype="rect"/>
           <o:lock v:ext="edit" aspectratio="t"/>
         </v:shapetype>
-        <v:shape id="Grafik 1594286521" o:spid="_x0000_s1111" type="#_x0000_t75" alt="nrzmhi_logo_500" style="position:absolute;margin-left:385.15pt;margin-top:2.25pt;width:63.4pt;height:63.4pt;z-index:-1;visibility:visible;mso-wrap-style:square;mso-width-percent:0;mso-height-percent:0;mso-wrap-distance-left:9pt;mso-wrap-distance-top:0;mso-wrap-distance-right:9pt;mso-wrap-distance-bottom:0;mso-position-horizontal:absolute;mso-position-horizontal-relative:text;mso-position-vertical:absolute;mso-position-vertical-relative:text;mso-width-percent:0;mso-height-percent:0;mso-width-relative:page;mso-height-relative:page">
+        <v:shape id="Grafik 1594286521" o:spid="_x0000_s1111" type="#_x0000_t75" alt="nrzmhi_logo_500" style="position:absolute;margin-left:385.15pt;margin-top:2.25pt;width:63.4pt;height:63.4pt;z-index:-2;visibility:visible;mso-wrap-style:square;mso-width-percent:0;mso-height-percent:0;mso-wrap-distance-left:9pt;mso-wrap-distance-top:0;mso-wrap-distance-right:9pt;mso-wrap-distance-bottom:0;mso-position-horizontal:absolute;mso-position-horizontal-relative:text;mso-position-vertical:absolute;mso-position-vertical-relative:text;mso-width-percent:0;mso-height-percent:0;mso-width-relative:page;mso-height-relative:page">
           <v:imagedata r:id="rId1" o:title="nrzmhi_logo_500"/>
         </v:shape>
       </w:pict>
@@ -3506,7 +4849,7 @@
         <w:noProof/>
       </w:rPr>
       <w:pict w14:anchorId="17A30905">
-        <v:shape id="Grafik 23658753" o:spid="_x0000_s1110" type="#_x0000_t75" alt="RKI_Logo-NRZKL-Deu_RGB-1.JPG" style="position:absolute;margin-left:449.25pt;margin-top:6.75pt;width:55pt;height:55pt;z-index:5;visibility:visible;mso-wrap-style:square;mso-width-percent:0;mso-height-percent:0;mso-wrap-distance-left:9pt;mso-wrap-distance-top:0;mso-wrap-distance-right:9pt;mso-wrap-distance-bottom:0;mso-position-horizontal:absolute;mso-position-horizontal-relative:text;mso-position-vertical:absolute;mso-position-vertical-relative:text;mso-width-percent:0;mso-height-percent:0;mso-width-relative:page;mso-height-relative:page" stroked="t" strokecolor="white">
+        <v:shape id="Grafik 23658753" o:spid="_x0000_s1110" type="#_x0000_t75" alt="RKI_Logo-NRZKL-Deu_RGB-1.JPG" style="position:absolute;margin-left:449.25pt;margin-top:6.75pt;width:55pt;height:55pt;z-index:1;visibility:visible;mso-wrap-style:square;mso-width-percent:0;mso-height-percent:0;mso-wrap-distance-left:9pt;mso-wrap-distance-top:0;mso-wrap-distance-right:9pt;mso-wrap-distance-bottom:0;mso-position-horizontal:absolute;mso-position-horizontal-relative:text;mso-position-vertical:absolute;mso-position-vertical-relative:text;mso-width-percent:0;mso-height-percent:0;mso-width-relative:page;mso-height-relative:page" stroked="t" strokecolor="white">
           <v:imagedata r:id="rId2" o:title="RKI_Logo-NRZKL-Deu_RGB-1"/>
         </v:shape>
       </w:pict>
@@ -3589,8 +4932,33 @@
         <w:sz w:val="22"/>
         <w:szCs w:val="22"/>
       </w:rPr>
-      <w:t>ärztliche Leitung: PD Dr. med. Thiên-Trí Lâm</w:t>
-    </w:r>
+      <w:t xml:space="preserve">ärztliche Leitung: PD Dr. med. </w:t>
+    </w:r>
+    <w:proofErr w:type="spellStart"/>
+    <w:r>
+      <w:rPr>
+        <w:sz w:val="22"/>
+        <w:szCs w:val="22"/>
+      </w:rPr>
+      <w:t>Thiên-Trí</w:t>
+    </w:r>
+    <w:proofErr w:type="spellEnd"/>
+    <w:r>
+      <w:rPr>
+        <w:sz w:val="22"/>
+        <w:szCs w:val="22"/>
+      </w:rPr>
+      <w:t xml:space="preserve"> </w:t>
+    </w:r>
+    <w:proofErr w:type="spellStart"/>
+    <w:r>
+      <w:rPr>
+        <w:sz w:val="22"/>
+        <w:szCs w:val="22"/>
+      </w:rPr>
+      <w:t>Lâm</w:t>
+    </w:r>
+    <w:proofErr w:type="spellEnd"/>
   </w:p>
   <w:p>
     <w:pPr>
@@ -3631,7 +4999,7 @@
           <v:stroke joinstyle="miter"/>
           <v:path gradientshapeok="t" o:connecttype="rect"/>
         </v:shapetype>
-        <v:shape id="Textfeld 3" o:spid="_x0000_s1109" type="#_x0000_t202" style="position:absolute;margin-left:364.1pt;margin-top:2.3pt;width:156.8pt;height:304.25pt;z-index:6;visibility:visible;mso-wrap-style:square;mso-width-percent:0;mso-height-percent:0;mso-wrap-distance-left:9pt;mso-wrap-distance-top:0;mso-wrap-distance-right:9pt;mso-wrap-distance-bottom:0;mso-position-horizontal-relative:text;mso-position-vertical-relative:text;mso-width-percent:0;mso-height-percent:0;mso-width-relative:page;mso-height-relative:page;v-text-anchor:top" o:gfxdata="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" stroked="f">
+        <v:shape id="Textfeld 3" o:spid="_x0000_s1109" type="#_x0000_t202" style="position:absolute;margin-left:364.1pt;margin-top:2.3pt;width:156.8pt;height:304.25pt;z-index:2;visibility:visible;mso-wrap-style:square;mso-width-percent:0;mso-height-percent:0;mso-wrap-distance-left:9pt;mso-wrap-distance-top:0;mso-wrap-distance-right:9pt;mso-wrap-distance-bottom:0;mso-position-horizontal-relative:text;mso-position-vertical-relative:text;mso-width-percent:0;mso-height-percent:0;mso-width-relative:page;mso-height-relative:page;v-text-anchor:top" o:gfxdata="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" stroked="f">
           <v:textbox style="mso-next-textbox:#Textfeld 3">
             <w:txbxContent>
               <w:p>

</xml_diff>

<commit_message>
Update report header and footer according to DAkkS finding (#200)
* Update header and footer according to DAkkS finding
* Release version 3.49
* Fix display logic to always show device ( #198)
</commit_message>
<xml_diff>
--- a/HaemophilusWeb/ReportTemplates/BLNAR v10.docx
+++ b/HaemophilusWeb/ReportTemplates/BLNAR v10.docx
@@ -21,7 +21,21 @@
         <w:rPr>
           <w:rFonts w:ascii="Arial" w:hAnsi="Arial" w:cs="Arial"/>
         </w:rPr>
-        <w:t>{SenderName}</w:t>
+        <w:t>{</w:t>
+      </w:r>
+      <w:proofErr w:type="spellStart"/>
+      <w:r>
+        <w:rPr>
+          <w:rFonts w:ascii="Arial" w:hAnsi="Arial" w:cs="Arial"/>
+        </w:rPr>
+        <w:t>SenderName</w:t>
+      </w:r>
+      <w:proofErr w:type="spellEnd"/>
+      <w:r>
+        <w:rPr>
+          <w:rFonts w:ascii="Arial" w:hAnsi="Arial" w:cs="Arial"/>
+        </w:rPr>
+        <w:t>}</w:t>
       </w:r>
     </w:p>
     <w:p>
@@ -34,7 +48,21 @@
         <w:rPr>
           <w:rFonts w:ascii="Arial" w:hAnsi="Arial" w:cs="Arial"/>
         </w:rPr>
-        <w:t>{SenderDepartment}</w:t>
+        <w:t>{</w:t>
+      </w:r>
+      <w:proofErr w:type="spellStart"/>
+      <w:r>
+        <w:rPr>
+          <w:rFonts w:ascii="Arial" w:hAnsi="Arial" w:cs="Arial"/>
+        </w:rPr>
+        <w:t>SenderDepartment</w:t>
+      </w:r>
+      <w:proofErr w:type="spellEnd"/>
+      <w:r>
+        <w:rPr>
+          <w:rFonts w:ascii="Arial" w:hAnsi="Arial" w:cs="Arial"/>
+        </w:rPr>
+        <w:t>}</w:t>
       </w:r>
     </w:p>
     <w:p>
@@ -47,7 +75,21 @@
         <w:rPr>
           <w:rFonts w:ascii="Arial" w:hAnsi="Arial" w:cs="Arial"/>
         </w:rPr>
-        <w:t>{SenderStreet}</w:t>
+        <w:t>{</w:t>
+      </w:r>
+      <w:proofErr w:type="spellStart"/>
+      <w:r>
+        <w:rPr>
+          <w:rFonts w:ascii="Arial" w:hAnsi="Arial" w:cs="Arial"/>
+        </w:rPr>
+        <w:t>SenderStreet</w:t>
+      </w:r>
+      <w:proofErr w:type="spellEnd"/>
+      <w:r>
+        <w:rPr>
+          <w:rFonts w:ascii="Arial" w:hAnsi="Arial" w:cs="Arial"/>
+        </w:rPr>
+        <w:t>}</w:t>
       </w:r>
     </w:p>
     <w:p>
@@ -62,7 +104,23 @@
           <w:rFonts w:ascii="Arial" w:hAnsi="Arial" w:cs="Arial"/>
           <w:bCs/>
         </w:rPr>
-        <w:t>{SenderCity}</w:t>
+        <w:t>{</w:t>
+      </w:r>
+      <w:proofErr w:type="spellStart"/>
+      <w:r>
+        <w:rPr>
+          <w:rFonts w:ascii="Arial" w:hAnsi="Arial" w:cs="Arial"/>
+          <w:bCs/>
+        </w:rPr>
+        <w:t>SenderCity</w:t>
+      </w:r>
+      <w:proofErr w:type="spellEnd"/>
+      <w:r>
+        <w:rPr>
+          <w:rFonts w:ascii="Arial" w:hAnsi="Arial" w:cs="Arial"/>
+          <w:bCs/>
+        </w:rPr>
+        <w:t>}</w:t>
       </w:r>
     </w:p>
     <w:p>
@@ -166,6 +224,7 @@
                     </w:rPr>
                     <w:t>{#</w:t>
                   </w:r>
+                  <w:proofErr w:type="gramStart"/>
                   <w:r>
                     <w:rPr>
                       <w:rFonts w:ascii="Arial" w:hAnsi="Arial" w:cs="Arial"/>
@@ -189,7 +248,31 @@
                       <w:sz w:val="16"/>
                       <w:szCs w:val="16"/>
                     </w:rPr>
-                    <w:t>{%DemisIdQrImage}</w:t>
+                    <w:t>{</w:t>
+                  </w:r>
+                  <w:proofErr w:type="gramEnd"/>
+                  <w:r>
+                    <w:rPr>
+                      <w:sz w:val="16"/>
+                      <w:szCs w:val="16"/>
+                    </w:rPr>
+                    <w:t>%</w:t>
+                  </w:r>
+                  <w:proofErr w:type="spellStart"/>
+                  <w:r>
+                    <w:rPr>
+                      <w:sz w:val="16"/>
+                      <w:szCs w:val="16"/>
+                    </w:rPr>
+                    <w:t>DemisIdQrImage</w:t>
+                  </w:r>
+                  <w:proofErr w:type="spellEnd"/>
+                  <w:r>
+                    <w:rPr>
+                      <w:sz w:val="16"/>
+                      <w:szCs w:val="16"/>
+                    </w:rPr>
+                    <w:t>}</w:t>
                   </w:r>
                 </w:p>
                 <w:p>
@@ -225,6 +308,7 @@
                     </w:rPr>
                     <w:t>/</w:t>
                   </w:r>
+                  <w:proofErr w:type="spellStart"/>
                   <w:r>
                     <w:rPr>
                       <w:rFonts w:ascii="Arial" w:hAnsi="Arial" w:cs="Arial"/>
@@ -234,6 +318,7 @@
                     </w:rPr>
                     <w:t>DemisIdQrImage</w:t>
                   </w:r>
+                  <w:proofErr w:type="spellEnd"/>
                   <w:r>
                     <w:rPr>
                       <w:rFonts w:ascii="Arial" w:hAnsi="Arial" w:cs="Arial"/>
@@ -280,7 +365,31 @@
           <w:sz w:val="28"/>
           <w:szCs w:val="28"/>
         </w:rPr>
-        <w:t>{LaboratoryNumber}</w:t>
+        <w:t>{</w:t>
+      </w:r>
+      <w:proofErr w:type="spellStart"/>
+      <w:r>
+        <w:rPr>
+          <w:rFonts w:ascii="Arial" w:hAnsi="Arial" w:cs="Arial"/>
+          <w:b/>
+          <w:bCs/>
+          <w:color w:val="000000"/>
+          <w:sz w:val="28"/>
+          <w:szCs w:val="28"/>
+        </w:rPr>
+        <w:t>LaboratoryNumber</w:t>
+      </w:r>
+      <w:proofErr w:type="spellEnd"/>
+      <w:r>
+        <w:rPr>
+          <w:rFonts w:ascii="Arial" w:hAnsi="Arial" w:cs="Arial"/>
+          <w:b/>
+          <w:bCs/>
+          <w:color w:val="000000"/>
+          <w:sz w:val="28"/>
+          <w:szCs w:val="28"/>
+        </w:rPr>
+        <w:t>}</w:t>
       </w:r>
       <w:r>
         <w:rPr>
@@ -379,6 +488,7 @@
               </w:rPr>
               <w:t xml:space="preserve">Labor-Nr. des </w:t>
             </w:r>
+            <w:proofErr w:type="spellStart"/>
             <w:r>
               <w:rPr>
                 <w:rFonts w:ascii="Arial" w:hAnsi="Arial" w:cs="Arial"/>
@@ -388,6 +498,7 @@
               </w:rPr>
               <w:t>NRZMHi</w:t>
             </w:r>
+            <w:proofErr w:type="spellEnd"/>
             <w:r>
               <w:rPr>
                 <w:rFonts w:ascii="Arial" w:hAnsi="Arial" w:cs="Arial"/>
@@ -437,7 +548,27 @@
                 <w:sz w:val="16"/>
                 <w:szCs w:val="16"/>
               </w:rPr>
-              <w:t>{LaboratoryNumber}</w:t>
+              <w:t>{</w:t>
+            </w:r>
+            <w:proofErr w:type="spellStart"/>
+            <w:r>
+              <w:rPr>
+                <w:rFonts w:ascii="Arial" w:hAnsi="Arial" w:cs="Arial"/>
+                <w:color w:val="000000"/>
+                <w:sz w:val="16"/>
+                <w:szCs w:val="16"/>
+              </w:rPr>
+              <w:t>LaboratoryNumber</w:t>
+            </w:r>
+            <w:proofErr w:type="spellEnd"/>
+            <w:r>
+              <w:rPr>
+                <w:rFonts w:ascii="Arial" w:hAnsi="Arial" w:cs="Arial"/>
+                <w:color w:val="000000"/>
+                <w:sz w:val="16"/>
+                <w:szCs w:val="16"/>
+              </w:rPr>
+              <w:t>}</w:t>
             </w:r>
           </w:p>
         </w:tc>
@@ -508,7 +639,27 @@
                 <w:sz w:val="16"/>
                 <w:szCs w:val="16"/>
               </w:rPr>
-              <w:t>{SamplingLocation}</w:t>
+              <w:t>{</w:t>
+            </w:r>
+            <w:proofErr w:type="spellStart"/>
+            <w:r>
+              <w:rPr>
+                <w:rFonts w:ascii="Arial" w:hAnsi="Arial" w:cs="Arial"/>
+                <w:color w:val="000000"/>
+                <w:sz w:val="16"/>
+                <w:szCs w:val="16"/>
+              </w:rPr>
+              <w:t>SamplingLocation</w:t>
+            </w:r>
+            <w:proofErr w:type="spellEnd"/>
+            <w:r>
+              <w:rPr>
+                <w:rFonts w:ascii="Arial" w:hAnsi="Arial" w:cs="Arial"/>
+                <w:color w:val="000000"/>
+                <w:sz w:val="16"/>
+                <w:szCs w:val="16"/>
+              </w:rPr>
+              <w:t>}</w:t>
             </w:r>
           </w:p>
         </w:tc>
@@ -579,7 +730,27 @@
                 <w:sz w:val="16"/>
                 <w:szCs w:val="16"/>
               </w:rPr>
-              <w:t>{SamplingDate}</w:t>
+              <w:t>{</w:t>
+            </w:r>
+            <w:proofErr w:type="spellStart"/>
+            <w:r>
+              <w:rPr>
+                <w:rFonts w:ascii="Arial" w:hAnsi="Arial" w:cs="Arial"/>
+                <w:color w:val="000000"/>
+                <w:sz w:val="16"/>
+                <w:szCs w:val="16"/>
+              </w:rPr>
+              <w:t>SamplingDate</w:t>
+            </w:r>
+            <w:proofErr w:type="spellEnd"/>
+            <w:r>
+              <w:rPr>
+                <w:rFonts w:ascii="Arial" w:hAnsi="Arial" w:cs="Arial"/>
+                <w:color w:val="000000"/>
+                <w:sz w:val="16"/>
+                <w:szCs w:val="16"/>
+              </w:rPr>
+              <w:t>}</w:t>
             </w:r>
           </w:p>
         </w:tc>
@@ -650,7 +821,27 @@
                 <w:sz w:val="16"/>
                 <w:szCs w:val="16"/>
               </w:rPr>
-              <w:t>{ReceivingDate}</w:t>
+              <w:t>{</w:t>
+            </w:r>
+            <w:proofErr w:type="spellStart"/>
+            <w:r>
+              <w:rPr>
+                <w:rFonts w:ascii="Arial" w:hAnsi="Arial" w:cs="Arial"/>
+                <w:color w:val="000000"/>
+                <w:sz w:val="16"/>
+                <w:szCs w:val="16"/>
+              </w:rPr>
+              <w:t>ReceivingDate</w:t>
+            </w:r>
+            <w:proofErr w:type="spellEnd"/>
+            <w:r>
+              <w:rPr>
+                <w:rFonts w:ascii="Arial" w:hAnsi="Arial" w:cs="Arial"/>
+                <w:color w:val="000000"/>
+                <w:sz w:val="16"/>
+                <w:szCs w:val="16"/>
+              </w:rPr>
+              <w:t>}</w:t>
             </w:r>
           </w:p>
         </w:tc>
@@ -810,7 +1001,27 @@
                 <w:sz w:val="16"/>
                 <w:szCs w:val="16"/>
               </w:rPr>
-              <w:t>{PatientBirthDate}</w:t>
+              <w:t>{</w:t>
+            </w:r>
+            <w:proofErr w:type="spellStart"/>
+            <w:r>
+              <w:rPr>
+                <w:rFonts w:ascii="Arial" w:hAnsi="Arial" w:cs="Arial"/>
+                <w:color w:val="000000"/>
+                <w:sz w:val="16"/>
+                <w:szCs w:val="16"/>
+              </w:rPr>
+              <w:t>PatientBirthDate</w:t>
+            </w:r>
+            <w:proofErr w:type="spellEnd"/>
+            <w:r>
+              <w:rPr>
+                <w:rFonts w:ascii="Arial" w:hAnsi="Arial" w:cs="Arial"/>
+                <w:color w:val="000000"/>
+                <w:sz w:val="16"/>
+                <w:szCs w:val="16"/>
+              </w:rPr>
+              <w:t>}</w:t>
             </w:r>
           </w:p>
         </w:tc>
@@ -881,7 +1092,27 @@
                 <w:sz w:val="16"/>
                 <w:szCs w:val="16"/>
               </w:rPr>
-              <w:t>{SenderLaboratoryNumber}</w:t>
+              <w:t>{</w:t>
+            </w:r>
+            <w:proofErr w:type="spellStart"/>
+            <w:r>
+              <w:rPr>
+                <w:rFonts w:ascii="Arial" w:hAnsi="Arial" w:cs="Arial"/>
+                <w:color w:val="000000"/>
+                <w:sz w:val="16"/>
+                <w:szCs w:val="16"/>
+              </w:rPr>
+              <w:t>SenderLaboratoryNumber</w:t>
+            </w:r>
+            <w:proofErr w:type="spellEnd"/>
+            <w:r>
+              <w:rPr>
+                <w:rFonts w:ascii="Arial" w:hAnsi="Arial" w:cs="Arial"/>
+                <w:color w:val="000000"/>
+                <w:sz w:val="16"/>
+                <w:szCs w:val="16"/>
+              </w:rPr>
+              <w:t>}</w:t>
             </w:r>
           </w:p>
         </w:tc>
@@ -1069,7 +1300,33 @@
                 <w:sz w:val="22"/>
                 <w:szCs w:val="22"/>
               </w:rPr>
-              <w:t>{EvaluationString}</w:t>
+              <w:t>{</w:t>
+            </w:r>
+            <w:proofErr w:type="spellStart"/>
+            <w:r>
+              <w:rPr>
+                <w:rFonts w:ascii="Arial" w:hAnsi="Arial" w:cs="Arial"/>
+                <w:b/>
+                <w:bCs/>
+                <w:i/>
+                <w:iCs/>
+                <w:sz w:val="22"/>
+                <w:szCs w:val="22"/>
+              </w:rPr>
+              <w:t>EvaluationString</w:t>
+            </w:r>
+            <w:proofErr w:type="spellEnd"/>
+            <w:r>
+              <w:rPr>
+                <w:rFonts w:ascii="Arial" w:hAnsi="Arial" w:cs="Arial"/>
+                <w:b/>
+                <w:bCs/>
+                <w:i/>
+                <w:iCs/>
+                <w:sz w:val="22"/>
+                <w:szCs w:val="22"/>
+              </w:rPr>
+              <w:t>}</w:t>
             </w:r>
           </w:p>
         </w:tc>
@@ -1186,7 +1443,31 @@
                 <w:sz w:val="22"/>
                 <w:szCs w:val="22"/>
               </w:rPr>
-              <w:t>{AgglutinationString}</w:t>
+              <w:t>{</w:t>
+            </w:r>
+            <w:proofErr w:type="spellStart"/>
+            <w:r>
+              <w:rPr>
+                <w:rFonts w:ascii="Arial" w:hAnsi="Arial" w:cs="Arial"/>
+                <w:b/>
+                <w:bCs/>
+                <w:color w:val="000000"/>
+                <w:sz w:val="22"/>
+                <w:szCs w:val="22"/>
+              </w:rPr>
+              <w:t>AgglutinationString</w:t>
+            </w:r>
+            <w:proofErr w:type="spellEnd"/>
+            <w:r>
+              <w:rPr>
+                <w:rFonts w:ascii="Arial" w:hAnsi="Arial" w:cs="Arial"/>
+                <w:b/>
+                <w:bCs/>
+                <w:color w:val="000000"/>
+                <w:sz w:val="22"/>
+                <w:szCs w:val="22"/>
+              </w:rPr>
+              <w:t>}</w:t>
             </w:r>
           </w:p>
         </w:tc>
@@ -1290,7 +1571,20 @@
                       <w:sz w:val="12"/>
                       <w:szCs w:val="22"/>
                     </w:rPr>
-                    <w:t>{#Typings}</w:t>
+                    <w:t>{#</w:t>
+                  </w:r>
+                  <w:proofErr w:type="gramStart"/>
+                  <w:r>
+                    <w:rPr>
+                      <w:rFonts w:ascii="Arial" w:hAnsi="Arial" w:cs="Arial"/>
+                      <w:b/>
+                      <w:bCs/>
+                      <w:i/>
+                      <w:iCs/>
+                      <w:sz w:val="12"/>
+                      <w:szCs w:val="22"/>
+                    </w:rPr>
+                    <w:t>Typings}</w:t>
                   </w:r>
                   <w:r>
                     <w:rPr>
@@ -1302,7 +1596,20 @@
                       <w:sz w:val="22"/>
                       <w:szCs w:val="22"/>
                     </w:rPr>
-                    <w:t>{Attribute}</w:t>
+                    <w:t>{</w:t>
+                  </w:r>
+                  <w:proofErr w:type="gramEnd"/>
+                  <w:r>
+                    <w:rPr>
+                      <w:rFonts w:ascii="Arial" w:hAnsi="Arial" w:cs="Arial"/>
+                      <w:b/>
+                      <w:bCs/>
+                      <w:i/>
+                      <w:iCs/>
+                      <w:sz w:val="22"/>
+                      <w:szCs w:val="22"/>
+                    </w:rPr>
+                    <w:t>Attribute}</w:t>
                   </w:r>
                   <w:r>
                     <w:rPr>
@@ -1358,6 +1665,7 @@
                     </w:rPr>
                     <w:t>{/</w:t>
                   </w:r>
+                  <w:proofErr w:type="spellStart"/>
                   <w:r>
                     <w:rPr>
                       <w:rFonts w:ascii="Arial" w:hAnsi="Arial" w:cs="Arial"/>
@@ -1370,6 +1678,7 @@
                     </w:rPr>
                     <w:t>Typings</w:t>
                   </w:r>
+                  <w:proofErr w:type="spellEnd"/>
                   <w:r>
                     <w:rPr>
                       <w:rFonts w:ascii="Arial" w:hAnsi="Arial" w:cs="Arial"/>
@@ -1462,7 +1771,25 @@
           <w:bCs/>
           <w:color w:val="000000"/>
         </w:rPr>
-        <w:t>{InterpretationDisclaimer}</w:t>
+        <w:t>{</w:t>
+      </w:r>
+      <w:proofErr w:type="spellStart"/>
+      <w:r>
+        <w:rPr>
+          <w:rFonts w:ascii="Arial" w:hAnsi="Arial" w:cs="Arial"/>
+          <w:bCs/>
+          <w:color w:val="000000"/>
+        </w:rPr>
+        <w:t>InterpretationDisclaimer</w:t>
+      </w:r>
+      <w:proofErr w:type="spellEnd"/>
+      <w:r>
+        <w:rPr>
+          <w:rFonts w:ascii="Arial" w:hAnsi="Arial" w:cs="Arial"/>
+          <w:bCs/>
+          <w:color w:val="000000"/>
+        </w:rPr>
+        <w:t>}</w:t>
       </w:r>
     </w:p>
     <w:p>
@@ -1637,8 +1964,21 @@
                 <w:sz w:val="22"/>
                 <w:szCs w:val="22"/>
               </w:rPr>
-              <w:t>-Laktamase</w:t>
-            </w:r>
+              <w:t>-</w:t>
+            </w:r>
+            <w:proofErr w:type="spellStart"/>
+            <w:r>
+              <w:rPr>
+                <w:rFonts w:ascii="Arial" w:hAnsi="Arial" w:cs="Arial"/>
+                <w:b/>
+                <w:bCs/>
+                <w:iCs/>
+                <w:sz w:val="22"/>
+                <w:szCs w:val="22"/>
+              </w:rPr>
+              <w:t>Laktamase</w:t>
+            </w:r>
+            <w:proofErr w:type="spellEnd"/>
           </w:p>
         </w:tc>
         <w:tc>
@@ -1669,6 +2009,7 @@
               </w:rPr>
               <w:t>{</w:t>
             </w:r>
+            <w:proofErr w:type="spellStart"/>
             <w:r>
               <w:rPr>
                 <w:rFonts w:ascii="Arial" w:hAnsi="Arial" w:cs="Arial"/>
@@ -1680,6 +2021,7 @@
               </w:rPr>
               <w:t>BetalactamaseString</w:t>
             </w:r>
+            <w:proofErr w:type="spellEnd"/>
             <w:r>
               <w:rPr>
                 <w:rFonts w:ascii="Arial" w:hAnsi="Arial" w:cs="Arial"/>
@@ -1905,8 +2247,9 @@
                 <w:sz w:val="22"/>
                 <w:szCs w:val="22"/>
               </w:rPr>
-              <w:t>{#ETests}{Antibiotic}</w:t>
-            </w:r>
+              <w:t>{#</w:t>
+            </w:r>
+            <w:proofErr w:type="gramStart"/>
             <w:r>
               <w:rPr>
                 <w:rFonts w:ascii="Arial" w:hAnsi="Arial" w:cs="Arial"/>
@@ -1916,8 +2259,44 @@
                 <w:sz w:val="22"/>
                 <w:szCs w:val="22"/>
               </w:rPr>
-              <w:t xml:space="preserve"> Etest</w:t>
-            </w:r>
+              <w:t>ETests}{</w:t>
+            </w:r>
+            <w:proofErr w:type="gramEnd"/>
+            <w:r>
+              <w:rPr>
+                <w:rFonts w:ascii="Arial" w:hAnsi="Arial" w:cs="Arial"/>
+                <w:b/>
+                <w:bCs/>
+                <w:iCs/>
+                <w:sz w:val="22"/>
+                <w:szCs w:val="22"/>
+              </w:rPr>
+              <w:t>Antibiotic}</w:t>
+            </w:r>
+            <w:r>
+              <w:rPr>
+                <w:rFonts w:ascii="Arial" w:hAnsi="Arial" w:cs="Arial"/>
+                <w:b/>
+                <w:bCs/>
+                <w:iCs/>
+                <w:sz w:val="22"/>
+                <w:szCs w:val="22"/>
+              </w:rPr>
+              <w:t xml:space="preserve"> </w:t>
+            </w:r>
+            <w:proofErr w:type="spellStart"/>
+            <w:r>
+              <w:rPr>
+                <w:rFonts w:ascii="Arial" w:hAnsi="Arial" w:cs="Arial"/>
+                <w:b/>
+                <w:bCs/>
+                <w:iCs/>
+                <w:sz w:val="22"/>
+                <w:szCs w:val="22"/>
+              </w:rPr>
+              <w:t>Etest</w:t>
+            </w:r>
+            <w:proofErr w:type="spellEnd"/>
           </w:p>
         </w:tc>
         <w:tc>
@@ -1966,7 +2345,31 @@
                 <w:sz w:val="22"/>
                 <w:szCs w:val="22"/>
               </w:rPr>
-              <w:t>{Result}</w:t>
+              <w:t>{</w:t>
+            </w:r>
+            <w:proofErr w:type="spellStart"/>
+            <w:r>
+              <w:rPr>
+                <w:rFonts w:ascii="Arial" w:hAnsi="Arial" w:cs="Arial"/>
+                <w:b/>
+                <w:bCs/>
+                <w:color w:val="000000"/>
+                <w:sz w:val="22"/>
+                <w:szCs w:val="22"/>
+              </w:rPr>
+              <w:t>Result</w:t>
+            </w:r>
+            <w:proofErr w:type="spellEnd"/>
+            <w:r>
+              <w:rPr>
+                <w:rFonts w:ascii="Arial" w:hAnsi="Arial" w:cs="Arial"/>
+                <w:b/>
+                <w:bCs/>
+                <w:color w:val="000000"/>
+                <w:sz w:val="22"/>
+                <w:szCs w:val="22"/>
+              </w:rPr>
+              <w:t>}</w:t>
             </w:r>
           </w:p>
         </w:tc>
@@ -1995,7 +2398,31 @@
                 <w:sz w:val="22"/>
                 <w:szCs w:val="22"/>
               </w:rPr>
-              <w:t>≤{MicBreakpointSusceptible}</w:t>
+              <w:t>≤{</w:t>
+            </w:r>
+            <w:proofErr w:type="spellStart"/>
+            <w:r>
+              <w:rPr>
+                <w:rFonts w:ascii="Arial" w:hAnsi="Arial" w:cs="Arial"/>
+                <w:b/>
+                <w:bCs/>
+                <w:color w:val="000000"/>
+                <w:sz w:val="22"/>
+                <w:szCs w:val="22"/>
+              </w:rPr>
+              <w:t>MicBreakpointSusceptible</w:t>
+            </w:r>
+            <w:proofErr w:type="spellEnd"/>
+            <w:r>
+              <w:rPr>
+                <w:rFonts w:ascii="Arial" w:hAnsi="Arial" w:cs="Arial"/>
+                <w:b/>
+                <w:bCs/>
+                <w:color w:val="000000"/>
+                <w:sz w:val="22"/>
+                <w:szCs w:val="22"/>
+              </w:rPr>
+              <w:t>}</w:t>
             </w:r>
             <w:r>
               <w:rPr>
@@ -2038,7 +2465,33 @@
                 <w:szCs w:val="22"/>
                 <w:lang w:val="en-US"/>
               </w:rPr>
-              <w:t>&gt;{MicBreakpointResistent} µg/ml</w:t>
+              <w:t>&gt;{</w:t>
+            </w:r>
+            <w:proofErr w:type="spellStart"/>
+            <w:r>
+              <w:rPr>
+                <w:rFonts w:ascii="Arial" w:hAnsi="Arial" w:cs="Arial"/>
+                <w:b/>
+                <w:bCs/>
+                <w:color w:val="000000"/>
+                <w:sz w:val="22"/>
+                <w:szCs w:val="22"/>
+                <w:lang w:val="en-US"/>
+              </w:rPr>
+              <w:t>MicBreakpointResistent</w:t>
+            </w:r>
+            <w:proofErr w:type="spellEnd"/>
+            <w:r>
+              <w:rPr>
+                <w:rFonts w:ascii="Arial" w:hAnsi="Arial" w:cs="Arial"/>
+                <w:b/>
+                <w:bCs/>
+                <w:color w:val="000000"/>
+                <w:sz w:val="22"/>
+                <w:szCs w:val="22"/>
+                <w:lang w:val="en-US"/>
+              </w:rPr>
+              <w:t>} µg/ml</w:t>
             </w:r>
           </w:p>
         </w:tc>
@@ -2058,6 +2511,7 @@
                 <w:lang w:val="en-US"/>
               </w:rPr>
             </w:pPr>
+            <w:proofErr w:type="gramStart"/>
             <w:r>
               <w:rPr>
                 <w:rFonts w:ascii="Arial" w:hAnsi="Arial" w:cs="Arial"/>
@@ -2070,6 +2524,7 @@
               </w:rPr>
               <w:t>{</w:t>
             </w:r>
+            <w:proofErr w:type="spellStart"/>
             <w:r>
               <w:rPr>
                 <w:rFonts w:ascii="Arial" w:hAnsi="Arial" w:cs="Arial"/>
@@ -2082,6 +2537,7 @@
               </w:rPr>
               <w:t>ValidFromYear</w:t>
             </w:r>
+            <w:proofErr w:type="spellEnd"/>
             <w:r>
               <w:rPr>
                 <w:rFonts w:ascii="Arial" w:hAnsi="Arial" w:cs="Arial"/>
@@ -2104,7 +2560,34 @@
                 <w:szCs w:val="22"/>
                 <w:lang w:val="en-US"/>
               </w:rPr>
-              <w:t>{/ETests}</w:t>
+              <w:t>{/</w:t>
+            </w:r>
+            <w:proofErr w:type="spellStart"/>
+            <w:proofErr w:type="gramEnd"/>
+            <w:r>
+              <w:rPr>
+                <w:rFonts w:ascii="Arial" w:hAnsi="Arial" w:cs="Arial"/>
+                <w:b/>
+                <w:bCs/>
+                <w:color w:val="000000"/>
+                <w:sz w:val="22"/>
+                <w:szCs w:val="22"/>
+                <w:lang w:val="en-US"/>
+              </w:rPr>
+              <w:t>ETests</w:t>
+            </w:r>
+            <w:proofErr w:type="spellEnd"/>
+            <w:r>
+              <w:rPr>
+                <w:rFonts w:ascii="Arial" w:hAnsi="Arial" w:cs="Arial"/>
+                <w:b/>
+                <w:bCs/>
+                <w:color w:val="000000"/>
+                <w:sz w:val="22"/>
+                <w:szCs w:val="22"/>
+                <w:lang w:val="en-US"/>
+              </w:rPr>
+              <w:t>}</w:t>
             </w:r>
           </w:p>
         </w:tc>
@@ -2177,7 +2660,24 @@
           <w:color w:val="000000"/>
         </w:rPr>
         <w:noBreakHyphen/>
-        <w:t xml:space="preserve">Laktamase negatives Ampicillin-resistentes (BLNAR) Isolat. BLNAR </w:t>
+      </w:r>
+      <w:proofErr w:type="spellStart"/>
+      <w:r>
+        <w:rPr>
+          <w:rFonts w:ascii="Arial" w:hAnsi="Arial" w:cs="Arial"/>
+          <w:bCs/>
+          <w:color w:val="000000"/>
+        </w:rPr>
+        <w:t>Laktamase</w:t>
+      </w:r>
+      <w:proofErr w:type="spellEnd"/>
+      <w:r>
+        <w:rPr>
+          <w:rFonts w:ascii="Arial" w:hAnsi="Arial" w:cs="Arial"/>
+          <w:bCs/>
+          <w:color w:val="000000"/>
+        </w:rPr>
+        <w:t xml:space="preserve"> negatives Ampicillin-resistentes (BLNAR) Isolat. BLNAR </w:t>
       </w:r>
       <w:r>
         <w:rPr>
@@ -2204,7 +2704,42 @@
           <w:color w:val="000000"/>
         </w:rPr>
         <w:noBreakHyphen/>
-        <w:t>Lactamase-unabhängigen Resistenzmechanismus auf, welcher durch Mutation des Zellwandproteins PBP3 hervorgerufen wird. Sie sind resistent gegen Ampicillin/Sulbactam sowie Amoxicillin/Clavulansäure und könnten eine verminderte Sensibilität gegen Cephalosporine aufweisen</w:t>
+      </w:r>
+      <w:proofErr w:type="spellStart"/>
+      <w:r>
+        <w:rPr>
+          <w:rFonts w:ascii="Arial" w:hAnsi="Arial" w:cs="Arial"/>
+          <w:bCs/>
+          <w:color w:val="000000"/>
+        </w:rPr>
+        <w:t>Lactamase</w:t>
+      </w:r>
+      <w:proofErr w:type="spellEnd"/>
+      <w:r>
+        <w:rPr>
+          <w:rFonts w:ascii="Arial" w:hAnsi="Arial" w:cs="Arial"/>
+          <w:bCs/>
+          <w:color w:val="000000"/>
+        </w:rPr>
+        <w:t>-unabhängigen Resistenzmechanismus auf, welcher durch Mutation des Zellwandproteins PBP3 hervorgerufen wird. Sie sind resistent gegen Ampicillin/</w:t>
+      </w:r>
+      <w:proofErr w:type="spellStart"/>
+      <w:r>
+        <w:rPr>
+          <w:rFonts w:ascii="Arial" w:hAnsi="Arial" w:cs="Arial"/>
+          <w:bCs/>
+          <w:color w:val="000000"/>
+        </w:rPr>
+        <w:t>Sulbactam</w:t>
+      </w:r>
+      <w:proofErr w:type="spellEnd"/>
+      <w:r>
+        <w:rPr>
+          <w:rFonts w:ascii="Arial" w:hAnsi="Arial" w:cs="Arial"/>
+          <w:bCs/>
+          <w:color w:val="000000"/>
+        </w:rPr>
+        <w:t xml:space="preserve"> sowie Amoxicillin/Clavulansäure und könnten eine verminderte Sensibilität gegen Cephalosporine aufweisen</w:t>
       </w:r>
       <w:r>
         <w:rPr>
@@ -2288,12 +2823,21 @@
           <w:lang w:val="en-US"/>
         </w:rPr>
       </w:pPr>
-      <w:r>
-        <w:rPr>
-          <w:rFonts w:ascii="Arial" w:hAnsi="Arial" w:cs="Arial"/>
-          <w:lang w:val="en-US"/>
-        </w:rPr>
-        <w:t>Literatur:</w:t>
+      <w:proofErr w:type="spellStart"/>
+      <w:r>
+        <w:rPr>
+          <w:rFonts w:ascii="Arial" w:hAnsi="Arial" w:cs="Arial"/>
+          <w:lang w:val="en-US"/>
+        </w:rPr>
+        <w:t>Literatur</w:t>
+      </w:r>
+      <w:proofErr w:type="spellEnd"/>
+      <w:r>
+        <w:rPr>
+          <w:rFonts w:ascii="Arial" w:hAnsi="Arial" w:cs="Arial"/>
+          <w:lang w:val="en-US"/>
+        </w:rPr>
+        <w:t>:</w:t>
       </w:r>
     </w:p>
     <w:p>
@@ -2308,19 +2852,39 @@
         <w:spacing w:before="93"/>
         <w:rPr>
           <w:rFonts w:ascii="Arial" w:hAnsi="Arial" w:cs="Arial"/>
-          <w:sz w:val="20"/>
-          <w:szCs w:val="20"/>
+          <w:sz w:val="18"/>
+          <w:szCs w:val="18"/>
           <w:lang w:val="en-US"/>
         </w:rPr>
       </w:pPr>
       <w:r>
         <w:rPr>
           <w:rFonts w:ascii="Arial" w:hAnsi="Arial" w:cs="Arial"/>
-          <w:sz w:val="20"/>
-          <w:szCs w:val="20"/>
+          <w:sz w:val="18"/>
+          <w:szCs w:val="18"/>
           <w:lang w:val="en-GB"/>
         </w:rPr>
-        <w:t>1. Tristram S, Jacobs MR, Appelbaum PC. Antimicrobial resistance in Haemophilus influenzae. Clin Microbiol Rev. 2007 Apr;20(2):368-89.</w:t>
+        <w:t xml:space="preserve">1. Tristram S, Jacobs MR, Appelbaum PC. Antimicrobial resistance in Haemophilus influenzae. Clin </w:t>
+      </w:r>
+      <w:proofErr w:type="spellStart"/>
+      <w:r>
+        <w:rPr>
+          <w:rFonts w:ascii="Arial" w:hAnsi="Arial" w:cs="Arial"/>
+          <w:sz w:val="18"/>
+          <w:szCs w:val="18"/>
+          <w:lang w:val="en-GB"/>
+        </w:rPr>
+        <w:t>Microbiol</w:t>
+      </w:r>
+      <w:proofErr w:type="spellEnd"/>
+      <w:r>
+        <w:rPr>
+          <w:rFonts w:ascii="Arial" w:hAnsi="Arial" w:cs="Arial"/>
+          <w:sz w:val="18"/>
+          <w:szCs w:val="18"/>
+          <w:lang w:val="en-GB"/>
+        </w:rPr>
+        <w:t xml:space="preserve"> Rev. 2007 Apr;20(2):368-89.</w:t>
       </w:r>
     </w:p>
     <w:p>
@@ -2335,36 +2899,127 @@
         <w:spacing w:before="93"/>
         <w:rPr>
           <w:rFonts w:ascii="Arial" w:hAnsi="Arial" w:cs="Arial"/>
-          <w:sz w:val="20"/>
-          <w:szCs w:val="20"/>
+          <w:sz w:val="18"/>
+          <w:szCs w:val="18"/>
           <w:lang w:val="en-US"/>
         </w:rPr>
       </w:pPr>
       <w:r>
         <w:rPr>
           <w:rFonts w:ascii="Arial" w:hAnsi="Arial" w:cs="Arial"/>
-          <w:sz w:val="20"/>
-          <w:szCs w:val="20"/>
+          <w:sz w:val="18"/>
+          <w:szCs w:val="18"/>
           <w:lang w:val="en-US"/>
         </w:rPr>
         <w:t>2.</w:t>
       </w:r>
       <w:r>
         <w:rPr>
-          <w:sz w:val="20"/>
-          <w:szCs w:val="20"/>
+          <w:sz w:val="18"/>
+          <w:szCs w:val="18"/>
           <w:lang w:val="en-US"/>
         </w:rPr>
         <w:t xml:space="preserve"> </w:t>
       </w:r>
-      <w:r>
-        <w:rPr>
-          <w:rFonts w:ascii="Arial" w:hAnsi="Arial" w:cs="Arial"/>
-          <w:sz w:val="20"/>
-          <w:szCs w:val="20"/>
-          <w:lang w:val="en-US"/>
-        </w:rPr>
-        <w:t>Ubukata K, Shibasaki Y, Yamamoto K, Chiba N, Hasegawa K, Takeuchi Y, Sunakawa K, Inoue M, Konno M. Association of amino acid substitutions in penicillin-binding protein 3 with beta-lactam resistance in beta-lactamase-negative ampicillin-resistant Haemophilus influenzae. Antimicrob Agents Chemother. 2001 45(6):1693-9.</w:t>
+      <w:proofErr w:type="spellStart"/>
+      <w:r>
+        <w:rPr>
+          <w:rFonts w:ascii="Arial" w:hAnsi="Arial" w:cs="Arial"/>
+          <w:sz w:val="18"/>
+          <w:szCs w:val="18"/>
+          <w:lang w:val="en-US"/>
+        </w:rPr>
+        <w:t>Ubukata</w:t>
+      </w:r>
+      <w:proofErr w:type="spellEnd"/>
+      <w:r>
+        <w:rPr>
+          <w:rFonts w:ascii="Arial" w:hAnsi="Arial" w:cs="Arial"/>
+          <w:sz w:val="18"/>
+          <w:szCs w:val="18"/>
+          <w:lang w:val="en-US"/>
+        </w:rPr>
+        <w:t xml:space="preserve"> K, Shibasaki Y, Yamamoto K, Chiba N, Hasegawa K, Takeuchi Y, </w:t>
+      </w:r>
+      <w:proofErr w:type="spellStart"/>
+      <w:r>
+        <w:rPr>
+          <w:rFonts w:ascii="Arial" w:hAnsi="Arial" w:cs="Arial"/>
+          <w:sz w:val="18"/>
+          <w:szCs w:val="18"/>
+          <w:lang w:val="en-US"/>
+        </w:rPr>
+        <w:t>Sunakawa</w:t>
+      </w:r>
+      <w:proofErr w:type="spellEnd"/>
+      <w:r>
+        <w:rPr>
+          <w:rFonts w:ascii="Arial" w:hAnsi="Arial" w:cs="Arial"/>
+          <w:sz w:val="18"/>
+          <w:szCs w:val="18"/>
+          <w:lang w:val="en-US"/>
+        </w:rPr>
+        <w:t xml:space="preserve"> K, Inoue M, Konno M. Association of amino acid substitutions in penicillin-binding protein 3 with beta-lactam resistance in beta-lactamase-negative ampicillin-resistant </w:t>
+      </w:r>
+      <w:proofErr w:type="spellStart"/>
+      <w:r>
+        <w:rPr>
+          <w:rFonts w:ascii="Arial" w:hAnsi="Arial" w:cs="Arial"/>
+          <w:sz w:val="18"/>
+          <w:szCs w:val="18"/>
+          <w:lang w:val="en-US"/>
+        </w:rPr>
+        <w:t>Haemophilus</w:t>
+      </w:r>
+      <w:proofErr w:type="spellEnd"/>
+      <w:r>
+        <w:rPr>
+          <w:rFonts w:ascii="Arial" w:hAnsi="Arial" w:cs="Arial"/>
+          <w:sz w:val="18"/>
+          <w:szCs w:val="18"/>
+          <w:lang w:val="en-US"/>
+        </w:rPr>
+        <w:t xml:space="preserve"> influenzae. </w:t>
+      </w:r>
+      <w:proofErr w:type="spellStart"/>
+      <w:r>
+        <w:rPr>
+          <w:rFonts w:ascii="Arial" w:hAnsi="Arial" w:cs="Arial"/>
+          <w:sz w:val="18"/>
+          <w:szCs w:val="18"/>
+          <w:lang w:val="en-US"/>
+        </w:rPr>
+        <w:t>Antimicrob</w:t>
+      </w:r>
+      <w:proofErr w:type="spellEnd"/>
+      <w:r>
+        <w:rPr>
+          <w:rFonts w:ascii="Arial" w:hAnsi="Arial" w:cs="Arial"/>
+          <w:sz w:val="18"/>
+          <w:szCs w:val="18"/>
+          <w:lang w:val="en-US"/>
+        </w:rPr>
+        <w:t xml:space="preserve"> Agents </w:t>
+      </w:r>
+      <w:proofErr w:type="spellStart"/>
+      <w:r>
+        <w:rPr>
+          <w:rFonts w:ascii="Arial" w:hAnsi="Arial" w:cs="Arial"/>
+          <w:sz w:val="18"/>
+          <w:szCs w:val="18"/>
+          <w:lang w:val="en-US"/>
+        </w:rPr>
+        <w:t>Chemother</w:t>
+      </w:r>
+      <w:proofErr w:type="spellEnd"/>
+      <w:r>
+        <w:rPr>
+          <w:rFonts w:ascii="Arial" w:hAnsi="Arial" w:cs="Arial"/>
+          <w:sz w:val="18"/>
+          <w:szCs w:val="18"/>
+          <w:lang w:val="en-US"/>
+        </w:rPr>
+        <w:t>. 2001 45(6):1693-9.</w:t>
       </w:r>
     </w:p>
     <w:p>
@@ -2379,15 +3034,15 @@
         <w:spacing w:before="93"/>
         <w:rPr>
           <w:rFonts w:ascii="Arial" w:hAnsi="Arial" w:cs="Arial"/>
-          <w:sz w:val="20"/>
-          <w:szCs w:val="20"/>
+          <w:sz w:val="18"/>
+          <w:szCs w:val="18"/>
         </w:rPr>
       </w:pPr>
       <w:r>
         <w:rPr>
           <w:rFonts w:ascii="Arial" w:hAnsi="Arial" w:cs="Arial"/>
-          <w:sz w:val="20"/>
-          <w:szCs w:val="20"/>
+          <w:sz w:val="18"/>
+          <w:szCs w:val="18"/>
           <w:lang w:val="en-US"/>
         </w:rPr>
         <w:t xml:space="preserve">3. </w:t>
@@ -2395,38 +3050,148 @@
       <w:r>
         <w:rPr>
           <w:rFonts w:ascii="Arial" w:hAnsi="Arial" w:cs="Arial"/>
-          <w:sz w:val="20"/>
-          <w:szCs w:val="20"/>
+          <w:sz w:val="18"/>
+          <w:szCs w:val="18"/>
           <w:lang w:val="en-GB"/>
         </w:rPr>
-        <w:t xml:space="preserve">Cherkaoui, A., Diene, S.M., Renzoni, A., Emonet, S., Renzi, G., et al. (2017). </w:t>
+        <w:t xml:space="preserve">Cherkaoui, A., Diene, S.M., Renzoni, A., </w:t>
+      </w:r>
+      <w:proofErr w:type="spellStart"/>
+      <w:r>
+        <w:rPr>
+          <w:rFonts w:ascii="Arial" w:hAnsi="Arial" w:cs="Arial"/>
+          <w:sz w:val="18"/>
+          <w:szCs w:val="18"/>
+          <w:lang w:val="en-GB"/>
+        </w:rPr>
+        <w:t>Emonet</w:t>
+      </w:r>
+      <w:proofErr w:type="spellEnd"/>
+      <w:r>
+        <w:rPr>
+          <w:rFonts w:ascii="Arial" w:hAnsi="Arial" w:cs="Arial"/>
+          <w:sz w:val="18"/>
+          <w:szCs w:val="18"/>
+          <w:lang w:val="en-GB"/>
+        </w:rPr>
+        <w:t xml:space="preserve">, S., Renzi, G., et al. (2017). </w:t>
       </w:r>
       <w:r>
         <w:rPr>
           <w:rFonts w:ascii="Arial" w:hAnsi="Arial" w:cs="Arial"/>
           <w:iCs/>
-          <w:sz w:val="20"/>
-          <w:szCs w:val="20"/>
+          <w:sz w:val="18"/>
+          <w:szCs w:val="18"/>
           <w:lang w:val="en-GB"/>
         </w:rPr>
-        <w:t>Imipenem heteroresistance in nontypeable Haemophilus influenzae is linked to a combination of altered PBP3, slow drug influx and direct efflux regulation.</w:t>
-      </w:r>
-      <w:r>
-        <w:rPr>
-          <w:rFonts w:ascii="Arial" w:hAnsi="Arial" w:cs="Arial"/>
-          <w:sz w:val="20"/>
-          <w:szCs w:val="20"/>
+        <w:t xml:space="preserve">Imipenem </w:t>
+      </w:r>
+      <w:proofErr w:type="spellStart"/>
+      <w:r>
+        <w:rPr>
+          <w:rFonts w:ascii="Arial" w:hAnsi="Arial" w:cs="Arial"/>
+          <w:iCs/>
+          <w:sz w:val="18"/>
+          <w:szCs w:val="18"/>
           <w:lang w:val="en-GB"/>
         </w:rPr>
+        <w:t>heteroresistance</w:t>
+      </w:r>
+      <w:proofErr w:type="spellEnd"/>
+      <w:r>
+        <w:rPr>
+          <w:rFonts w:ascii="Arial" w:hAnsi="Arial" w:cs="Arial"/>
+          <w:iCs/>
+          <w:sz w:val="18"/>
+          <w:szCs w:val="18"/>
+          <w:lang w:val="en-GB"/>
+        </w:rPr>
+        <w:t xml:space="preserve"> in </w:t>
+      </w:r>
+      <w:proofErr w:type="spellStart"/>
+      <w:r>
+        <w:rPr>
+          <w:rFonts w:ascii="Arial" w:hAnsi="Arial" w:cs="Arial"/>
+          <w:iCs/>
+          <w:sz w:val="18"/>
+          <w:szCs w:val="18"/>
+          <w:lang w:val="en-GB"/>
+        </w:rPr>
+        <w:t>nontypeable</w:t>
+      </w:r>
+      <w:proofErr w:type="spellEnd"/>
+      <w:r>
+        <w:rPr>
+          <w:rFonts w:ascii="Arial" w:hAnsi="Arial" w:cs="Arial"/>
+          <w:iCs/>
+          <w:sz w:val="18"/>
+          <w:szCs w:val="18"/>
+          <w:lang w:val="en-GB"/>
+        </w:rPr>
+        <w:t xml:space="preserve"> Haemophilus influenzae is linked to a combination of altered PBP3, slow drug influx and direct efflux regulation.</w:t>
+      </w:r>
+      <w:r>
+        <w:rPr>
+          <w:rFonts w:ascii="Arial" w:hAnsi="Arial" w:cs="Arial"/>
+          <w:sz w:val="18"/>
+          <w:szCs w:val="18"/>
+          <w:lang w:val="en-GB"/>
+        </w:rPr>
         <w:t xml:space="preserve"> </w:t>
       </w:r>
-      <w:r>
-        <w:rPr>
-          <w:rFonts w:ascii="Arial" w:hAnsi="Arial" w:cs="Arial"/>
-          <w:sz w:val="20"/>
-          <w:szCs w:val="20"/>
-        </w:rPr>
-        <w:t>Clin Microbiol Infect. 23(2): p. 118 e9-118 e19.</w:t>
+      <w:proofErr w:type="spellStart"/>
+      <w:r>
+        <w:rPr>
+          <w:rFonts w:ascii="Arial" w:hAnsi="Arial" w:cs="Arial"/>
+          <w:sz w:val="18"/>
+          <w:szCs w:val="18"/>
+        </w:rPr>
+        <w:t>Clin</w:t>
+      </w:r>
+      <w:proofErr w:type="spellEnd"/>
+      <w:r>
+        <w:rPr>
+          <w:rFonts w:ascii="Arial" w:hAnsi="Arial" w:cs="Arial"/>
+          <w:sz w:val="18"/>
+          <w:szCs w:val="18"/>
+        </w:rPr>
+        <w:t xml:space="preserve"> </w:t>
+      </w:r>
+      <w:proofErr w:type="spellStart"/>
+      <w:r>
+        <w:rPr>
+          <w:rFonts w:ascii="Arial" w:hAnsi="Arial" w:cs="Arial"/>
+          <w:sz w:val="18"/>
+          <w:szCs w:val="18"/>
+        </w:rPr>
+        <w:t>Microbiol</w:t>
+      </w:r>
+      <w:proofErr w:type="spellEnd"/>
+      <w:r>
+        <w:rPr>
+          <w:rFonts w:ascii="Arial" w:hAnsi="Arial" w:cs="Arial"/>
+          <w:sz w:val="18"/>
+          <w:szCs w:val="18"/>
+        </w:rPr>
+        <w:t xml:space="preserve"> </w:t>
+      </w:r>
+      <w:proofErr w:type="spellStart"/>
+      <w:r>
+        <w:rPr>
+          <w:rFonts w:ascii="Arial" w:hAnsi="Arial" w:cs="Arial"/>
+          <w:sz w:val="18"/>
+          <w:szCs w:val="18"/>
+        </w:rPr>
+        <w:t>Infect</w:t>
+      </w:r>
+      <w:proofErr w:type="spellEnd"/>
+      <w:r>
+        <w:rPr>
+          <w:rFonts w:ascii="Arial" w:hAnsi="Arial" w:cs="Arial"/>
+          <w:sz w:val="18"/>
+          <w:szCs w:val="18"/>
+        </w:rPr>
+        <w:t>. 23(2): p. 118 e9-118 e19.</w:t>
       </w:r>
     </w:p>
     <w:p>
@@ -2441,27 +3206,105 @@
         <w:spacing w:before="93"/>
         <w:rPr>
           <w:rFonts w:ascii="Arial" w:hAnsi="Arial" w:cs="Arial"/>
-          <w:sz w:val="20"/>
-          <w:szCs w:val="20"/>
+          <w:sz w:val="18"/>
+          <w:szCs w:val="18"/>
           <w:lang w:val="en-US"/>
         </w:rPr>
       </w:pPr>
       <w:r>
         <w:rPr>
           <w:rFonts w:ascii="Arial" w:hAnsi="Arial" w:cs="Arial"/>
-          <w:sz w:val="20"/>
-          <w:szCs w:val="20"/>
-        </w:rPr>
-        <w:t xml:space="preserve">4. Lâm, T.T., Nürnberg, S., Claus, H., and Vogel, U. (2020). </w:t>
-      </w:r>
-      <w:r>
-        <w:rPr>
-          <w:rFonts w:ascii="Arial" w:hAnsi="Arial" w:cs="Arial"/>
-          <w:sz w:val="20"/>
-          <w:szCs w:val="20"/>
-          <w:lang w:val="en-US"/>
-        </w:rPr>
-        <w:t>Molecular epidemiology of imipenem resistance in invasive Haemophilus influenzae infections in Germany in 2016. J Antimicrob Chemother. 75(8): p. 2076-2086</w:t>
+          <w:sz w:val="18"/>
+          <w:szCs w:val="18"/>
+        </w:rPr>
+        <w:t xml:space="preserve">4. </w:t>
+      </w:r>
+      <w:proofErr w:type="spellStart"/>
+      <w:r>
+        <w:rPr>
+          <w:rFonts w:ascii="Arial" w:hAnsi="Arial" w:cs="Arial"/>
+          <w:sz w:val="18"/>
+          <w:szCs w:val="18"/>
+        </w:rPr>
+        <w:t>Lâm</w:t>
+      </w:r>
+      <w:proofErr w:type="spellEnd"/>
+      <w:r>
+        <w:rPr>
+          <w:rFonts w:ascii="Arial" w:hAnsi="Arial" w:cs="Arial"/>
+          <w:sz w:val="18"/>
+          <w:szCs w:val="18"/>
+        </w:rPr>
+        <w:t xml:space="preserve">, T.T., Nürnberg, S., Claus, H., and Vogel, U. (2020). </w:t>
+      </w:r>
+      <w:r>
+        <w:rPr>
+          <w:rFonts w:ascii="Arial" w:hAnsi="Arial" w:cs="Arial"/>
+          <w:sz w:val="18"/>
+          <w:szCs w:val="18"/>
+          <w:lang w:val="en-US"/>
+        </w:rPr>
+        <w:t xml:space="preserve">Molecular epidemiology of imipenem resistance in invasive </w:t>
+      </w:r>
+      <w:proofErr w:type="spellStart"/>
+      <w:r>
+        <w:rPr>
+          <w:rFonts w:ascii="Arial" w:hAnsi="Arial" w:cs="Arial"/>
+          <w:sz w:val="18"/>
+          <w:szCs w:val="18"/>
+          <w:lang w:val="en-US"/>
+        </w:rPr>
+        <w:t>Haemophilus</w:t>
+      </w:r>
+      <w:proofErr w:type="spellEnd"/>
+      <w:r>
+        <w:rPr>
+          <w:rFonts w:ascii="Arial" w:hAnsi="Arial" w:cs="Arial"/>
+          <w:sz w:val="18"/>
+          <w:szCs w:val="18"/>
+          <w:lang w:val="en-US"/>
+        </w:rPr>
+        <w:t xml:space="preserve"> influenzae infections in Germany in 2016. J </w:t>
+      </w:r>
+      <w:proofErr w:type="spellStart"/>
+      <w:r>
+        <w:rPr>
+          <w:rFonts w:ascii="Arial" w:hAnsi="Arial" w:cs="Arial"/>
+          <w:sz w:val="18"/>
+          <w:szCs w:val="18"/>
+          <w:lang w:val="en-US"/>
+        </w:rPr>
+        <w:t>Antimicrob</w:t>
+      </w:r>
+      <w:proofErr w:type="spellEnd"/>
+      <w:r>
+        <w:rPr>
+          <w:rFonts w:ascii="Arial" w:hAnsi="Arial" w:cs="Arial"/>
+          <w:sz w:val="18"/>
+          <w:szCs w:val="18"/>
+          <w:lang w:val="en-US"/>
+        </w:rPr>
+        <w:t xml:space="preserve"> </w:t>
+      </w:r>
+      <w:proofErr w:type="spellStart"/>
+      <w:r>
+        <w:rPr>
+          <w:rFonts w:ascii="Arial" w:hAnsi="Arial" w:cs="Arial"/>
+          <w:sz w:val="18"/>
+          <w:szCs w:val="18"/>
+          <w:lang w:val="en-US"/>
+        </w:rPr>
+        <w:t>Chemother</w:t>
+      </w:r>
+      <w:proofErr w:type="spellEnd"/>
+      <w:r>
+        <w:rPr>
+          <w:rFonts w:ascii="Arial" w:hAnsi="Arial" w:cs="Arial"/>
+          <w:sz w:val="18"/>
+          <w:szCs w:val="18"/>
+          <w:lang w:val="en-US"/>
+        </w:rPr>
+        <w:t>. 75(8): p. 2076-2086</w:t>
       </w:r>
     </w:p>
     <w:p>
@@ -2476,26 +3319,172 @@
         <w:spacing w:before="93"/>
         <w:rPr>
           <w:rFonts w:ascii="Arial" w:hAnsi="Arial" w:cs="Arial"/>
-          <w:sz w:val="20"/>
-          <w:szCs w:val="20"/>
+          <w:sz w:val="18"/>
+          <w:szCs w:val="18"/>
         </w:rPr>
       </w:pPr>
       <w:r>
         <w:rPr>
           <w:rFonts w:ascii="Arial" w:hAnsi="Arial" w:cs="Arial"/>
-          <w:sz w:val="20"/>
-          <w:szCs w:val="20"/>
-          <w:lang w:val="en-US"/>
-        </w:rPr>
-        <w:t xml:space="preserve">5. Leclercq R, Cantón R, Brown DF, Giske CG, Heisig P, MacGowan AP, Mouton JW, Nordmann P, Rodloff AC, Rossolini GM, Soussy CJ, Steinbakk M, Winstanley TG, Kahlmeter G. EUCAST expert rules in antimicrobial susceptibility testing. </w:t>
-      </w:r>
-      <w:r>
-        <w:rPr>
-          <w:rFonts w:ascii="Arial" w:hAnsi="Arial" w:cs="Arial"/>
-          <w:sz w:val="20"/>
-          <w:szCs w:val="20"/>
-        </w:rPr>
-        <w:t>Clin Microbiol Infect. 2013 19(2): 141–160.</w:t>
+          <w:sz w:val="18"/>
+          <w:szCs w:val="18"/>
+          <w:lang w:val="en-US"/>
+        </w:rPr>
+        <w:t xml:space="preserve">5. Leclercq R, </w:t>
+      </w:r>
+      <w:proofErr w:type="spellStart"/>
+      <w:r>
+        <w:rPr>
+          <w:rFonts w:ascii="Arial" w:hAnsi="Arial" w:cs="Arial"/>
+          <w:sz w:val="18"/>
+          <w:szCs w:val="18"/>
+          <w:lang w:val="en-US"/>
+        </w:rPr>
+        <w:t>Cantón</w:t>
+      </w:r>
+      <w:proofErr w:type="spellEnd"/>
+      <w:r>
+        <w:rPr>
+          <w:rFonts w:ascii="Arial" w:hAnsi="Arial" w:cs="Arial"/>
+          <w:sz w:val="18"/>
+          <w:szCs w:val="18"/>
+          <w:lang w:val="en-US"/>
+        </w:rPr>
+        <w:t xml:space="preserve"> R, Brown DF, Giske CG, Heisig P, MacGowan AP, Mouton JW, Nordmann P, </w:t>
+      </w:r>
+      <w:proofErr w:type="spellStart"/>
+      <w:r>
+        <w:rPr>
+          <w:rFonts w:ascii="Arial" w:hAnsi="Arial" w:cs="Arial"/>
+          <w:sz w:val="18"/>
+          <w:szCs w:val="18"/>
+          <w:lang w:val="en-US"/>
+        </w:rPr>
+        <w:t>Rodloff</w:t>
+      </w:r>
+      <w:proofErr w:type="spellEnd"/>
+      <w:r>
+        <w:rPr>
+          <w:rFonts w:ascii="Arial" w:hAnsi="Arial" w:cs="Arial"/>
+          <w:sz w:val="18"/>
+          <w:szCs w:val="18"/>
+          <w:lang w:val="en-US"/>
+        </w:rPr>
+        <w:t xml:space="preserve"> AC, </w:t>
+      </w:r>
+      <w:proofErr w:type="spellStart"/>
+      <w:r>
+        <w:rPr>
+          <w:rFonts w:ascii="Arial" w:hAnsi="Arial" w:cs="Arial"/>
+          <w:sz w:val="18"/>
+          <w:szCs w:val="18"/>
+          <w:lang w:val="en-US"/>
+        </w:rPr>
+        <w:t>Rossolini</w:t>
+      </w:r>
+      <w:proofErr w:type="spellEnd"/>
+      <w:r>
+        <w:rPr>
+          <w:rFonts w:ascii="Arial" w:hAnsi="Arial" w:cs="Arial"/>
+          <w:sz w:val="18"/>
+          <w:szCs w:val="18"/>
+          <w:lang w:val="en-US"/>
+        </w:rPr>
+        <w:t xml:space="preserve"> GM, </w:t>
+      </w:r>
+      <w:proofErr w:type="spellStart"/>
+      <w:r>
+        <w:rPr>
+          <w:rFonts w:ascii="Arial" w:hAnsi="Arial" w:cs="Arial"/>
+          <w:sz w:val="18"/>
+          <w:szCs w:val="18"/>
+          <w:lang w:val="en-US"/>
+        </w:rPr>
+        <w:t>Soussy</w:t>
+      </w:r>
+      <w:proofErr w:type="spellEnd"/>
+      <w:r>
+        <w:rPr>
+          <w:rFonts w:ascii="Arial" w:hAnsi="Arial" w:cs="Arial"/>
+          <w:sz w:val="18"/>
+          <w:szCs w:val="18"/>
+          <w:lang w:val="en-US"/>
+        </w:rPr>
+        <w:t xml:space="preserve"> CJ, Steinbakk M, Winstanley TG, </w:t>
+      </w:r>
+      <w:proofErr w:type="spellStart"/>
+      <w:r>
+        <w:rPr>
+          <w:rFonts w:ascii="Arial" w:hAnsi="Arial" w:cs="Arial"/>
+          <w:sz w:val="18"/>
+          <w:szCs w:val="18"/>
+          <w:lang w:val="en-US"/>
+        </w:rPr>
+        <w:t>Kahlmeter</w:t>
+      </w:r>
+      <w:proofErr w:type="spellEnd"/>
+      <w:r>
+        <w:rPr>
+          <w:rFonts w:ascii="Arial" w:hAnsi="Arial" w:cs="Arial"/>
+          <w:sz w:val="18"/>
+          <w:szCs w:val="18"/>
+          <w:lang w:val="en-US"/>
+        </w:rPr>
+        <w:t xml:space="preserve"> G. EUCAST expert rules in antimicrobial susceptibility testing. </w:t>
+      </w:r>
+      <w:proofErr w:type="spellStart"/>
+      <w:r>
+        <w:rPr>
+          <w:rFonts w:ascii="Arial" w:hAnsi="Arial" w:cs="Arial"/>
+          <w:sz w:val="18"/>
+          <w:szCs w:val="18"/>
+        </w:rPr>
+        <w:t>Clin</w:t>
+      </w:r>
+      <w:proofErr w:type="spellEnd"/>
+      <w:r>
+        <w:rPr>
+          <w:rFonts w:ascii="Arial" w:hAnsi="Arial" w:cs="Arial"/>
+          <w:sz w:val="18"/>
+          <w:szCs w:val="18"/>
+        </w:rPr>
+        <w:t xml:space="preserve"> </w:t>
+      </w:r>
+      <w:proofErr w:type="spellStart"/>
+      <w:r>
+        <w:rPr>
+          <w:rFonts w:ascii="Arial" w:hAnsi="Arial" w:cs="Arial"/>
+          <w:sz w:val="18"/>
+          <w:szCs w:val="18"/>
+        </w:rPr>
+        <w:t>Microbiol</w:t>
+      </w:r>
+      <w:proofErr w:type="spellEnd"/>
+      <w:r>
+        <w:rPr>
+          <w:rFonts w:ascii="Arial" w:hAnsi="Arial" w:cs="Arial"/>
+          <w:sz w:val="18"/>
+          <w:szCs w:val="18"/>
+        </w:rPr>
+        <w:t xml:space="preserve"> </w:t>
+      </w:r>
+      <w:proofErr w:type="spellStart"/>
+      <w:r>
+        <w:rPr>
+          <w:rFonts w:ascii="Arial" w:hAnsi="Arial" w:cs="Arial"/>
+          <w:sz w:val="18"/>
+          <w:szCs w:val="18"/>
+        </w:rPr>
+        <w:t>Infect</w:t>
+      </w:r>
+      <w:proofErr w:type="spellEnd"/>
+      <w:r>
+        <w:rPr>
+          <w:rFonts w:ascii="Arial" w:hAnsi="Arial" w:cs="Arial"/>
+          <w:sz w:val="18"/>
+          <w:szCs w:val="18"/>
+        </w:rPr>
+        <w:t>. 2013 19(2): 141–160.</w:t>
       </w:r>
     </w:p>
     <w:p>
@@ -2510,36 +3499,87 @@
         <w:spacing w:before="93"/>
         <w:rPr>
           <w:rFonts w:ascii="Arial" w:hAnsi="Arial" w:cs="Arial"/>
-          <w:sz w:val="20"/>
-          <w:szCs w:val="20"/>
+          <w:sz w:val="18"/>
+          <w:szCs w:val="18"/>
           <w:lang w:val="en-US"/>
         </w:rPr>
       </w:pPr>
       <w:r>
         <w:rPr>
           <w:rFonts w:ascii="Arial" w:hAnsi="Arial" w:cs="Arial"/>
-          <w:sz w:val="20"/>
-          <w:szCs w:val="20"/>
+          <w:sz w:val="18"/>
+          <w:szCs w:val="18"/>
         </w:rPr>
         <w:t xml:space="preserve">6. Nürnberg, S., Claus, H., Krone, M., Vogel, U., and Lam, T.T. (2021). </w:t>
       </w:r>
       <w:r>
         <w:rPr>
           <w:rFonts w:ascii="Arial" w:hAnsi="Arial" w:cs="Arial"/>
-          <w:sz w:val="20"/>
-          <w:szCs w:val="20"/>
-          <w:lang w:val="en-US"/>
-        </w:rPr>
-        <w:t xml:space="preserve">Cefotaxime resistance in invasive Haemophilus influenzae isolates in Germany 2016-19: prevalence, epidemiology and relevance of PBP3 substitutions. </w:t>
-      </w:r>
-      <w:r>
-        <w:rPr>
-          <w:rFonts w:ascii="Arial" w:hAnsi="Arial" w:cs="Arial"/>
-          <w:sz w:val="20"/>
-          <w:szCs w:val="20"/>
-          <w:lang w:val="en-US"/>
-        </w:rPr>
-        <w:t>J Antimicrob Chemother. 76(4): p. 920-929.</w:t>
+          <w:sz w:val="18"/>
+          <w:szCs w:val="18"/>
+          <w:lang w:val="en-US"/>
+        </w:rPr>
+        <w:t xml:space="preserve">Cefotaxime resistance in invasive </w:t>
+      </w:r>
+      <w:proofErr w:type="spellStart"/>
+      <w:r>
+        <w:rPr>
+          <w:rFonts w:ascii="Arial" w:hAnsi="Arial" w:cs="Arial"/>
+          <w:sz w:val="18"/>
+          <w:szCs w:val="18"/>
+          <w:lang w:val="en-US"/>
+        </w:rPr>
+        <w:t>Haemophilus</w:t>
+      </w:r>
+      <w:proofErr w:type="spellEnd"/>
+      <w:r>
+        <w:rPr>
+          <w:rFonts w:ascii="Arial" w:hAnsi="Arial" w:cs="Arial"/>
+          <w:sz w:val="18"/>
+          <w:szCs w:val="18"/>
+          <w:lang w:val="en-US"/>
+        </w:rPr>
+        <w:t xml:space="preserve"> influenzae isolates in Germany 2016-19: prevalence, epidemiology and relevance of PBP3 substitutions. J </w:t>
+      </w:r>
+      <w:proofErr w:type="spellStart"/>
+      <w:r>
+        <w:rPr>
+          <w:rFonts w:ascii="Arial" w:hAnsi="Arial" w:cs="Arial"/>
+          <w:sz w:val="18"/>
+          <w:szCs w:val="18"/>
+          <w:lang w:val="en-US"/>
+        </w:rPr>
+        <w:t>Antimicrob</w:t>
+      </w:r>
+      <w:proofErr w:type="spellEnd"/>
+      <w:r>
+        <w:rPr>
+          <w:rFonts w:ascii="Arial" w:hAnsi="Arial" w:cs="Arial"/>
+          <w:sz w:val="18"/>
+          <w:szCs w:val="18"/>
+          <w:lang w:val="en-US"/>
+        </w:rPr>
+        <w:t xml:space="preserve"> </w:t>
+      </w:r>
+      <w:proofErr w:type="spellStart"/>
+      <w:r>
+        <w:rPr>
+          <w:rFonts w:ascii="Arial" w:hAnsi="Arial" w:cs="Arial"/>
+          <w:sz w:val="18"/>
+          <w:szCs w:val="18"/>
+          <w:lang w:val="en-US"/>
+        </w:rPr>
+        <w:t>Chemother</w:t>
+      </w:r>
+      <w:proofErr w:type="spellEnd"/>
+      <w:r>
+        <w:rPr>
+          <w:rFonts w:ascii="Arial" w:hAnsi="Arial" w:cs="Arial"/>
+          <w:sz w:val="18"/>
+          <w:szCs w:val="18"/>
+          <w:lang w:val="en-US"/>
+        </w:rPr>
+        <w:t>. 76(4): p. 920-929.</w:t>
       </w:r>
     </w:p>
     <w:p>
@@ -2592,8 +3632,33 @@
           <w:rFonts w:ascii="Arial" w:hAnsi="Arial" w:cs="Arial"/>
           <w:lang w:val="en-US"/>
         </w:rPr>
-        <w:t>Mit freundlichen Grüßen</w:t>
-      </w:r>
+        <w:t xml:space="preserve">Mit </w:t>
+      </w:r>
+      <w:proofErr w:type="spellStart"/>
+      <w:r>
+        <w:rPr>
+          <w:rFonts w:ascii="Arial" w:hAnsi="Arial" w:cs="Arial"/>
+          <w:lang w:val="en-US"/>
+        </w:rPr>
+        <w:t>freundlichen</w:t>
+      </w:r>
+      <w:proofErr w:type="spellEnd"/>
+      <w:r>
+        <w:rPr>
+          <w:rFonts w:ascii="Arial" w:hAnsi="Arial" w:cs="Arial"/>
+          <w:lang w:val="en-US"/>
+        </w:rPr>
+        <w:t xml:space="preserve"> </w:t>
+      </w:r>
+      <w:proofErr w:type="spellStart"/>
+      <w:r>
+        <w:rPr>
+          <w:rFonts w:ascii="Arial" w:hAnsi="Arial" w:cs="Arial"/>
+          <w:lang w:val="en-US"/>
+        </w:rPr>
+        <w:t>Grüßen</w:t>
+      </w:r>
+      <w:proofErr w:type="spellEnd"/>
     </w:p>
     <w:p>
       <w:pPr>
@@ -2674,6 +3739,8 @@
           <w:lang w:val="en-US"/>
         </w:rPr>
       </w:pPr>
+      <w:proofErr w:type="spellStart"/>
+      <w:proofErr w:type="gramStart"/>
       <w:r>
         <w:rPr>
           <w:rFonts w:ascii="Arial" w:hAnsi="Arial" w:cs="Arial"/>
@@ -2685,6 +3752,7 @@
         </w:rPr>
         <w:t>Kommentar</w:t>
       </w:r>
+      <w:proofErr w:type="spellEnd"/>
       <w:r>
         <w:rPr>
           <w:rFonts w:ascii="Arial" w:hAnsi="Arial" w:cs="Arial"/>
@@ -2692,7 +3760,17 @@
           <w:szCs w:val="16"/>
           <w:lang w:val="en-US"/>
         </w:rPr>
-        <w:t>: {Comment}</w:t>
+        <w:t>: {</w:t>
+      </w:r>
+      <w:proofErr w:type="gramEnd"/>
+      <w:r>
+        <w:rPr>
+          <w:rFonts w:ascii="Arial" w:hAnsi="Arial" w:cs="Arial"/>
+          <w:sz w:val="16"/>
+          <w:szCs w:val="16"/>
+          <w:lang w:val="en-US"/>
+        </w:rPr>
+        <w:t>Comment}</w:t>
       </w:r>
       <w:r>
         <w:rPr>
@@ -2701,7 +3779,58 @@
           <w:szCs w:val="12"/>
           <w:lang w:val="en-US"/>
         </w:rPr>
-        <w:t>{/HasComment}{/HasCommentOrAnnouncement}</w:t>
+        <w:t>{/</w:t>
+      </w:r>
+      <w:proofErr w:type="spellStart"/>
+      <w:proofErr w:type="gramStart"/>
+      <w:r>
+        <w:rPr>
+          <w:rFonts w:ascii="Arial" w:hAnsi="Arial" w:cs="Arial"/>
+          <w:sz w:val="12"/>
+          <w:szCs w:val="12"/>
+          <w:lang w:val="en-US"/>
+        </w:rPr>
+        <w:t>HasComment</w:t>
+      </w:r>
+      <w:proofErr w:type="spellEnd"/>
+      <w:r>
+        <w:rPr>
+          <w:rFonts w:ascii="Arial" w:hAnsi="Arial" w:cs="Arial"/>
+          <w:sz w:val="12"/>
+          <w:szCs w:val="12"/>
+          <w:lang w:val="en-US"/>
+        </w:rPr>
+        <w:t>}{</w:t>
+      </w:r>
+      <w:proofErr w:type="gramEnd"/>
+      <w:r>
+        <w:rPr>
+          <w:rFonts w:ascii="Arial" w:hAnsi="Arial" w:cs="Arial"/>
+          <w:sz w:val="12"/>
+          <w:szCs w:val="12"/>
+          <w:lang w:val="en-US"/>
+        </w:rPr>
+        <w:t>/</w:t>
+      </w:r>
+      <w:proofErr w:type="spellStart"/>
+      <w:r>
+        <w:rPr>
+          <w:rFonts w:ascii="Arial" w:hAnsi="Arial" w:cs="Arial"/>
+          <w:sz w:val="12"/>
+          <w:szCs w:val="12"/>
+          <w:lang w:val="en-US"/>
+        </w:rPr>
+        <w:t>HasCommentOrAnnouncement</w:t>
+      </w:r>
+      <w:proofErr w:type="spellEnd"/>
+      <w:r>
+        <w:rPr>
+          <w:rFonts w:ascii="Arial" w:hAnsi="Arial" w:cs="Arial"/>
+          <w:sz w:val="12"/>
+          <w:szCs w:val="12"/>
+          <w:lang w:val="en-US"/>
+        </w:rPr>
+        <w:t>}</w:t>
       </w:r>
       <w:r>
         <w:rPr>
@@ -2789,7 +3918,7 @@
       <w:rPr>
         <w:noProof/>
       </w:rPr>
-      <w:pict w14:anchorId="6A65D7A5">
+      <w:pict w14:anchorId="2F6643F8">
         <v:shapetype id="_x0000_t75" coordsize="21600,21600" o:spt="75" o:preferrelative="t" path="m@4@5l@4@11@9@11@9@5xe" filled="f" stroked="f">
           <v:stroke joinstyle="miter"/>
           <v:formulas>
@@ -2809,7 +3938,7 @@
           <v:path o:extrusionok="f" gradientshapeok="t" o:connecttype="rect"/>
           <o:lock v:ext="edit" aspectratio="t"/>
         </v:shapetype>
-        <v:shape id="Grafik 3" o:spid="_x0000_s1101" type="#_x0000_t75" alt="ML-13135-01_DAkkS-Symbol_grau1-1" style="position:absolute;margin-left:401.25pt;margin-top:-13.1pt;width:111pt;height:63pt;z-index:2;visibility:visible;mso-wrap-style:square;mso-width-percent:0;mso-height-percent:0;mso-wrap-distance-left:9pt;mso-wrap-distance-top:0;mso-wrap-distance-right:9pt;mso-wrap-distance-bottom:0;mso-position-horizontal:absolute;mso-position-horizontal-relative:text;mso-position-vertical:absolute;mso-position-vertical-relative:text;mso-width-percent:0;mso-height-percent:0;mso-width-relative:page;mso-height-relative:page">
+        <v:shape id="Grafik 881842716" o:spid="_x0000_s1113" type="#_x0000_t75" alt="ML-13135-01_DAkkS-Symbol_grau1-1" style="position:absolute;margin-left:401.25pt;margin-top:-13.1pt;width:111pt;height:63pt;z-index:5;visibility:visible;mso-wrap-style:square;mso-width-percent:0;mso-height-percent:0;mso-wrap-distance-left:9pt;mso-wrap-distance-top:0;mso-wrap-distance-right:9pt;mso-wrap-distance-bottom:0;mso-position-horizontal:absolute;mso-position-horizontal-relative:text;mso-position-vertical:absolute;mso-position-vertical-relative:text;mso-width-percent:0;mso-height-percent:0;mso-width-relative:page;mso-height-relative:page">
           <v:imagedata r:id="rId1" o:title="ML-13135-01_DAkkS-Symbol_grau1-1"/>
         </v:shape>
       </w:pict>
@@ -2827,21 +3956,51 @@
         <w:szCs w:val="17"/>
       </w:rPr>
       <w:tab/>
-      <w:t>Befund zu</w:t>
+      <w:t xml:space="preserve">Befund </w:t>
     </w:r>
     <w:r>
       <w:rPr>
         <w:sz w:val="17"/>
         <w:szCs w:val="17"/>
       </w:rPr>
-      <w:t xml:space="preserve"> </w:t>
+      <w:t xml:space="preserve">vom {Date} </w:t>
     </w:r>
     <w:r>
       <w:rPr>
         <w:sz w:val="17"/>
         <w:szCs w:val="17"/>
       </w:rPr>
-      <w:t>{LaboratoryNumberWithPrefix}</w:t>
+      <w:t>zu</w:t>
+    </w:r>
+    <w:r>
+      <w:rPr>
+        <w:sz w:val="17"/>
+        <w:szCs w:val="17"/>
+      </w:rPr>
+      <w:t xml:space="preserve"> </w:t>
+    </w:r>
+    <w:r>
+      <w:rPr>
+        <w:sz w:val="17"/>
+        <w:szCs w:val="17"/>
+      </w:rPr>
+      <w:t>{</w:t>
+    </w:r>
+    <w:proofErr w:type="spellStart"/>
+    <w:r>
+      <w:rPr>
+        <w:sz w:val="17"/>
+        <w:szCs w:val="17"/>
+      </w:rPr>
+      <w:t>LaboratoryNumberWithPrefix</w:t>
+    </w:r>
+    <w:proofErr w:type="spellEnd"/>
+    <w:r>
+      <w:rPr>
+        <w:sz w:val="17"/>
+        <w:szCs w:val="17"/>
+      </w:rPr>
+      <w:t>}</w:t>
     </w:r>
     <w:r>
       <w:rPr>
@@ -3025,7 +4184,7 @@
       <w:rPr>
         <w:noProof/>
       </w:rPr>
-      <w:pict w14:anchorId="5B1CF9DD">
+      <w:pict w14:anchorId="77FE5FFC">
         <v:shapetype id="_x0000_t75" coordsize="21600,21600" o:spt="75" o:preferrelative="t" path="m@4@5l@4@11@9@11@9@5xe" filled="f" stroked="f">
           <v:stroke joinstyle="miter"/>
           <v:formulas>
@@ -3045,7 +4204,7 @@
           <v:path o:extrusionok="f" gradientshapeok="t" o:connecttype="rect"/>
           <o:lock v:ext="edit" aspectratio="t"/>
         </v:shapetype>
-        <v:shape id="Grafik 149463303" o:spid="_x0000_s1100" type="#_x0000_t75" alt="ML-13135-01_DAkkS-Symbol_grau1-1" style="position:absolute;margin-left:401.25pt;margin-top:-13.1pt;width:111pt;height:63pt;z-index:3;visibility:visible;mso-wrap-style:square;mso-width-percent:0;mso-height-percent:0;mso-wrap-distance-left:9pt;mso-wrap-distance-top:0;mso-wrap-distance-right:9pt;mso-wrap-distance-bottom:0;mso-position-horizontal:absolute;mso-position-horizontal-relative:text;mso-position-vertical:absolute;mso-position-vertical-relative:text;mso-width-percent:0;mso-height-percent:0;mso-width-relative:page;mso-height-relative:page">
+        <v:shape id="Grafik 1623725509" o:spid="_x0000_s1112" type="#_x0000_t75" alt="ML-13135-01_DAkkS-Symbol_grau1-1" style="position:absolute;margin-left:401.25pt;margin-top:-13.1pt;width:111pt;height:63pt;z-index:3;visibility:visible;mso-wrap-style:square;mso-width-percent:0;mso-height-percent:0;mso-wrap-distance-left:9pt;mso-wrap-distance-top:0;mso-wrap-distance-right:9pt;mso-wrap-distance-bottom:0;mso-position-horizontal:absolute;mso-position-horizontal-relative:text;mso-position-vertical:absolute;mso-position-vertical-relative:text;mso-width-percent:0;mso-height-percent:0;mso-width-relative:page;mso-height-relative:page">
           <v:imagedata r:id="rId1" o:title="ML-13135-01_DAkkS-Symbol_grau1-1"/>
         </v:shape>
       </w:pict>
@@ -3063,21 +4222,51 @@
         <w:szCs w:val="17"/>
       </w:rPr>
       <w:tab/>
-      <w:t>Befund zu</w:t>
+      <w:t xml:space="preserve">Befund </w:t>
     </w:r>
     <w:r>
       <w:rPr>
         <w:sz w:val="17"/>
         <w:szCs w:val="17"/>
       </w:rPr>
-      <w:t xml:space="preserve"> </w:t>
+      <w:t xml:space="preserve">vom {Date} </w:t>
     </w:r>
     <w:r>
       <w:rPr>
         <w:sz w:val="17"/>
         <w:szCs w:val="17"/>
       </w:rPr>
-      <w:t>{LaboratoryNumberWithPrefix}</w:t>
+      <w:t>zu</w:t>
+    </w:r>
+    <w:r>
+      <w:rPr>
+        <w:sz w:val="17"/>
+        <w:szCs w:val="17"/>
+      </w:rPr>
+      <w:t xml:space="preserve"> </w:t>
+    </w:r>
+    <w:r>
+      <w:rPr>
+        <w:sz w:val="17"/>
+        <w:szCs w:val="17"/>
+      </w:rPr>
+      <w:t>{</w:t>
+    </w:r>
+    <w:proofErr w:type="spellStart"/>
+    <w:r>
+      <w:rPr>
+        <w:sz w:val="17"/>
+        <w:szCs w:val="17"/>
+      </w:rPr>
+      <w:t>LaboratoryNumberWithPrefix</w:t>
+    </w:r>
+    <w:proofErr w:type="spellEnd"/>
+    <w:r>
+      <w:rPr>
+        <w:sz w:val="17"/>
+        <w:szCs w:val="17"/>
+      </w:rPr>
+      <w:t>}</w:t>
     </w:r>
     <w:r>
       <w:rPr>
@@ -3282,8 +4471,6 @@
         <w:b/>
         <w:smallCaps/>
         <w:spacing w:val="20"/>
-        <w:sz w:val="28"/>
-        <w:szCs w:val="28"/>
       </w:rPr>
     </w:pPr>
     <w:r>
@@ -3311,7 +4498,7 @@
       <w:rPr>
         <w:noProof/>
       </w:rPr>
-      <w:pict w14:anchorId="07FF942D">
+      <w:pict w14:anchorId="79324231">
         <v:shapetype id="_x0000_t75" coordsize="21600,21600" o:spt="75" o:preferrelative="t" path="m@4@5l@4@11@9@11@9@5xe" filled="f" stroked="f">
           <v:stroke joinstyle="miter"/>
           <v:formulas>
@@ -3331,7 +4518,7 @@
           <v:path o:extrusionok="f" gradientshapeok="t" o:connecttype="rect"/>
           <o:lock v:ext="edit" aspectratio="t"/>
         </v:shapetype>
-        <v:shape id="Grafik 7" o:spid="_x0000_s1099" type="#_x0000_t75" alt="nrzmhi_logo_500" style="position:absolute;margin-left:385.15pt;margin-top:2.25pt;width:63.4pt;height:63.4pt;z-index:-4;visibility:visible;mso-wrap-style:square;mso-width-percent:0;mso-height-percent:0;mso-wrap-distance-left:9pt;mso-wrap-distance-top:0;mso-wrap-distance-right:9pt;mso-wrap-distance-bottom:0;mso-position-horizontal:absolute;mso-position-horizontal-relative:text;mso-position-vertical:absolute;mso-position-vertical-relative:text;mso-width-percent:0;mso-height-percent:0;mso-width-relative:page;mso-height-relative:page">
+        <v:shape id="Grafik 281987118" o:spid="_x0000_s1115" type="#_x0000_t75" alt="nrzmhi_logo_500" style="position:absolute;margin-left:385.15pt;margin-top:2.25pt;width:63.4pt;height:63.4pt;z-index:-1;visibility:visible;mso-wrap-style:square;mso-width-percent:0;mso-height-percent:0;mso-wrap-distance-left:9pt;mso-wrap-distance-top:0;mso-wrap-distance-right:9pt;mso-wrap-distance-bottom:0;mso-position-horizontal:absolute;mso-position-horizontal-relative:text;mso-position-vertical:absolute;mso-position-vertical-relative:text;mso-width-percent:0;mso-height-percent:0;mso-width-relative:page;mso-height-relative:page">
           <v:imagedata r:id="rId1" o:title="nrzmhi_logo_500"/>
         </v:shape>
       </w:pict>
@@ -3340,8 +4527,8 @@
       <w:rPr>
         <w:noProof/>
       </w:rPr>
-      <w:pict w14:anchorId="745363CE">
-        <v:shape id="Grafik 8" o:spid="_x0000_s1098" type="#_x0000_t75" alt="RKI_Logo-NRZKL-Deu_RGB-1.JPG" style="position:absolute;margin-left:449.25pt;margin-top:6.75pt;width:55pt;height:55pt;z-index:1;visibility:visible;mso-wrap-style:square;mso-width-percent:0;mso-height-percent:0;mso-wrap-distance-left:9pt;mso-wrap-distance-top:0;mso-wrap-distance-right:9pt;mso-wrap-distance-bottom:0;mso-position-horizontal:absolute;mso-position-horizontal-relative:text;mso-position-vertical:absolute;mso-position-vertical-relative:text;mso-width-percent:0;mso-height-percent:0;mso-width-relative:page;mso-height-relative:page" stroked="t" strokecolor="white">
+      <w:pict w14:anchorId="775D9896">
+        <v:shape id="Grafik 385460452" o:spid="_x0000_s1114" type="#_x0000_t75" alt="RKI_Logo-NRZKL-Deu_RGB-1.JPG" style="position:absolute;margin-left:449.25pt;margin-top:6.75pt;width:55pt;height:55pt;z-index:4;visibility:visible;mso-wrap-style:square;mso-width-percent:0;mso-height-percent:0;mso-wrap-distance-left:9pt;mso-wrap-distance-top:0;mso-wrap-distance-right:9pt;mso-wrap-distance-bottom:0;mso-position-horizontal:absolute;mso-position-horizontal-relative:text;mso-position-vertical:absolute;mso-position-vertical-relative:text;mso-width-percent:0;mso-height-percent:0;mso-width-relative:page;mso-height-relative:page" stroked="t" strokecolor="white">
           <v:imagedata r:id="rId2" o:title="RKI_Logo-NRZKL-Deu_RGB-1"/>
         </v:shape>
       </w:pict>
@@ -3352,8 +4539,6 @@
         <w:b/>
         <w:smallCaps/>
         <w:spacing w:val="20"/>
-        <w:sz w:val="28"/>
-        <w:szCs w:val="28"/>
       </w:rPr>
       <w:t xml:space="preserve">Nationales Referenzzentrum für Meningokokken </w:t>
     </w:r>
@@ -3365,8 +4550,6 @@
         <w:rFonts w:ascii="Arial" w:hAnsi="Arial" w:cs="Arial"/>
         <w:smallCaps/>
         <w:spacing w:val="20"/>
-        <w:sz w:val="28"/>
-        <w:szCs w:val="28"/>
       </w:rPr>
     </w:pPr>
     <w:r>
@@ -3376,8 +4559,6 @@
         <w:smallCaps/>
         <w:noProof/>
         <w:spacing w:val="20"/>
-        <w:sz w:val="28"/>
-        <w:szCs w:val="28"/>
       </w:rPr>
       <w:t>und Haemophilus influenzae</w:t>
     </w:r>
@@ -3385,14 +4566,14 @@
   <w:p>
     <w:pPr>
       <w:rPr>
-        <w:sz w:val="22"/>
-        <w:szCs w:val="22"/>
+        <w:sz w:val="20"/>
+        <w:szCs w:val="20"/>
       </w:rPr>
     </w:pPr>
     <w:r>
       <w:rPr>
-        <w:sz w:val="22"/>
-        <w:szCs w:val="22"/>
+        <w:sz w:val="20"/>
+        <w:szCs w:val="20"/>
       </w:rPr>
       <w:t>Gesamtleitung: PD Dr. rer. nat. Heike Claus</w:t>
     </w:r>
@@ -3400,17 +4581,42 @@
   <w:p>
     <w:pPr>
       <w:rPr>
-        <w:sz w:val="12"/>
-        <w:szCs w:val="12"/>
+        <w:sz w:val="20"/>
+        <w:szCs w:val="20"/>
       </w:rPr>
     </w:pPr>
     <w:r>
       <w:rPr>
-        <w:sz w:val="22"/>
-        <w:szCs w:val="22"/>
-      </w:rPr>
-      <w:t>ärztliche Leitung: PD Dr. med. Thiên-Trí Lâm</w:t>
-    </w:r>
+        <w:sz w:val="20"/>
+        <w:szCs w:val="20"/>
+      </w:rPr>
+      <w:t xml:space="preserve">ärztliche Leitung: PD Dr. med. </w:t>
+    </w:r>
+    <w:proofErr w:type="spellStart"/>
+    <w:r>
+      <w:rPr>
+        <w:sz w:val="20"/>
+        <w:szCs w:val="20"/>
+      </w:rPr>
+      <w:t>Thiên-Trí</w:t>
+    </w:r>
+    <w:proofErr w:type="spellEnd"/>
+    <w:r>
+      <w:rPr>
+        <w:sz w:val="20"/>
+        <w:szCs w:val="20"/>
+      </w:rPr>
+      <w:t xml:space="preserve"> </w:t>
+    </w:r>
+    <w:proofErr w:type="spellStart"/>
+    <w:r>
+      <w:rPr>
+        <w:sz w:val="20"/>
+        <w:szCs w:val="20"/>
+      </w:rPr>
+      <w:t>Lâm</w:t>
+    </w:r>
+    <w:proofErr w:type="spellEnd"/>
   </w:p>
   <w:p>
     <w:pPr>
@@ -3419,6 +4625,143 @@
         <w:szCs w:val="12"/>
       </w:rPr>
     </w:pPr>
+  </w:p>
+  <w:p>
+    <w:pPr>
+      <w:rPr>
+        <w:sz w:val="12"/>
+        <w:szCs w:val="12"/>
+      </w:rPr>
+    </w:pPr>
+    <w:r>
+      <w:rPr>
+        <w:sz w:val="12"/>
+        <w:szCs w:val="12"/>
+      </w:rPr>
+      <w:t xml:space="preserve">Labor-Nr. des </w:t>
+    </w:r>
+    <w:proofErr w:type="spellStart"/>
+    <w:r>
+      <w:rPr>
+        <w:sz w:val="12"/>
+        <w:szCs w:val="12"/>
+      </w:rPr>
+      <w:t>NRZMHi</w:t>
+    </w:r>
+    <w:proofErr w:type="spellEnd"/>
+    <w:r>
+      <w:rPr>
+        <w:sz w:val="12"/>
+        <w:szCs w:val="12"/>
+      </w:rPr>
+      <w:t xml:space="preserve">: </w:t>
+    </w:r>
+    <w:r>
+      <w:rPr>
+        <w:sz w:val="12"/>
+        <w:szCs w:val="12"/>
+      </w:rPr>
+      <w:t>{</w:t>
+    </w:r>
+    <w:proofErr w:type="spellStart"/>
+    <w:r>
+      <w:rPr>
+        <w:sz w:val="12"/>
+        <w:szCs w:val="12"/>
+      </w:rPr>
+      <w:t>LaboratoryNumberWithPrefix</w:t>
+    </w:r>
+    <w:proofErr w:type="spellEnd"/>
+    <w:r>
+      <w:rPr>
+        <w:sz w:val="12"/>
+        <w:szCs w:val="12"/>
+      </w:rPr>
+      <w:t>}</w:t>
+    </w:r>
+    <w:r>
+      <w:rPr>
+        <w:sz w:val="12"/>
+        <w:szCs w:val="12"/>
+      </w:rPr>
+      <w:t xml:space="preserve"> · isoliert aus: {</w:t>
+    </w:r>
+    <w:proofErr w:type="spellStart"/>
+    <w:r>
+      <w:rPr>
+        <w:sz w:val="12"/>
+        <w:szCs w:val="12"/>
+      </w:rPr>
+      <w:t>SamplingLocation</w:t>
+    </w:r>
+    <w:proofErr w:type="spellEnd"/>
+    <w:r>
+      <w:rPr>
+        <w:sz w:val="12"/>
+        <w:szCs w:val="12"/>
+      </w:rPr>
+      <w:t>} · Datum der Materialentnahme:</w:t>
+    </w:r>
+    <w:r>
+      <w:rPr>
+        <w:sz w:val="12"/>
+        <w:szCs w:val="12"/>
+      </w:rPr>
+      <w:t xml:space="preserve"> </w:t>
+    </w:r>
+    <w:r>
+      <w:rPr>
+        <w:sz w:val="12"/>
+        <w:szCs w:val="12"/>
+      </w:rPr>
+      <w:t>{</w:t>
+    </w:r>
+    <w:proofErr w:type="spellStart"/>
+    <w:r>
+      <w:rPr>
+        <w:sz w:val="12"/>
+        <w:szCs w:val="12"/>
+      </w:rPr>
+      <w:t>SamplingDate</w:t>
+    </w:r>
+    <w:proofErr w:type="spellEnd"/>
+    <w:r>
+      <w:rPr>
+        <w:sz w:val="12"/>
+        <w:szCs w:val="12"/>
+      </w:rPr>
+      <w:t>} · Labor-Nr. des Einsenders:</w:t>
+    </w:r>
+    <w:r>
+      <w:rPr>
+        <w:sz w:val="12"/>
+        <w:szCs w:val="12"/>
+      </w:rPr>
+      <w:t xml:space="preserve"> </w:t>
+    </w:r>
+    <w:r>
+      <w:rPr>
+        <w:sz w:val="12"/>
+        <w:szCs w:val="12"/>
+      </w:rPr>
+      <w:t>{</w:t>
+    </w:r>
+    <w:proofErr w:type="spellStart"/>
+    <w:r>
+      <w:rPr>
+        <w:sz w:val="12"/>
+        <w:szCs w:val="12"/>
+      </w:rPr>
+      <w:t>SenderLaboratoryNumber</w:t>
+    </w:r>
+    <w:proofErr w:type="spellEnd"/>
+    <w:r>
+      <w:rPr>
+        <w:sz w:val="12"/>
+        <w:szCs w:val="12"/>
+      </w:rPr>
+      <w:t>}</w:t>
+    </w:r>
   </w:p>
   <w:p>
     <w:pPr>
@@ -3496,7 +4839,7 @@
           <v:path o:extrusionok="f" gradientshapeok="t" o:connecttype="rect"/>
           <o:lock v:ext="edit" aspectratio="t"/>
         </v:shapetype>
-        <v:shape id="Grafik 1594286521" o:spid="_x0000_s1111" type="#_x0000_t75" alt="nrzmhi_logo_500" style="position:absolute;margin-left:385.15pt;margin-top:2.25pt;width:63.4pt;height:63.4pt;z-index:-1;visibility:visible;mso-wrap-style:square;mso-width-percent:0;mso-height-percent:0;mso-wrap-distance-left:9pt;mso-wrap-distance-top:0;mso-wrap-distance-right:9pt;mso-wrap-distance-bottom:0;mso-position-horizontal:absolute;mso-position-horizontal-relative:text;mso-position-vertical:absolute;mso-position-vertical-relative:text;mso-width-percent:0;mso-height-percent:0;mso-width-relative:page;mso-height-relative:page">
+        <v:shape id="Grafik 1594286521" o:spid="_x0000_s1111" type="#_x0000_t75" alt="nrzmhi_logo_500" style="position:absolute;margin-left:385.15pt;margin-top:2.25pt;width:63.4pt;height:63.4pt;z-index:-2;visibility:visible;mso-wrap-style:square;mso-width-percent:0;mso-height-percent:0;mso-wrap-distance-left:9pt;mso-wrap-distance-top:0;mso-wrap-distance-right:9pt;mso-wrap-distance-bottom:0;mso-position-horizontal:absolute;mso-position-horizontal-relative:text;mso-position-vertical:absolute;mso-position-vertical-relative:text;mso-width-percent:0;mso-height-percent:0;mso-width-relative:page;mso-height-relative:page">
           <v:imagedata r:id="rId1" o:title="nrzmhi_logo_500"/>
         </v:shape>
       </w:pict>
@@ -3506,7 +4849,7 @@
         <w:noProof/>
       </w:rPr>
       <w:pict w14:anchorId="17A30905">
-        <v:shape id="Grafik 23658753" o:spid="_x0000_s1110" type="#_x0000_t75" alt="RKI_Logo-NRZKL-Deu_RGB-1.JPG" style="position:absolute;margin-left:449.25pt;margin-top:6.75pt;width:55pt;height:55pt;z-index:5;visibility:visible;mso-wrap-style:square;mso-width-percent:0;mso-height-percent:0;mso-wrap-distance-left:9pt;mso-wrap-distance-top:0;mso-wrap-distance-right:9pt;mso-wrap-distance-bottom:0;mso-position-horizontal:absolute;mso-position-horizontal-relative:text;mso-position-vertical:absolute;mso-position-vertical-relative:text;mso-width-percent:0;mso-height-percent:0;mso-width-relative:page;mso-height-relative:page" stroked="t" strokecolor="white">
+        <v:shape id="Grafik 23658753" o:spid="_x0000_s1110" type="#_x0000_t75" alt="RKI_Logo-NRZKL-Deu_RGB-1.JPG" style="position:absolute;margin-left:449.25pt;margin-top:6.75pt;width:55pt;height:55pt;z-index:1;visibility:visible;mso-wrap-style:square;mso-width-percent:0;mso-height-percent:0;mso-wrap-distance-left:9pt;mso-wrap-distance-top:0;mso-wrap-distance-right:9pt;mso-wrap-distance-bottom:0;mso-position-horizontal:absolute;mso-position-horizontal-relative:text;mso-position-vertical:absolute;mso-position-vertical-relative:text;mso-width-percent:0;mso-height-percent:0;mso-width-relative:page;mso-height-relative:page" stroked="t" strokecolor="white">
           <v:imagedata r:id="rId2" o:title="RKI_Logo-NRZKL-Deu_RGB-1"/>
         </v:shape>
       </w:pict>
@@ -3589,8 +4932,33 @@
         <w:sz w:val="22"/>
         <w:szCs w:val="22"/>
       </w:rPr>
-      <w:t>ärztliche Leitung: PD Dr. med. Thiên-Trí Lâm</w:t>
-    </w:r>
+      <w:t xml:space="preserve">ärztliche Leitung: PD Dr. med. </w:t>
+    </w:r>
+    <w:proofErr w:type="spellStart"/>
+    <w:r>
+      <w:rPr>
+        <w:sz w:val="22"/>
+        <w:szCs w:val="22"/>
+      </w:rPr>
+      <w:t>Thiên-Trí</w:t>
+    </w:r>
+    <w:proofErr w:type="spellEnd"/>
+    <w:r>
+      <w:rPr>
+        <w:sz w:val="22"/>
+        <w:szCs w:val="22"/>
+      </w:rPr>
+      <w:t xml:space="preserve"> </w:t>
+    </w:r>
+    <w:proofErr w:type="spellStart"/>
+    <w:r>
+      <w:rPr>
+        <w:sz w:val="22"/>
+        <w:szCs w:val="22"/>
+      </w:rPr>
+      <w:t>Lâm</w:t>
+    </w:r>
+    <w:proofErr w:type="spellEnd"/>
   </w:p>
   <w:p>
     <w:pPr>
@@ -3631,7 +4999,7 @@
           <v:stroke joinstyle="miter"/>
           <v:path gradientshapeok="t" o:connecttype="rect"/>
         </v:shapetype>
-        <v:shape id="Textfeld 3" o:spid="_x0000_s1109" type="#_x0000_t202" style="position:absolute;margin-left:364.1pt;margin-top:2.3pt;width:156.8pt;height:304.25pt;z-index:6;visibility:visible;mso-wrap-style:square;mso-width-percent:0;mso-height-percent:0;mso-wrap-distance-left:9pt;mso-wrap-distance-top:0;mso-wrap-distance-right:9pt;mso-wrap-distance-bottom:0;mso-position-horizontal-relative:text;mso-position-vertical-relative:text;mso-width-percent:0;mso-height-percent:0;mso-width-relative:page;mso-height-relative:page;v-text-anchor:top" o:gfxdata="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" stroked="f">
+        <v:shape id="Textfeld 3" o:spid="_x0000_s1109" type="#_x0000_t202" style="position:absolute;margin-left:364.1pt;margin-top:2.3pt;width:156.8pt;height:304.25pt;z-index:2;visibility:visible;mso-wrap-style:square;mso-width-percent:0;mso-height-percent:0;mso-wrap-distance-left:9pt;mso-wrap-distance-top:0;mso-wrap-distance-right:9pt;mso-wrap-distance-bottom:0;mso-position-horizontal-relative:text;mso-position-vertical-relative:text;mso-width-percent:0;mso-height-percent:0;mso-width-relative:page;mso-height-relative:page;v-text-anchor:top" o:gfxdata="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" stroked="f">
           <v:textbox style="mso-next-textbox:#Textfeld 3">
             <w:txbxContent>
               <w:p>

</xml_diff>

<commit_message>
Store configuration on database and add edit user interface
Refs: #214
</commit_message>
<xml_diff>
--- a/HaemophilusWeb/ReportTemplates/BLNAR v10.docx
+++ b/HaemophilusWeb/ReportTemplates/BLNAR v10.docx
@@ -4575,7 +4575,7 @@
         <w:sz w:val="20"/>
         <w:szCs w:val="20"/>
       </w:rPr>
-      <w:t>Gesamtleitung: PD Dr. rer. nat. Heike Claus</w:t>
+      <w:t xml:space="preserve">Gesamtleitung: {LabDirector}</w:t>
     </w:r>
   </w:p>
   <w:p>
@@ -4590,33 +4590,8 @@
         <w:sz w:val="20"/>
         <w:szCs w:val="20"/>
       </w:rPr>
-      <w:t xml:space="preserve">ärztliche Leitung: PD Dr. med. </w:t>
-    </w:r>
-    <w:proofErr w:type="spellStart"/>
-    <w:r>
-      <w:rPr>
-        <w:sz w:val="20"/>
-        <w:szCs w:val="20"/>
-      </w:rPr>
-      <w:t>Thiên-Trí</w:t>
-    </w:r>
-    <w:proofErr w:type="spellEnd"/>
-    <w:r>
-      <w:rPr>
-        <w:sz w:val="20"/>
-        <w:szCs w:val="20"/>
-      </w:rPr>
-      <w:t xml:space="preserve"> </w:t>
-    </w:r>
-    <w:proofErr w:type="spellStart"/>
-    <w:r>
-      <w:rPr>
-        <w:sz w:val="20"/>
-        <w:szCs w:val="20"/>
-      </w:rPr>
-      <w:t>Lâm</w:t>
-    </w:r>
-    <w:proofErr w:type="spellEnd"/>
+      <w:t xml:space="preserve">ärztliche Leitung: {MedicalDirector}</w:t>
+    </w:r>
   </w:p>
   <w:p>
     <w:pPr>
@@ -4917,7 +4892,7 @@
         <w:sz w:val="22"/>
         <w:szCs w:val="22"/>
       </w:rPr>
-      <w:t>Gesamtleitung: PD Dr. rer. nat. Heike Claus</w:t>
+      <w:t xml:space="preserve">Gesamtleitung: {LabDirector}</w:t>
     </w:r>
   </w:p>
   <w:p>
@@ -4932,33 +4907,8 @@
         <w:sz w:val="22"/>
         <w:szCs w:val="22"/>
       </w:rPr>
-      <w:t xml:space="preserve">ärztliche Leitung: PD Dr. med. </w:t>
-    </w:r>
-    <w:proofErr w:type="spellStart"/>
-    <w:r>
-      <w:rPr>
-        <w:sz w:val="22"/>
-        <w:szCs w:val="22"/>
-      </w:rPr>
-      <w:t>Thiên-Trí</w:t>
-    </w:r>
-    <w:proofErr w:type="spellEnd"/>
-    <w:r>
-      <w:rPr>
-        <w:sz w:val="22"/>
-        <w:szCs w:val="22"/>
-      </w:rPr>
-      <w:t xml:space="preserve"> </w:t>
-    </w:r>
-    <w:proofErr w:type="spellStart"/>
-    <w:r>
-      <w:rPr>
-        <w:sz w:val="22"/>
-        <w:szCs w:val="22"/>
-      </w:rPr>
-      <w:t>Lâm</w:t>
-    </w:r>
-    <w:proofErr w:type="spellEnd"/>
+      <w:t xml:space="preserve">ärztliche Leitung: {MedicalDirector}</w:t>
+    </w:r>
   </w:p>
   <w:p>
     <w:pPr>
@@ -5224,235 +5174,8 @@
                     <w:sz w:val="17"/>
                     <w:szCs w:val="17"/>
                   </w:rPr>
-                  <w:t>PD Dr. rer. nat. Heike Claus</w:t>
+                  <w:t xml:space="preserve">{Contacts}</w:t>
                 </w:r>
-              </w:p>
-              <w:p>
-                <w:pPr>
-                  <w:tabs>
-                    <w:tab w:val="left" w:pos="7560"/>
-                  </w:tabs>
-                  <w:ind w:right="-1368"/>
-                  <w:rPr>
-                    <w:sz w:val="17"/>
-                    <w:szCs w:val="17"/>
-                    <w:lang w:val="pl-PL"/>
-                  </w:rPr>
-                </w:pPr>
-                <w:r>
-                  <w:rPr>
-                    <w:sz w:val="17"/>
-                    <w:szCs w:val="17"/>
-                    <w:lang w:val="pl-PL"/>
-                  </w:rPr>
-                  <w:t>Telefon: 0931/31-46936</w:t>
-                </w:r>
-              </w:p>
-              <w:p>
-                <w:pPr>
-                  <w:tabs>
-                    <w:tab w:val="left" w:pos="7560"/>
-                  </w:tabs>
-                  <w:ind w:right="-1368"/>
-                  <w:rPr>
-                    <w:sz w:val="17"/>
-                    <w:szCs w:val="17"/>
-                    <w:lang w:val="pl-PL"/>
-                  </w:rPr>
-                </w:pPr>
-                <w:r>
-                  <w:rPr>
-                    <w:sz w:val="17"/>
-                    <w:szCs w:val="17"/>
-                    <w:lang w:val="pl-PL"/>
-                  </w:rPr>
-                  <w:t>heike.claus@uni-wuerzburg.de</w:t>
-                </w:r>
-              </w:p>
-              <w:p>
-                <w:pPr>
-                  <w:ind w:right="-1368"/>
-                  <w:rPr>
-                    <w:sz w:val="17"/>
-                    <w:szCs w:val="17"/>
-                    <w:lang w:val="pl-PL"/>
-                  </w:rPr>
-                </w:pPr>
-              </w:p>
-              <w:p>
-                <w:pPr>
-                  <w:ind w:right="-1368"/>
-                  <w:rPr>
-                    <w:sz w:val="17"/>
-                    <w:szCs w:val="17"/>
-                    <w:lang w:val="pl-PL"/>
-                  </w:rPr>
-                </w:pPr>
-                <w:r>
-                  <w:rPr>
-                    <w:sz w:val="17"/>
-                    <w:szCs w:val="17"/>
-                    <w:lang w:val="pl-PL"/>
-                  </w:rPr>
-                  <w:t>PD Dr. med. Thiên-Trí Lâm</w:t>
-                </w:r>
-              </w:p>
-              <w:p>
-                <w:pPr>
-                  <w:ind w:right="-1368"/>
-                  <w:rPr>
-                    <w:sz w:val="17"/>
-                    <w:szCs w:val="17"/>
-                    <w:lang w:val="pl-PL"/>
-                  </w:rPr>
-                </w:pPr>
-                <w:r>
-                  <w:rPr>
-                    <w:sz w:val="17"/>
-                    <w:szCs w:val="17"/>
-                    <w:lang w:val="pl-PL"/>
-                  </w:rPr>
-                  <w:t>Telefon: 0931/31-46737</w:t>
-                </w:r>
-              </w:p>
-              <w:p>
-                <w:pPr>
-                  <w:ind w:right="-1368"/>
-                  <w:rPr>
-                    <w:sz w:val="17"/>
-                    <w:szCs w:val="17"/>
-                    <w:lang w:val="pl-PL"/>
-                  </w:rPr>
-                </w:pPr>
-                <w:r>
-                  <w:rPr>
-                    <w:sz w:val="17"/>
-                    <w:szCs w:val="17"/>
-                    <w:lang w:val="pl-PL"/>
-                  </w:rPr>
-                  <w:t>thien-tri.lam@uni-wuerzburg.de</w:t>
-                </w:r>
-              </w:p>
-              <w:p>
-                <w:pPr>
-                  <w:tabs>
-                    <w:tab w:val="left" w:pos="7560"/>
-                  </w:tabs>
-                  <w:ind w:right="-1368"/>
-                  <w:rPr>
-                    <w:sz w:val="17"/>
-                    <w:szCs w:val="17"/>
-                    <w:lang w:val="pl-PL"/>
-                  </w:rPr>
-                </w:pPr>
-              </w:p>
-              <w:p>
-                <w:pPr>
-                  <w:tabs>
-                    <w:tab w:val="left" w:pos="7560"/>
-                  </w:tabs>
-                  <w:ind w:right="-1368"/>
-                  <w:rPr>
-                    <w:sz w:val="17"/>
-                    <w:szCs w:val="17"/>
-                    <w:lang w:val="en-GB"/>
-                  </w:rPr>
-                </w:pPr>
-                <w:r>
-                  <w:rPr>
-                    <w:sz w:val="17"/>
-                    <w:szCs w:val="17"/>
-                    <w:lang w:val="en-GB"/>
-                  </w:rPr>
-                  <w:t>Dr.</w:t>
-                </w:r>
-                <w:r>
-                  <w:rPr>
-                    <w:sz w:val="17"/>
-                    <w:szCs w:val="17"/>
-                    <w:lang w:val="en-GB"/>
-                  </w:rPr>
-                  <w:t xml:space="preserve"> </w:t>
-                </w:r>
-                <w:r>
-                  <w:rPr>
-                    <w:sz w:val="17"/>
-                    <w:szCs w:val="17"/>
-                    <w:lang w:val="en-GB"/>
-                  </w:rPr>
-                  <w:t>med. Katherina Heroth</w:t>
-                </w:r>
-              </w:p>
-              <w:p>
-                <w:pPr>
-                  <w:tabs>
-                    <w:tab w:val="left" w:pos="7560"/>
-                  </w:tabs>
-                  <w:ind w:right="-1368"/>
-                  <w:rPr>
-                    <w:sz w:val="17"/>
-                    <w:szCs w:val="17"/>
-                    <w:lang w:val="pl-PL"/>
-                  </w:rPr>
-                </w:pPr>
-                <w:r>
-                  <w:rPr>
-                    <w:sz w:val="17"/>
-                    <w:szCs w:val="17"/>
-                    <w:lang w:val="pl-PL"/>
-                  </w:rPr>
-                  <w:t>Telefon: 0931/31-81128</w:t>
-                </w:r>
-              </w:p>
-              <w:p>
-                <w:pPr>
-                  <w:tabs>
-                    <w:tab w:val="left" w:pos="7560"/>
-                  </w:tabs>
-                  <w:ind w:right="-1368"/>
-                  <w:rPr>
-                    <w:sz w:val="17"/>
-                    <w:szCs w:val="17"/>
-                    <w:lang w:val="pl-PL"/>
-                  </w:rPr>
-                </w:pPr>
-                <w:r>
-                  <w:rPr>
-                    <w:sz w:val="17"/>
-                    <w:szCs w:val="17"/>
-                    <w:lang w:val="pl-PL"/>
-                  </w:rPr>
-                  <w:t>katherina.heroth</w:t>
-                </w:r>
-                <w:r>
-                  <w:rPr>
-                    <w:sz w:val="17"/>
-                    <w:szCs w:val="17"/>
-                    <w:lang w:val="pl-PL"/>
-                  </w:rPr>
-                  <w:t>@</w:t>
-                </w:r>
-                <w:r>
-                  <w:rPr>
-                    <w:sz w:val="17"/>
-                    <w:szCs w:val="17"/>
-                    <w:lang w:val="pl-PL"/>
-                  </w:rPr>
-                  <w:t>uni-wuerzburg.de</w:t>
-                </w:r>
-              </w:p>
-              <w:p>
-                <w:pPr>
-                  <w:tabs>
-                    <w:tab w:val="left" w:pos="7560"/>
-                  </w:tabs>
-                  <w:ind w:right="-1368"/>
-                  <w:rPr>
-                    <w:sz w:val="17"/>
-                    <w:szCs w:val="17"/>
-                    <w:lang w:val="pl-PL"/>
-                  </w:rPr>
-                </w:pPr>
               </w:p>
             </w:txbxContent>
           </v:textbox>

</xml_diff>

<commit_message>
Store configuration on database and add edit user interface (#215)
Refs: #214
</commit_message>
<xml_diff>
--- a/HaemophilusWeb/ReportTemplates/BLNAR v10.docx
+++ b/HaemophilusWeb/ReportTemplates/BLNAR v10.docx
@@ -4575,7 +4575,7 @@
         <w:sz w:val="20"/>
         <w:szCs w:val="20"/>
       </w:rPr>
-      <w:t>Gesamtleitung: PD Dr. rer. nat. Heike Claus</w:t>
+      <w:t xml:space="preserve">Gesamtleitung: {LabDirector}</w:t>
     </w:r>
   </w:p>
   <w:p>
@@ -4590,33 +4590,8 @@
         <w:sz w:val="20"/>
         <w:szCs w:val="20"/>
       </w:rPr>
-      <w:t xml:space="preserve">ärztliche Leitung: PD Dr. med. </w:t>
-    </w:r>
-    <w:proofErr w:type="spellStart"/>
-    <w:r>
-      <w:rPr>
-        <w:sz w:val="20"/>
-        <w:szCs w:val="20"/>
-      </w:rPr>
-      <w:t>Thiên-Trí</w:t>
-    </w:r>
-    <w:proofErr w:type="spellEnd"/>
-    <w:r>
-      <w:rPr>
-        <w:sz w:val="20"/>
-        <w:szCs w:val="20"/>
-      </w:rPr>
-      <w:t xml:space="preserve"> </w:t>
-    </w:r>
-    <w:proofErr w:type="spellStart"/>
-    <w:r>
-      <w:rPr>
-        <w:sz w:val="20"/>
-        <w:szCs w:val="20"/>
-      </w:rPr>
-      <w:t>Lâm</w:t>
-    </w:r>
-    <w:proofErr w:type="spellEnd"/>
+      <w:t xml:space="preserve">ärztliche Leitung: {MedicalDirector}</w:t>
+    </w:r>
   </w:p>
   <w:p>
     <w:pPr>
@@ -4917,7 +4892,7 @@
         <w:sz w:val="22"/>
         <w:szCs w:val="22"/>
       </w:rPr>
-      <w:t>Gesamtleitung: PD Dr. rer. nat. Heike Claus</w:t>
+      <w:t xml:space="preserve">Gesamtleitung: {LabDirector}</w:t>
     </w:r>
   </w:p>
   <w:p>
@@ -4932,33 +4907,8 @@
         <w:sz w:val="22"/>
         <w:szCs w:val="22"/>
       </w:rPr>
-      <w:t xml:space="preserve">ärztliche Leitung: PD Dr. med. </w:t>
-    </w:r>
-    <w:proofErr w:type="spellStart"/>
-    <w:r>
-      <w:rPr>
-        <w:sz w:val="22"/>
-        <w:szCs w:val="22"/>
-      </w:rPr>
-      <w:t>Thiên-Trí</w:t>
-    </w:r>
-    <w:proofErr w:type="spellEnd"/>
-    <w:r>
-      <w:rPr>
-        <w:sz w:val="22"/>
-        <w:szCs w:val="22"/>
-      </w:rPr>
-      <w:t xml:space="preserve"> </w:t>
-    </w:r>
-    <w:proofErr w:type="spellStart"/>
-    <w:r>
-      <w:rPr>
-        <w:sz w:val="22"/>
-        <w:szCs w:val="22"/>
-      </w:rPr>
-      <w:t>Lâm</w:t>
-    </w:r>
-    <w:proofErr w:type="spellEnd"/>
+      <w:t xml:space="preserve">ärztliche Leitung: {MedicalDirector}</w:t>
+    </w:r>
   </w:p>
   <w:p>
     <w:pPr>
@@ -5224,235 +5174,8 @@
                     <w:sz w:val="17"/>
                     <w:szCs w:val="17"/>
                   </w:rPr>
-                  <w:t>PD Dr. rer. nat. Heike Claus</w:t>
+                  <w:t xml:space="preserve">{Contacts}</w:t>
                 </w:r>
-              </w:p>
-              <w:p>
-                <w:pPr>
-                  <w:tabs>
-                    <w:tab w:val="left" w:pos="7560"/>
-                  </w:tabs>
-                  <w:ind w:right="-1368"/>
-                  <w:rPr>
-                    <w:sz w:val="17"/>
-                    <w:szCs w:val="17"/>
-                    <w:lang w:val="pl-PL"/>
-                  </w:rPr>
-                </w:pPr>
-                <w:r>
-                  <w:rPr>
-                    <w:sz w:val="17"/>
-                    <w:szCs w:val="17"/>
-                    <w:lang w:val="pl-PL"/>
-                  </w:rPr>
-                  <w:t>Telefon: 0931/31-46936</w:t>
-                </w:r>
-              </w:p>
-              <w:p>
-                <w:pPr>
-                  <w:tabs>
-                    <w:tab w:val="left" w:pos="7560"/>
-                  </w:tabs>
-                  <w:ind w:right="-1368"/>
-                  <w:rPr>
-                    <w:sz w:val="17"/>
-                    <w:szCs w:val="17"/>
-                    <w:lang w:val="pl-PL"/>
-                  </w:rPr>
-                </w:pPr>
-                <w:r>
-                  <w:rPr>
-                    <w:sz w:val="17"/>
-                    <w:szCs w:val="17"/>
-                    <w:lang w:val="pl-PL"/>
-                  </w:rPr>
-                  <w:t>heike.claus@uni-wuerzburg.de</w:t>
-                </w:r>
-              </w:p>
-              <w:p>
-                <w:pPr>
-                  <w:ind w:right="-1368"/>
-                  <w:rPr>
-                    <w:sz w:val="17"/>
-                    <w:szCs w:val="17"/>
-                    <w:lang w:val="pl-PL"/>
-                  </w:rPr>
-                </w:pPr>
-              </w:p>
-              <w:p>
-                <w:pPr>
-                  <w:ind w:right="-1368"/>
-                  <w:rPr>
-                    <w:sz w:val="17"/>
-                    <w:szCs w:val="17"/>
-                    <w:lang w:val="pl-PL"/>
-                  </w:rPr>
-                </w:pPr>
-                <w:r>
-                  <w:rPr>
-                    <w:sz w:val="17"/>
-                    <w:szCs w:val="17"/>
-                    <w:lang w:val="pl-PL"/>
-                  </w:rPr>
-                  <w:t>PD Dr. med. Thiên-Trí Lâm</w:t>
-                </w:r>
-              </w:p>
-              <w:p>
-                <w:pPr>
-                  <w:ind w:right="-1368"/>
-                  <w:rPr>
-                    <w:sz w:val="17"/>
-                    <w:szCs w:val="17"/>
-                    <w:lang w:val="pl-PL"/>
-                  </w:rPr>
-                </w:pPr>
-                <w:r>
-                  <w:rPr>
-                    <w:sz w:val="17"/>
-                    <w:szCs w:val="17"/>
-                    <w:lang w:val="pl-PL"/>
-                  </w:rPr>
-                  <w:t>Telefon: 0931/31-46737</w:t>
-                </w:r>
-              </w:p>
-              <w:p>
-                <w:pPr>
-                  <w:ind w:right="-1368"/>
-                  <w:rPr>
-                    <w:sz w:val="17"/>
-                    <w:szCs w:val="17"/>
-                    <w:lang w:val="pl-PL"/>
-                  </w:rPr>
-                </w:pPr>
-                <w:r>
-                  <w:rPr>
-                    <w:sz w:val="17"/>
-                    <w:szCs w:val="17"/>
-                    <w:lang w:val="pl-PL"/>
-                  </w:rPr>
-                  <w:t>thien-tri.lam@uni-wuerzburg.de</w:t>
-                </w:r>
-              </w:p>
-              <w:p>
-                <w:pPr>
-                  <w:tabs>
-                    <w:tab w:val="left" w:pos="7560"/>
-                  </w:tabs>
-                  <w:ind w:right="-1368"/>
-                  <w:rPr>
-                    <w:sz w:val="17"/>
-                    <w:szCs w:val="17"/>
-                    <w:lang w:val="pl-PL"/>
-                  </w:rPr>
-                </w:pPr>
-              </w:p>
-              <w:p>
-                <w:pPr>
-                  <w:tabs>
-                    <w:tab w:val="left" w:pos="7560"/>
-                  </w:tabs>
-                  <w:ind w:right="-1368"/>
-                  <w:rPr>
-                    <w:sz w:val="17"/>
-                    <w:szCs w:val="17"/>
-                    <w:lang w:val="en-GB"/>
-                  </w:rPr>
-                </w:pPr>
-                <w:r>
-                  <w:rPr>
-                    <w:sz w:val="17"/>
-                    <w:szCs w:val="17"/>
-                    <w:lang w:val="en-GB"/>
-                  </w:rPr>
-                  <w:t>Dr.</w:t>
-                </w:r>
-                <w:r>
-                  <w:rPr>
-                    <w:sz w:val="17"/>
-                    <w:szCs w:val="17"/>
-                    <w:lang w:val="en-GB"/>
-                  </w:rPr>
-                  <w:t xml:space="preserve"> </w:t>
-                </w:r>
-                <w:r>
-                  <w:rPr>
-                    <w:sz w:val="17"/>
-                    <w:szCs w:val="17"/>
-                    <w:lang w:val="en-GB"/>
-                  </w:rPr>
-                  <w:t>med. Katherina Heroth</w:t>
-                </w:r>
-              </w:p>
-              <w:p>
-                <w:pPr>
-                  <w:tabs>
-                    <w:tab w:val="left" w:pos="7560"/>
-                  </w:tabs>
-                  <w:ind w:right="-1368"/>
-                  <w:rPr>
-                    <w:sz w:val="17"/>
-                    <w:szCs w:val="17"/>
-                    <w:lang w:val="pl-PL"/>
-                  </w:rPr>
-                </w:pPr>
-                <w:r>
-                  <w:rPr>
-                    <w:sz w:val="17"/>
-                    <w:szCs w:val="17"/>
-                    <w:lang w:val="pl-PL"/>
-                  </w:rPr>
-                  <w:t>Telefon: 0931/31-81128</w:t>
-                </w:r>
-              </w:p>
-              <w:p>
-                <w:pPr>
-                  <w:tabs>
-                    <w:tab w:val="left" w:pos="7560"/>
-                  </w:tabs>
-                  <w:ind w:right="-1368"/>
-                  <w:rPr>
-                    <w:sz w:val="17"/>
-                    <w:szCs w:val="17"/>
-                    <w:lang w:val="pl-PL"/>
-                  </w:rPr>
-                </w:pPr>
-                <w:r>
-                  <w:rPr>
-                    <w:sz w:val="17"/>
-                    <w:szCs w:val="17"/>
-                    <w:lang w:val="pl-PL"/>
-                  </w:rPr>
-                  <w:t>katherina.heroth</w:t>
-                </w:r>
-                <w:r>
-                  <w:rPr>
-                    <w:sz w:val="17"/>
-                    <w:szCs w:val="17"/>
-                    <w:lang w:val="pl-PL"/>
-                  </w:rPr>
-                  <w:t>@</w:t>
-                </w:r>
-                <w:r>
-                  <w:rPr>
-                    <w:sz w:val="17"/>
-                    <w:szCs w:val="17"/>
-                    <w:lang w:val="pl-PL"/>
-                  </w:rPr>
-                  <w:t>uni-wuerzburg.de</w:t>
-                </w:r>
-              </w:p>
-              <w:p>
-                <w:pPr>
-                  <w:tabs>
-                    <w:tab w:val="left" w:pos="7560"/>
-                  </w:tabs>
-                  <w:ind w:right="-1368"/>
-                  <w:rPr>
-                    <w:sz w:val="17"/>
-                    <w:szCs w:val="17"/>
-                    <w:lang w:val="pl-PL"/>
-                  </w:rPr>
-                </w:pPr>
               </w:p>
             </w:txbxContent>
           </v:textbox>

</xml_diff>